<commit_message>
Guía 1: conexión USB/Bluetooth detallada y configuración de Bluetooth en MakeCode
Amplía el manual con lo que faltaba de conexión y MakeCode:
- Sección 3 rehecha: crear proyecto y grabar el .hex (WebUSB / unidad
  MICROBIT), configuración de Bluetooth paso a paso (extensión bluetooth,
  'No Pairing Required', pxt.json con pairing_mode: 0, regrabar), y
  consejos de MakeCode (everyInterval vs forever, tabla de frecuencias
  recomendadas, feedback visual, uso a batería).
- Sección 5 separada en conexión por USB (serial) y por Bluetooth, cada
  una con sus pasos y consejos (cable de datos, selector del navegador,
  reconexión automática).
- Problemas frecuentes reorganizados por tipo de conexión (USB /
  Bluetooth / datos), incluyendo chrome://bluetooth-internals.

Co-Authored-By: Claude Fable 5 <noreply@anthropic.com>
Claude-Session: https://claude.ai/code/session_01QWAyZdE9BkJvizLVTZzmVb
</commit_message>
<xml_diff>
--- a/manuales/Manual-1-Captura-1-variable-timestamp.docx
+++ b/manuales/Manual-1-Captura-1-variable-timestamp.docx
@@ -604,7 +604,7 @@
           <w:sz w:val="26"/>
           <w:szCs w:val="26"/>
         </w:rPr>
-        <w:t xml:space="preserve">3 · PROGRAMAR LA MICRO:BIT</w:t>
+        <w:t xml:space="preserve">3 · PROGRAMAR LA MICRO:BIT EN MAKECODE</w:t>
       </w:r>
     </w:p>
     <w:p>
@@ -617,7 +617,7 @@
           <w:sz w:val="20"/>
           <w:szCs w:val="20"/>
         </w:rPr>
-        <w:t xml:space="preserve">En </w:t>
+        <w:t xml:space="preserve">Toda la programación se hace en </w:t>
       </w:r>
       <w:r>
         <w:rPr>
@@ -635,7 +635,7 @@
           <w:sz w:val="20"/>
           <w:szCs w:val="20"/>
         </w:rPr>
-        <w:t xml:space="preserve"> creá un proyecto nuevo. El programa debe enviar cada lectura como una línea de texto con el formato </w:t>
+        <w:t xml:space="preserve">, desde el navegador y sin instalar nada. El programa debe enviar cada lectura como una línea de texto con el formato </w:t>
       </w:r>
       <w:r>
         <w:rPr>
@@ -684,7 +684,273 @@
           <w:sz w:val="22"/>
           <w:szCs w:val="22"/>
         </w:rPr>
-        <w:t xml:space="preserve">3.1 · Conexión por USB (serial)</w:t>
+        <w:t xml:space="preserve">3.1 · Crear el proyecto y grabar el programa</w:t>
+      </w:r>
+    </w:p>
+    <w:p>
+      <w:pPr>
+        <w:spacing w:after="100" w:before="120" w:line="300"/>
+        <w:ind w:left="360" w:hanging="360"/>
+      </w:pPr>
+      <w:r>
+        <w:rPr>
+          <w:rFonts w:ascii="Montserrat" w:cs="Montserrat" w:eastAsia="Montserrat" w:hAnsi="Montserrat"/>
+          <w:b/>
+          <w:bCs/>
+          <w:sz w:val="20"/>
+          <w:szCs w:val="20"/>
+        </w:rPr>
+        <w:t xml:space="preserve">1.  </w:t>
+      </w:r>
+      <w:r>
+        <w:rPr>
+          <w:rFonts w:ascii="Montserrat" w:cs="Montserrat" w:eastAsia="Montserrat" w:hAnsi="Montserrat"/>
+          <w:sz w:val="20"/>
+          <w:szCs w:val="20"/>
+        </w:rPr>
+        <w:t xml:space="preserve">Entrá a </w:t>
+      </w:r>
+      <w:r>
+        <w:rPr>
+          <w:rFonts w:ascii="Montserrat" w:cs="Montserrat" w:eastAsia="Montserrat" w:hAnsi="Montserrat"/>
+          <w:b/>
+          <w:bCs/>
+          <w:sz w:val="20"/>
+          <w:szCs w:val="20"/>
+        </w:rPr>
+        <w:t xml:space="preserve">makecode.microbit.org</w:t>
+      </w:r>
+      <w:r>
+        <w:rPr>
+          <w:rFonts w:ascii="Montserrat" w:cs="Montserrat" w:eastAsia="Montserrat" w:hAnsi="Montserrat"/>
+          <w:sz w:val="20"/>
+          <w:szCs w:val="20"/>
+        </w:rPr>
+        <w:t xml:space="preserve"> y presioná </w:t>
+      </w:r>
+      <w:r>
+        <w:rPr>
+          <w:rFonts w:ascii="Montserrat" w:cs="Montserrat" w:eastAsia="Montserrat" w:hAnsi="Montserrat"/>
+          <w:b/>
+          <w:bCs/>
+          <w:sz w:val="20"/>
+          <w:szCs w:val="20"/>
+        </w:rPr>
+        <w:t xml:space="preserve">Nuevo proyecto</w:t>
+      </w:r>
+      <w:r>
+        <w:rPr>
+          <w:rFonts w:ascii="Montserrat" w:cs="Montserrat" w:eastAsia="Montserrat" w:hAnsi="Montserrat"/>
+          <w:sz w:val="20"/>
+          <w:szCs w:val="20"/>
+        </w:rPr>
+        <w:t xml:space="preserve">. Podés trabajar en Bloques o en JavaScript (los códigos de esta guía están en JavaScript; MakeCode los convierte a bloques automáticamente al pegarlos).</w:t>
+      </w:r>
+    </w:p>
+    <w:p>
+      <w:pPr>
+        <w:spacing w:after="100" w:before="120" w:line="300"/>
+        <w:ind w:left="360" w:hanging="360"/>
+      </w:pPr>
+      <w:r>
+        <w:rPr>
+          <w:rFonts w:ascii="Montserrat" w:cs="Montserrat" w:eastAsia="Montserrat" w:hAnsi="Montserrat"/>
+          <w:b/>
+          <w:bCs/>
+          <w:sz w:val="20"/>
+          <w:szCs w:val="20"/>
+        </w:rPr>
+        <w:t xml:space="preserve">2.  </w:t>
+      </w:r>
+      <w:r>
+        <w:rPr>
+          <w:rFonts w:ascii="Montserrat" w:cs="Montserrat" w:eastAsia="Montserrat" w:hAnsi="Montserrat"/>
+          <w:sz w:val="20"/>
+          <w:szCs w:val="20"/>
+        </w:rPr>
+        <w:t xml:space="preserve">Escribí o pegá el código (secciones 3.2 o 3.4 según la conexión que uses).</w:t>
+      </w:r>
+    </w:p>
+    <w:p>
+      <w:pPr>
+        <w:spacing w:after="100" w:before="120" w:line="300"/>
+        <w:ind w:left="360" w:hanging="360"/>
+      </w:pPr>
+      <w:r>
+        <w:rPr>
+          <w:rFonts w:ascii="Montserrat" w:cs="Montserrat" w:eastAsia="Montserrat" w:hAnsi="Montserrat"/>
+          <w:b/>
+          <w:bCs/>
+          <w:sz w:val="20"/>
+          <w:szCs w:val="20"/>
+        </w:rPr>
+        <w:t xml:space="preserve">3.  </w:t>
+      </w:r>
+      <w:r>
+        <w:rPr>
+          <w:rFonts w:ascii="Montserrat" w:cs="Montserrat" w:eastAsia="Montserrat" w:hAnsi="Montserrat"/>
+          <w:sz w:val="20"/>
+          <w:szCs w:val="20"/>
+        </w:rPr>
+        <w:t xml:space="preserve">Conectá la micro:bit por USB y presioná </w:t>
+      </w:r>
+      <w:r>
+        <w:rPr>
+          <w:rFonts w:ascii="Montserrat" w:cs="Montserrat" w:eastAsia="Montserrat" w:hAnsi="Montserrat"/>
+          <w:b/>
+          <w:bCs/>
+          <w:sz w:val="20"/>
+          <w:szCs w:val="20"/>
+        </w:rPr>
+        <w:t xml:space="preserve">Descargar</w:t>
+      </w:r>
+      <w:r>
+        <w:rPr>
+          <w:rFonts w:ascii="Montserrat" w:cs="Montserrat" w:eastAsia="Montserrat" w:hAnsi="Montserrat"/>
+          <w:sz w:val="20"/>
+          <w:szCs w:val="20"/>
+        </w:rPr>
+        <w:t xml:space="preserve">. Si el navegador ofrece </w:t>
+      </w:r>
+      <w:r>
+        <w:rPr>
+          <w:rFonts w:ascii="Montserrat" w:cs="Montserrat" w:eastAsia="Montserrat" w:hAnsi="Montserrat"/>
+          <w:b/>
+          <w:bCs/>
+          <w:sz w:val="20"/>
+          <w:szCs w:val="20"/>
+        </w:rPr>
+        <w:t xml:space="preserve">emparejar el dispositivo (WebUSB)</w:t>
+      </w:r>
+      <w:r>
+        <w:rPr>
+          <w:rFonts w:ascii="Montserrat" w:cs="Montserrat" w:eastAsia="Montserrat" w:hAnsi="Montserrat"/>
+          <w:sz w:val="20"/>
+          <w:szCs w:val="20"/>
+        </w:rPr>
+        <w:t xml:space="preserve">, aceptá: el programa se graba solo. Si no, copiá el archivo </w:t>
+      </w:r>
+      <w:r>
+        <w:rPr>
+          <w:rFonts w:ascii="Courier New" w:cs="Courier New" w:eastAsia="Courier New" w:hAnsi="Courier New"/>
+          <w:sz w:val="18"/>
+          <w:szCs w:val="18"/>
+        </w:rPr>
+        <w:t xml:space="preserve">.hex</w:t>
+      </w:r>
+      <w:r>
+        <w:rPr>
+          <w:rFonts w:ascii="Montserrat" w:cs="Montserrat" w:eastAsia="Montserrat" w:hAnsi="Montserrat"/>
+          <w:sz w:val="20"/>
+          <w:szCs w:val="20"/>
+        </w:rPr>
+        <w:t xml:space="preserve"> descargado a la unidad </w:t>
+      </w:r>
+      <w:r>
+        <w:rPr>
+          <w:rFonts w:ascii="Montserrat" w:cs="Montserrat" w:eastAsia="Montserrat" w:hAnsi="Montserrat"/>
+          <w:b/>
+          <w:bCs/>
+          <w:sz w:val="20"/>
+          <w:szCs w:val="20"/>
+        </w:rPr>
+        <w:t xml:space="preserve">MICROBIT</w:t>
+      </w:r>
+      <w:r>
+        <w:rPr>
+          <w:rFonts w:ascii="Montserrat" w:cs="Montserrat" w:eastAsia="Montserrat" w:hAnsi="Montserrat"/>
+          <w:sz w:val="20"/>
+          <w:szCs w:val="20"/>
+        </w:rPr>
+        <w:t xml:space="preserve"> que aparece como un pendrive.</w:t>
+      </w:r>
+    </w:p>
+    <w:p>
+      <w:pPr>
+        <w:spacing w:after="100" w:before="120" w:line="300"/>
+        <w:ind w:left="360" w:hanging="360"/>
+      </w:pPr>
+      <w:r>
+        <w:rPr>
+          <w:rFonts w:ascii="Montserrat" w:cs="Montserrat" w:eastAsia="Montserrat" w:hAnsi="Montserrat"/>
+          <w:b/>
+          <w:bCs/>
+          <w:sz w:val="20"/>
+          <w:szCs w:val="20"/>
+        </w:rPr>
+        <w:t xml:space="preserve">4.  </w:t>
+      </w:r>
+      <w:r>
+        <w:rPr>
+          <w:rFonts w:ascii="Montserrat" w:cs="Montserrat" w:eastAsia="Montserrat" w:hAnsi="Montserrat"/>
+          <w:sz w:val="20"/>
+          <w:szCs w:val="20"/>
+        </w:rPr>
+        <w:t xml:space="preserve">Esperá a que la luz naranja del reverso deje de parpadear: el programa ya está grabado y corriendo.</w:t>
+      </w:r>
+    </w:p>
+    <w:p>
+      <w:pPr>
+        <w:pStyle w:val="Heading2"/>
+        <w:spacing w:after="140" w:before="300"/>
+      </w:pPr>
+      <w:r>
+        <w:rPr>
+          <w:rFonts w:ascii="Montserrat" w:cs="Montserrat" w:eastAsia="Montserrat" w:hAnsi="Montserrat"/>
+          <w:b/>
+          <w:bCs/>
+          <w:color w:val="000000"/>
+          <w:sz w:val="22"/>
+          <w:szCs w:val="22"/>
+        </w:rPr>
+        <w:t xml:space="preserve">3.2 · Código para conexión USB (serial)</w:t>
+      </w:r>
+    </w:p>
+    <w:p>
+      <w:pPr>
+        <w:spacing w:after="140" w:line="300"/>
+      </w:pPr>
+      <w:r>
+        <w:rPr>
+          <w:rFonts w:ascii="Montserrat" w:cs="Montserrat" w:eastAsia="Montserrat" w:hAnsi="Montserrat"/>
+          <w:sz w:val="20"/>
+          <w:szCs w:val="20"/>
+        </w:rPr>
+        <w:t xml:space="preserve">Para conectar por cable no hace falta configurar nada especial: alcanza con usar los bloques de </w:t>
+      </w:r>
+      <w:r>
+        <w:rPr>
+          <w:rFonts w:ascii="Montserrat" w:cs="Montserrat" w:eastAsia="Montserrat" w:hAnsi="Montserrat"/>
+          <w:b/>
+          <w:bCs/>
+          <w:sz w:val="20"/>
+          <w:szCs w:val="20"/>
+        </w:rPr>
+        <w:t xml:space="preserve">Serial</w:t>
+      </w:r>
+      <w:r>
+        <w:rPr>
+          <w:rFonts w:ascii="Montserrat" w:cs="Montserrat" w:eastAsia="Montserrat" w:hAnsi="Montserrat"/>
+          <w:sz w:val="20"/>
+          <w:szCs w:val="20"/>
+        </w:rPr>
+        <w:t xml:space="preserve"> (</w:t>
+      </w:r>
+      <w:r>
+        <w:rPr>
+          <w:rFonts w:ascii="Courier New" w:cs="Courier New" w:eastAsia="Courier New" w:hAnsi="Courier New"/>
+          <w:sz w:val="18"/>
+          <w:szCs w:val="18"/>
+        </w:rPr>
+        <w:t xml:space="preserve">serial.writeLine</w:t>
+      </w:r>
+      <w:r>
+        <w:rPr>
+          <w:rFonts w:ascii="Montserrat" w:cs="Montserrat" w:eastAsia="Montserrat" w:hAnsi="Montserrat"/>
+          <w:sz w:val="20"/>
+          <w:szCs w:val="20"/>
+        </w:rPr>
+        <w:t xml:space="preserve">):</w:t>
       </w:r>
     </w:p>
     <w:p>
@@ -837,6 +1103,22 @@
           <w:sz w:val="20"/>
           <w:szCs w:val="20"/>
         </w:rPr>
+        <w:t xml:space="preserve">, </w:t>
+      </w:r>
+      <w:r>
+        <w:rPr>
+          <w:rFonts w:ascii="Courier New" w:cs="Courier New" w:eastAsia="Courier New" w:hAnsi="Courier New"/>
+          <w:sz w:val="18"/>
+          <w:szCs w:val="18"/>
+        </w:rPr>
+        <w:t xml:space="preserve">input.lightLevel()</w:t>
+      </w:r>
+      <w:r>
+        <w:rPr>
+          <w:rFonts w:ascii="Montserrat" w:cs="Montserrat" w:eastAsia="Montserrat" w:hAnsi="Montserrat"/>
+          <w:sz w:val="20"/>
+          <w:szCs w:val="20"/>
+        </w:rPr>
         <w:t xml:space="preserve"> o </w:t>
       </w:r>
       <w:r>
@@ -870,7 +1152,7 @@
           <w:sz w:val="22"/>
           <w:szCs w:val="22"/>
         </w:rPr>
-        <w:t xml:space="preserve">3.2 · Conexión por Bluetooth</w:t>
+        <w:t xml:space="preserve">3.3 · Configurar Bluetooth en MakeCode (paso a paso)</w:t>
       </w:r>
     </w:p>
     <w:p>
@@ -883,15 +1165,83 @@
           <w:sz w:val="20"/>
           <w:szCs w:val="20"/>
         </w:rPr>
-        <w:t xml:space="preserve">Agregá la extensión </w:t>
-      </w:r>
-      <w:r>
-        <w:rPr>
-          <w:rFonts w:ascii="Montserrat" w:cs="Montserrat" w:eastAsia="Montserrat" w:hAnsi="Montserrat"/>
-          <w:b/>
-          <w:bCs/>
-          <w:sz w:val="20"/>
-          <w:szCs w:val="20"/>
+        <w:t xml:space="preserve">La conexión inalámbrica usa el servicio UART de Bluetooth Low Energy. Requiere </w:t>
+      </w:r>
+      <w:r>
+        <w:rPr>
+          <w:rFonts w:ascii="Montserrat" w:cs="Montserrat" w:eastAsia="Montserrat" w:hAnsi="Montserrat"/>
+          <w:b/>
+          <w:bCs/>
+          <w:sz w:val="20"/>
+          <w:szCs w:val="20"/>
+        </w:rPr>
+        <w:t xml:space="preserve">dos configuraciones en MakeCode</w:t>
+      </w:r>
+      <w:r>
+        <w:rPr>
+          <w:rFonts w:ascii="Montserrat" w:cs="Montserrat" w:eastAsia="Montserrat" w:hAnsi="Montserrat"/>
+          <w:sz w:val="20"/>
+          <w:szCs w:val="20"/>
+        </w:rPr>
+        <w:t xml:space="preserve"> que suelen ser la causa de que “no conecte” cuando faltan:</w:t>
+      </w:r>
+    </w:p>
+    <w:p>
+      <w:pPr>
+        <w:spacing w:after="100" w:before="120" w:line="300"/>
+        <w:ind w:left="360" w:hanging="360"/>
+      </w:pPr>
+      <w:r>
+        <w:rPr>
+          <w:rFonts w:ascii="Montserrat" w:cs="Montserrat" w:eastAsia="Montserrat" w:hAnsi="Montserrat"/>
+          <w:b/>
+          <w:bCs/>
+          <w:sz w:val="20"/>
+          <w:szCs w:val="20"/>
+        </w:rPr>
+        <w:t xml:space="preserve">1.  </w:t>
+      </w:r>
+      <w:r>
+        <w:rPr>
+          <w:rFonts w:ascii="Montserrat" w:cs="Montserrat" w:eastAsia="Montserrat" w:hAnsi="Montserrat"/>
+          <w:b/>
+          <w:bCs/>
+          <w:sz w:val="20"/>
+          <w:szCs w:val="20"/>
+        </w:rPr>
+        <w:t xml:space="preserve">Agregar la extensión Bluetooth: </w:t>
+      </w:r>
+      <w:r>
+        <w:rPr>
+          <w:rFonts w:ascii="Montserrat" w:cs="Montserrat" w:eastAsia="Montserrat" w:hAnsi="Montserrat"/>
+          <w:sz w:val="20"/>
+          <w:szCs w:val="20"/>
+        </w:rPr>
+        <w:t xml:space="preserve">en el editor, abrí el menú de bloques y elegí </w:t>
+      </w:r>
+      <w:r>
+        <w:rPr>
+          <w:rFonts w:ascii="Montserrat" w:cs="Montserrat" w:eastAsia="Montserrat" w:hAnsi="Montserrat"/>
+          <w:b/>
+          <w:bCs/>
+          <w:sz w:val="20"/>
+          <w:szCs w:val="20"/>
+        </w:rPr>
+        <w:t xml:space="preserve">Extensiones</w:t>
+      </w:r>
+      <w:r>
+        <w:rPr>
+          <w:rFonts w:ascii="Montserrat" w:cs="Montserrat" w:eastAsia="Montserrat" w:hAnsi="Montserrat"/>
+          <w:sz w:val="20"/>
+          <w:szCs w:val="20"/>
+        </w:rPr>
+        <w:t xml:space="preserve"> (también está en ⚙ → Extensiones). Buscá </w:t>
+      </w:r>
+      <w:r>
+        <w:rPr>
+          <w:rFonts w:ascii="Courier New" w:cs="Courier New" w:eastAsia="Courier New" w:hAnsi="Courier New"/>
+          <w:sz w:val="18"/>
+          <w:szCs w:val="18"/>
         </w:rPr>
         <w:t xml:space="preserve">bluetooth</w:t>
       </w:r>
@@ -901,25 +1251,151 @@
           <w:sz w:val="20"/>
           <w:szCs w:val="20"/>
         </w:rPr>
-        <w:t xml:space="preserve"> (menú Extensiones) y verificá que en la configuración del proyecto esté habilitado </w:t>
-      </w:r>
-      <w:r>
-        <w:rPr>
-          <w:rFonts w:ascii="Montserrat" w:cs="Montserrat" w:eastAsia="Montserrat" w:hAnsi="Montserrat"/>
-          <w:b/>
-          <w:bCs/>
-          <w:sz w:val="20"/>
-          <w:szCs w:val="20"/>
-        </w:rPr>
-        <w:t xml:space="preserve">“No Pairing Required”</w:t>
-      </w:r>
-      <w:r>
-        <w:rPr>
-          <w:rFonts w:ascii="Montserrat" w:cs="Montserrat" w:eastAsia="Montserrat" w:hAnsi="Montserrat"/>
-          <w:sz w:val="20"/>
-          <w:szCs w:val="20"/>
-        </w:rPr>
-        <w:t xml:space="preserve">. El código es el mismo, pero usando el servicio UART:</w:t>
+        <w:t xml:space="preserve"> y hacé clic en la tarjeta para agregarla. MakeCode avisa que quitará la extensión </w:t>
+      </w:r>
+      <w:r>
+        <w:rPr>
+          <w:rFonts w:ascii="Montserrat" w:cs="Montserrat" w:eastAsia="Montserrat" w:hAnsi="Montserrat"/>
+          <w:b/>
+          <w:bCs/>
+          <w:sz w:val="20"/>
+          <w:szCs w:val="20"/>
+        </w:rPr>
+        <w:t xml:space="preserve">radio</w:t>
+      </w:r>
+      <w:r>
+        <w:rPr>
+          <w:rFonts w:ascii="Montserrat" w:cs="Montserrat" w:eastAsia="Montserrat" w:hAnsi="Montserrat"/>
+          <w:sz w:val="20"/>
+          <w:szCs w:val="20"/>
+        </w:rPr>
+        <w:t xml:space="preserve">: aceptá (radio y Bluetooth no pueden convivir).</w:t>
+      </w:r>
+    </w:p>
+    <w:p>
+      <w:pPr>
+        <w:spacing w:after="100" w:before="120" w:line="300"/>
+        <w:ind w:left="360" w:hanging="360"/>
+      </w:pPr>
+      <w:r>
+        <w:rPr>
+          <w:rFonts w:ascii="Montserrat" w:cs="Montserrat" w:eastAsia="Montserrat" w:hAnsi="Montserrat"/>
+          <w:b/>
+          <w:bCs/>
+          <w:sz w:val="20"/>
+          <w:szCs w:val="20"/>
+        </w:rPr>
+        <w:t xml:space="preserve">2.  </w:t>
+      </w:r>
+      <w:r>
+        <w:rPr>
+          <w:rFonts w:ascii="Montserrat" w:cs="Montserrat" w:eastAsia="Montserrat" w:hAnsi="Montserrat"/>
+          <w:b/>
+          <w:bCs/>
+          <w:sz w:val="20"/>
+          <w:szCs w:val="20"/>
+        </w:rPr>
+        <w:t xml:space="preserve">Activar “No Pairing Required”: </w:t>
+      </w:r>
+      <w:r>
+        <w:rPr>
+          <w:rFonts w:ascii="Montserrat" w:cs="Montserrat" w:eastAsia="Montserrat" w:hAnsi="Montserrat"/>
+          <w:sz w:val="20"/>
+          <w:szCs w:val="20"/>
+        </w:rPr>
+        <w:t xml:space="preserve">abrí </w:t>
+      </w:r>
+      <w:r>
+        <w:rPr>
+          <w:rFonts w:ascii="Montserrat" w:cs="Montserrat" w:eastAsia="Montserrat" w:hAnsi="Montserrat"/>
+          <w:b/>
+          <w:bCs/>
+          <w:sz w:val="20"/>
+          <w:szCs w:val="20"/>
+        </w:rPr>
+        <w:t xml:space="preserve">⚙ → Configuración del proyecto</w:t>
+      </w:r>
+      <w:r>
+        <w:rPr>
+          <w:rFonts w:ascii="Montserrat" w:cs="Montserrat" w:eastAsia="Montserrat" w:hAnsi="Montserrat"/>
+          <w:sz w:val="20"/>
+          <w:szCs w:val="20"/>
+        </w:rPr>
+        <w:t xml:space="preserve"> (Project Settings) y seleccioná </w:t>
+      </w:r>
+      <w:r>
+        <w:rPr>
+          <w:rFonts w:ascii="Montserrat" w:cs="Montserrat" w:eastAsia="Montserrat" w:hAnsi="Montserrat"/>
+          <w:b/>
+          <w:bCs/>
+          <w:sz w:val="20"/>
+          <w:szCs w:val="20"/>
+        </w:rPr>
+        <w:t xml:space="preserve">“No Pairing Required: Anyone can connect via Bluetooth (JustWorks)”</w:t>
+      </w:r>
+      <w:r>
+        <w:rPr>
+          <w:rFonts w:ascii="Montserrat" w:cs="Montserrat" w:eastAsia="Montserrat" w:hAnsi="Montserrat"/>
+          <w:sz w:val="20"/>
+          <w:szCs w:val="20"/>
+        </w:rPr>
+        <w:t xml:space="preserve">. Guardá. Sin esto, Chrome/Edge muchas veces se quedan en “Conectando…” porque la micro:bit pide un emparejamiento que el navegador no completa.</w:t>
+      </w:r>
+    </w:p>
+    <w:p>
+      <w:pPr>
+        <w:spacing w:after="100" w:before="120" w:line="300"/>
+        <w:ind w:left="360" w:hanging="360"/>
+      </w:pPr>
+      <w:r>
+        <w:rPr>
+          <w:rFonts w:ascii="Montserrat" w:cs="Montserrat" w:eastAsia="Montserrat" w:hAnsi="Montserrat"/>
+          <w:b/>
+          <w:bCs/>
+          <w:sz w:val="20"/>
+          <w:szCs w:val="20"/>
+        </w:rPr>
+        <w:t xml:space="preserve">3.  </w:t>
+      </w:r>
+      <w:r>
+        <w:rPr>
+          <w:rFonts w:ascii="Montserrat" w:cs="Montserrat" w:eastAsia="Montserrat" w:hAnsi="Montserrat"/>
+          <w:sz w:val="20"/>
+          <w:szCs w:val="20"/>
+        </w:rPr>
+        <w:t xml:space="preserve">Si preferís editar la configuración a mano (</w:t>
+      </w:r>
+      <w:r>
+        <w:rPr>
+          <w:rFonts w:ascii="Courier New" w:cs="Courier New" w:eastAsia="Courier New" w:hAnsi="Courier New"/>
+          <w:sz w:val="18"/>
+          <w:szCs w:val="18"/>
+        </w:rPr>
+        <w:t xml:space="preserve">pxt.json</w:t>
+      </w:r>
+      <w:r>
+        <w:rPr>
+          <w:rFonts w:ascii="Montserrat" w:cs="Montserrat" w:eastAsia="Montserrat" w:hAnsi="Montserrat"/>
+          <w:sz w:val="20"/>
+          <w:szCs w:val="20"/>
+        </w:rPr>
+        <w:t xml:space="preserve">), la sección bluetooth debe incluir </w:t>
+      </w:r>
+      <w:r>
+        <w:rPr>
+          <w:rFonts w:ascii="Courier New" w:cs="Courier New" w:eastAsia="Courier New" w:hAnsi="Courier New"/>
+          <w:sz w:val="18"/>
+          <w:szCs w:val="18"/>
+        </w:rPr>
+        <w:t xml:space="preserve">"pairing_mode": 0</w:t>
+      </w:r>
+      <w:r>
+        <w:rPr>
+          <w:rFonts w:ascii="Montserrat" w:cs="Montserrat" w:eastAsia="Montserrat" w:hAnsi="Montserrat"/>
+          <w:sz w:val="20"/>
+          <w:szCs w:val="20"/>
+        </w:rPr>
+        <w:t xml:space="preserve">:</w:t>
       </w:r>
     </w:p>
     <w:p>
@@ -937,7 +1413,7 @@
           <w:sz w:val="18"/>
           <w:szCs w:val="18"/>
         </w:rPr>
-        <w:t xml:space="preserve">let t = 0</w:t>
+        <w:t xml:space="preserve">"bluetooth": {</w:t>
       </w:r>
     </w:p>
     <w:p>
@@ -955,7 +1431,7 @@
           <w:sz w:val="18"/>
           <w:szCs w:val="18"/>
         </w:rPr>
-        <w:t xml:space="preserve">let valor = 0</w:t>
+        <w:t xml:space="preserve">    "open": 1,</w:t>
       </w:r>
     </w:p>
     <w:p>
@@ -973,7 +1449,7 @@
           <w:sz w:val="18"/>
           <w:szCs w:val="18"/>
         </w:rPr>
-        <w:t xml:space="preserve">bluetooth.startUartService()</w:t>
+        <w:t xml:space="preserve">    "pairing_mode": 0,</w:t>
       </w:r>
     </w:p>
     <w:p>
@@ -991,7 +1467,7 @@
           <w:sz w:val="18"/>
           <w:szCs w:val="18"/>
         </w:rPr>
-        <w:t xml:space="preserve"> </w:t>
+        <w:t xml:space="preserve">    "whitelist": 0,</w:t>
       </w:r>
     </w:p>
     <w:p>
@@ -1009,7 +1485,149 @@
           <w:sz w:val="18"/>
           <w:szCs w:val="18"/>
         </w:rPr>
-        <w:t xml:space="preserve">basic.forever(function () {</w:t>
+        <w:t xml:space="preserve">    "security_level": null</w:t>
+      </w:r>
+    </w:p>
+    <w:p>
+      <w:pPr>
+        <w:pBdr>
+          <w:left w:val="single" w:color="000000" w:sz="24" w:space="8"/>
+        </w:pBdr>
+        <w:shd w:fill="F5F5F5" w:val="clear"/>
+        <w:spacing w:after="200" w:line="260"/>
+        <w:ind w:left="240"/>
+      </w:pPr>
+      <w:r>
+        <w:rPr>
+          <w:rFonts w:ascii="Courier New" w:cs="Courier New" w:eastAsia="Courier New" w:hAnsi="Courier New"/>
+          <w:sz w:val="18"/>
+          <w:szCs w:val="18"/>
+        </w:rPr>
+        <w:t xml:space="preserve">}</w:t>
+      </w:r>
+    </w:p>
+    <w:p>
+      <w:pPr>
+        <w:spacing w:after="100" w:before="120" w:line="300"/>
+        <w:ind w:left="360" w:hanging="360"/>
+      </w:pPr>
+      <w:r>
+        <w:rPr>
+          <w:rFonts w:ascii="Montserrat" w:cs="Montserrat" w:eastAsia="Montserrat" w:hAnsi="Montserrat"/>
+          <w:b/>
+          <w:bCs/>
+          <w:sz w:val="20"/>
+          <w:szCs w:val="20"/>
+        </w:rPr>
+        <w:t xml:space="preserve">4.  </w:t>
+      </w:r>
+      <w:r>
+        <w:rPr>
+          <w:rFonts w:ascii="Montserrat" w:cs="Montserrat" w:eastAsia="Montserrat" w:hAnsi="Montserrat"/>
+          <w:b/>
+          <w:bCs/>
+          <w:sz w:val="20"/>
+          <w:szCs w:val="20"/>
+        </w:rPr>
+        <w:t xml:space="preserve">Volvé a descargar el programa</w:t>
+      </w:r>
+      <w:r>
+        <w:rPr>
+          <w:rFonts w:ascii="Montserrat" w:cs="Montserrat" w:eastAsia="Montserrat" w:hAnsi="Montserrat"/>
+          <w:sz w:val="20"/>
+          <w:szCs w:val="20"/>
+        </w:rPr>
+        <w:t xml:space="preserve"> a la micro:bit después de cambiar la configuración: los ajustes viven dentro del archivo .hex, no alcanza con cambiar la opción.</w:t>
+      </w:r>
+    </w:p>
+    <w:p>
+      <w:pPr>
+        <w:pBdr>
+          <w:left w:val="single" w:color="000000" w:sz="36" w:space="10"/>
+        </w:pBdr>
+        <w:shd w:fill="F5F5F5" w:val="clear"/>
+        <w:spacing w:after="220" w:before="160" w:line="290"/>
+        <w:ind w:left="120" w:right="120"/>
+      </w:pPr>
+      <w:r>
+        <w:rPr>
+          <w:rFonts w:ascii="Montserrat" w:cs="Montserrat" w:eastAsia="Montserrat" w:hAnsi="Montserrat"/>
+          <w:b/>
+          <w:bCs/>
+          <w:sz w:val="20"/>
+          <w:szCs w:val="20"/>
+        </w:rPr>
+        <w:t xml:space="preserve">Importante: </w:t>
+      </w:r>
+      <w:r>
+        <w:rPr>
+          <w:rFonts w:ascii="Montserrat" w:cs="Montserrat" w:eastAsia="Montserrat" w:hAnsi="Montserrat"/>
+          <w:sz w:val="20"/>
+          <w:szCs w:val="20"/>
+        </w:rPr>
+        <w:t xml:space="preserve">al agregar la extensión Bluetooth se desactiva el envío por serial USB. Un mismo programa no puede usar los dos a la vez: para volver a USB, quitá la extensión Bluetooth (Extensiones → papelera sobre bluetooth) y usá </w:t>
+      </w:r>
+      <w:r>
+        <w:rPr>
+          <w:rFonts w:ascii="Courier New" w:cs="Courier New" w:eastAsia="Courier New" w:hAnsi="Courier New"/>
+          <w:sz w:val="18"/>
+          <w:szCs w:val="18"/>
+        </w:rPr>
+        <w:t xml:space="preserve">serial.writeLine</w:t>
+      </w:r>
+      <w:r>
+        <w:rPr>
+          <w:rFonts w:ascii="Montserrat" w:cs="Montserrat" w:eastAsia="Montserrat" w:hAnsi="Montserrat"/>
+          <w:sz w:val="20"/>
+          <w:szCs w:val="20"/>
+        </w:rPr>
+        <w:t xml:space="preserve">.</w:t>
+      </w:r>
+    </w:p>
+    <w:p>
+      <w:pPr>
+        <w:pStyle w:val="Heading2"/>
+        <w:spacing w:after="140" w:before="300"/>
+      </w:pPr>
+      <w:r>
+        <w:rPr>
+          <w:rFonts w:ascii="Montserrat" w:cs="Montserrat" w:eastAsia="Montserrat" w:hAnsi="Montserrat"/>
+          <w:b/>
+          <w:bCs/>
+          <w:color w:val="000000"/>
+          <w:sz w:val="22"/>
+          <w:szCs w:val="22"/>
+        </w:rPr>
+        <w:t xml:space="preserve">3.4 · Código para conexión Bluetooth</w:t>
+      </w:r>
+    </w:p>
+    <w:p>
+      <w:pPr>
+        <w:spacing w:after="140" w:line="300"/>
+      </w:pPr>
+      <w:r>
+        <w:rPr>
+          <w:rFonts w:ascii="Montserrat" w:cs="Montserrat" w:eastAsia="Montserrat" w:hAnsi="Montserrat"/>
+          <w:sz w:val="20"/>
+          <w:szCs w:val="20"/>
+        </w:rPr>
+        <w:t xml:space="preserve">El código es igual al de USB, pero iniciando el servicio UART y escribiendo con </w:t>
+      </w:r>
+      <w:r>
+        <w:rPr>
+          <w:rFonts w:ascii="Courier New" w:cs="Courier New" w:eastAsia="Courier New" w:hAnsi="Courier New"/>
+          <w:sz w:val="18"/>
+          <w:szCs w:val="18"/>
+        </w:rPr>
+        <w:t xml:space="preserve">bluetooth.uartWriteLine</w:t>
+      </w:r>
+      <w:r>
+        <w:rPr>
+          <w:rFonts w:ascii="Montserrat" w:cs="Montserrat" w:eastAsia="Montserrat" w:hAnsi="Montserrat"/>
+          <w:sz w:val="20"/>
+          <w:szCs w:val="20"/>
+        </w:rPr>
+        <w:t xml:space="preserve">:</w:t>
       </w:r>
     </w:p>
     <w:p>
@@ -1027,7 +1645,7 @@
           <w:sz w:val="18"/>
           <w:szCs w:val="18"/>
         </w:rPr>
-        <w:t xml:space="preserve">    t = input.runningTime()</w:t>
+        <w:t xml:space="preserve">let t = 0</w:t>
       </w:r>
     </w:p>
     <w:p>
@@ -1045,7 +1663,7 @@
           <w:sz w:val="18"/>
           <w:szCs w:val="18"/>
         </w:rPr>
-        <w:t xml:space="preserve">    valor = input.acceleration(Dimension.X)</w:t>
+        <w:t xml:space="preserve">let valor = 0</w:t>
       </w:r>
     </w:p>
     <w:p>
@@ -1063,7 +1681,7 @@
           <w:sz w:val="18"/>
           <w:szCs w:val="18"/>
         </w:rPr>
-        <w:t xml:space="preserve">    bluetooth.uartWriteLine("" + t + "," + valor)</w:t>
+        <w:t xml:space="preserve">bluetooth.startUartService()</w:t>
       </w:r>
     </w:p>
     <w:p>
@@ -1081,6 +1699,96 @@
           <w:sz w:val="18"/>
           <w:szCs w:val="18"/>
         </w:rPr>
+        <w:t xml:space="preserve"> </w:t>
+      </w:r>
+    </w:p>
+    <w:p>
+      <w:pPr>
+        <w:pBdr>
+          <w:left w:val="single" w:color="000000" w:sz="24" w:space="8"/>
+        </w:pBdr>
+        <w:shd w:fill="F5F5F5" w:val="clear"/>
+        <w:spacing w:after="0" w:line="260"/>
+        <w:ind w:left="240"/>
+      </w:pPr>
+      <w:r>
+        <w:rPr>
+          <w:rFonts w:ascii="Courier New" w:cs="Courier New" w:eastAsia="Courier New" w:hAnsi="Courier New"/>
+          <w:sz w:val="18"/>
+          <w:szCs w:val="18"/>
+        </w:rPr>
+        <w:t xml:space="preserve">basic.forever(function () {</w:t>
+      </w:r>
+    </w:p>
+    <w:p>
+      <w:pPr>
+        <w:pBdr>
+          <w:left w:val="single" w:color="000000" w:sz="24" w:space="8"/>
+        </w:pBdr>
+        <w:shd w:fill="F5F5F5" w:val="clear"/>
+        <w:spacing w:after="0" w:line="260"/>
+        <w:ind w:left="240"/>
+      </w:pPr>
+      <w:r>
+        <w:rPr>
+          <w:rFonts w:ascii="Courier New" w:cs="Courier New" w:eastAsia="Courier New" w:hAnsi="Courier New"/>
+          <w:sz w:val="18"/>
+          <w:szCs w:val="18"/>
+        </w:rPr>
+        <w:t xml:space="preserve">    t = input.runningTime()</w:t>
+      </w:r>
+    </w:p>
+    <w:p>
+      <w:pPr>
+        <w:pBdr>
+          <w:left w:val="single" w:color="000000" w:sz="24" w:space="8"/>
+        </w:pBdr>
+        <w:shd w:fill="F5F5F5" w:val="clear"/>
+        <w:spacing w:after="0" w:line="260"/>
+        <w:ind w:left="240"/>
+      </w:pPr>
+      <w:r>
+        <w:rPr>
+          <w:rFonts w:ascii="Courier New" w:cs="Courier New" w:eastAsia="Courier New" w:hAnsi="Courier New"/>
+          <w:sz w:val="18"/>
+          <w:szCs w:val="18"/>
+        </w:rPr>
+        <w:t xml:space="preserve">    valor = input.acceleration(Dimension.X)</w:t>
+      </w:r>
+    </w:p>
+    <w:p>
+      <w:pPr>
+        <w:pBdr>
+          <w:left w:val="single" w:color="000000" w:sz="24" w:space="8"/>
+        </w:pBdr>
+        <w:shd w:fill="F5F5F5" w:val="clear"/>
+        <w:spacing w:after="0" w:line="260"/>
+        <w:ind w:left="240"/>
+      </w:pPr>
+      <w:r>
+        <w:rPr>
+          <w:rFonts w:ascii="Courier New" w:cs="Courier New" w:eastAsia="Courier New" w:hAnsi="Courier New"/>
+          <w:sz w:val="18"/>
+          <w:szCs w:val="18"/>
+        </w:rPr>
+        <w:t xml:space="preserve">    bluetooth.uartWriteLine("" + t + "," + valor)</w:t>
+      </w:r>
+    </w:p>
+    <w:p>
+      <w:pPr>
+        <w:pBdr>
+          <w:left w:val="single" w:color="000000" w:sz="24" w:space="8"/>
+        </w:pBdr>
+        <w:shd w:fill="F5F5F5" w:val="clear"/>
+        <w:spacing w:after="0" w:line="260"/>
+        <w:ind w:left="240"/>
+      </w:pPr>
+      <w:r>
+        <w:rPr>
+          <w:rFonts w:ascii="Courier New" w:cs="Courier New" w:eastAsia="Courier New" w:hAnsi="Courier New"/>
+          <w:sz w:val="18"/>
+          <w:szCs w:val="18"/>
+        </w:rPr>
         <w:t xml:space="preserve">    basic.pause(100)</w:t>
       </w:r>
     </w:p>
@@ -1104,31 +1812,772 @@
     </w:p>
     <w:p>
       <w:pPr>
+        <w:spacing w:after="140" w:line="300"/>
+      </w:pPr>
+      <w:r>
+        <w:rPr>
+          <w:rFonts w:ascii="Montserrat" w:cs="Montserrat" w:eastAsia="Montserrat" w:hAnsi="Montserrat"/>
+          <w:sz w:val="20"/>
+          <w:szCs w:val="20"/>
+        </w:rPr>
+        <w:t xml:space="preserve">Otros sensores, misma estructura: </w:t>
+      </w:r>
+      <w:r>
+        <w:rPr>
+          <w:rFonts w:ascii="Courier New" w:cs="Courier New" w:eastAsia="Courier New" w:hAnsi="Courier New"/>
+          <w:sz w:val="18"/>
+          <w:szCs w:val="18"/>
+        </w:rPr>
+        <w:t xml:space="preserve">input.temperature()</w:t>
+      </w:r>
+      <w:r>
+        <w:rPr>
+          <w:rFonts w:ascii="Montserrat" w:cs="Montserrat" w:eastAsia="Montserrat" w:hAnsi="Montserrat"/>
+          <w:sz w:val="20"/>
+          <w:szCs w:val="20"/>
+        </w:rPr>
+        <w:t xml:space="preserve"> con pausa de 500–1000 ms, </w:t>
+      </w:r>
+      <w:r>
+        <w:rPr>
+          <w:rFonts w:ascii="Courier New" w:cs="Courier New" w:eastAsia="Courier New" w:hAnsi="Courier New"/>
+          <w:sz w:val="18"/>
+          <w:szCs w:val="18"/>
+        </w:rPr>
+        <w:t xml:space="preserve">input.lightLevel()</w:t>
+      </w:r>
+      <w:r>
+        <w:rPr>
+          <w:rFonts w:ascii="Montserrat" w:cs="Montserrat" w:eastAsia="Montserrat" w:hAnsi="Montserrat"/>
+          <w:sz w:val="20"/>
+          <w:szCs w:val="20"/>
+        </w:rPr>
+        <w:t xml:space="preserve"> con 100–200 ms, </w:t>
+      </w:r>
+      <w:r>
+        <w:rPr>
+          <w:rFonts w:ascii="Courier New" w:cs="Courier New" w:eastAsia="Courier New" w:hAnsi="Courier New"/>
+          <w:sz w:val="18"/>
+          <w:szCs w:val="18"/>
+        </w:rPr>
+        <w:t xml:space="preserve">input.compassHeading()</w:t>
+      </w:r>
+      <w:r>
+        <w:rPr>
+          <w:rFonts w:ascii="Montserrat" w:cs="Montserrat" w:eastAsia="Montserrat" w:hAnsi="Montserrat"/>
+          <w:sz w:val="20"/>
+          <w:szCs w:val="20"/>
+        </w:rPr>
+        <w:t xml:space="preserve"> con 100 ms.</w:t>
+      </w:r>
+    </w:p>
+    <w:p>
+      <w:pPr>
+        <w:pStyle w:val="Heading2"/>
+        <w:spacing w:after="140" w:before="300"/>
+      </w:pPr>
+      <w:r>
+        <w:rPr>
+          <w:rFonts w:ascii="Montserrat" w:cs="Montserrat" w:eastAsia="Montserrat" w:hAnsi="Montserrat"/>
+          <w:b/>
+          <w:bCs/>
+          <w:color w:val="000000"/>
+          <w:sz w:val="22"/>
+          <w:szCs w:val="22"/>
+        </w:rPr>
+        <w:t xml:space="preserve">3.5 · Consejos de MakeCode</w:t>
+      </w:r>
+    </w:p>
+    <w:p>
+      <w:pPr>
+        <w:pStyle w:val="ListParagraph"/>
+        <w:numPr>
+          <w:ilvl w:val="0"/>
+          <w:numId w:val="2"/>
+        </w:numPr>
+        <w:spacing w:after="80" w:line="280"/>
+      </w:pPr>
+      <w:r>
+        <w:rPr>
+          <w:rFonts w:ascii="Montserrat" w:cs="Montserrat" w:eastAsia="Montserrat" w:hAnsi="Montserrat"/>
+          <w:b/>
+          <w:bCs/>
+          <w:sz w:val="20"/>
+          <w:szCs w:val="20"/>
+        </w:rPr>
+        <w:t xml:space="preserve">Feedback visual: </w:t>
+      </w:r>
+      <w:r>
+        <w:rPr>
+          <w:rFonts w:ascii="Montserrat" w:cs="Montserrat" w:eastAsia="Montserrat" w:hAnsi="Montserrat"/>
+          <w:sz w:val="20"/>
+          <w:szCs w:val="20"/>
+        </w:rPr>
+        <w:t xml:space="preserve">agregá </w:t>
+      </w:r>
+      <w:r>
+        <w:rPr>
+          <w:rFonts w:ascii="Courier New" w:cs="Courier New" w:eastAsia="Courier New" w:hAnsi="Courier New"/>
+          <w:sz w:val="18"/>
+          <w:szCs w:val="18"/>
+        </w:rPr>
+        <w:t xml:space="preserve">basic.showIcon(IconNames.Yes)</w:t>
+      </w:r>
+      <w:r>
+        <w:rPr>
+          <w:rFonts w:ascii="Montserrat" w:cs="Montserrat" w:eastAsia="Montserrat" w:hAnsi="Montserrat"/>
+          <w:sz w:val="20"/>
+          <w:szCs w:val="20"/>
+        </w:rPr>
+        <w:t xml:space="preserve"> en </w:t>
+      </w:r>
+      <w:r>
+        <w:rPr>
+          <w:rFonts w:ascii="Courier New" w:cs="Courier New" w:eastAsia="Courier New" w:hAnsi="Courier New"/>
+          <w:sz w:val="18"/>
+          <w:szCs w:val="18"/>
+        </w:rPr>
+        <w:t xml:space="preserve">al iniciar</w:t>
+      </w:r>
+      <w:r>
+        <w:rPr>
+          <w:rFonts w:ascii="Montserrat" w:cs="Montserrat" w:eastAsia="Montserrat" w:hAnsi="Montserrat"/>
+          <w:sz w:val="20"/>
+          <w:szCs w:val="20"/>
+        </w:rPr>
+        <w:t xml:space="preserve"> para saber que el programa arrancó. Evitá dejar animaciones o </w:t>
+      </w:r>
+      <w:r>
+        <w:rPr>
+          <w:rFonts w:ascii="Courier New" w:cs="Courier New" w:eastAsia="Courier New" w:hAnsi="Courier New"/>
+          <w:sz w:val="18"/>
+          <w:szCs w:val="18"/>
+        </w:rPr>
+        <w:t xml:space="preserve">showNumber</w:t>
+      </w:r>
+      <w:r>
+        <w:rPr>
+          <w:rFonts w:ascii="Montserrat" w:cs="Montserrat" w:eastAsia="Montserrat" w:hAnsi="Montserrat"/>
+          <w:sz w:val="20"/>
+          <w:szCs w:val="20"/>
+        </w:rPr>
+        <w:t xml:space="preserve"> dentro del bucle de medición: la pantalla LED enlentece el envío de datos.</w:t>
+      </w:r>
+    </w:p>
+    <w:p>
+      <w:pPr>
+        <w:pStyle w:val="ListParagraph"/>
+        <w:numPr>
+          <w:ilvl w:val="0"/>
+          <w:numId w:val="2"/>
+        </w:numPr>
+        <w:spacing w:after="80" w:line="280"/>
+      </w:pPr>
+      <w:r>
+        <w:rPr>
+          <w:rFonts w:ascii="Montserrat" w:cs="Montserrat" w:eastAsia="Montserrat" w:hAnsi="Montserrat"/>
+          <w:b/>
+          <w:bCs/>
+          <w:sz w:val="20"/>
+          <w:szCs w:val="20"/>
+        </w:rPr>
+        <w:t xml:space="preserve">Micro:bit a batería: </w:t>
+      </w:r>
+      <w:r>
+        <w:rPr>
+          <w:rFonts w:ascii="Montserrat" w:cs="Montserrat" w:eastAsia="Montserrat" w:hAnsi="Montserrat"/>
+          <w:sz w:val="20"/>
+          <w:szCs w:val="20"/>
+        </w:rPr>
+        <w:t xml:space="preserve">para Bluetooth conviene desconectar el cable USB y alimentar con el portapilas; el timestamp de </w:t>
+      </w:r>
+      <w:r>
+        <w:rPr>
+          <w:rFonts w:ascii="Courier New" w:cs="Courier New" w:eastAsia="Courier New" w:hAnsi="Courier New"/>
+          <w:sz w:val="18"/>
+          <w:szCs w:val="18"/>
+        </w:rPr>
+        <w:t xml:space="preserve">input.runningTime()</w:t>
+      </w:r>
+      <w:r>
+        <w:rPr>
+          <w:rFonts w:ascii="Montserrat" w:cs="Montserrat" w:eastAsia="Montserrat" w:hAnsi="Montserrat"/>
+          <w:sz w:val="20"/>
+          <w:szCs w:val="20"/>
+        </w:rPr>
+        <w:t xml:space="preserve"> sigue funcionando igual.</w:t>
+      </w:r>
+    </w:p>
+    <w:p>
+      <w:pPr>
+        <w:pStyle w:val="ListParagraph"/>
+        <w:numPr>
+          <w:ilvl w:val="0"/>
+          <w:numId w:val="2"/>
+        </w:numPr>
+        <w:spacing w:after="80" w:line="280"/>
+      </w:pPr>
+      <w:r>
+        <w:rPr>
+          <w:rFonts w:ascii="Montserrat" w:cs="Montserrat" w:eastAsia="Montserrat" w:hAnsi="Montserrat"/>
+          <w:b/>
+          <w:bCs/>
+          <w:sz w:val="20"/>
+          <w:szCs w:val="20"/>
+        </w:rPr>
+        <w:t xml:space="preserve">Velocidad real: </w:t>
+      </w:r>
+      <w:r>
+        <w:rPr>
+          <w:rFonts w:ascii="Courier New" w:cs="Courier New" w:eastAsia="Courier New" w:hAnsi="Courier New"/>
+          <w:sz w:val="18"/>
+          <w:szCs w:val="18"/>
+        </w:rPr>
+        <w:t xml:space="preserve">basic.forever</w:t>
+      </w:r>
+      <w:r>
+        <w:rPr>
+          <w:rFonts w:ascii="Montserrat" w:cs="Montserrat" w:eastAsia="Montserrat" w:hAnsi="Montserrat"/>
+          <w:sz w:val="20"/>
+          <w:szCs w:val="20"/>
+        </w:rPr>
+        <w:t xml:space="preserve"> agrega ~20 ms ocultos por vuelta, por eso </w:t>
+      </w:r>
+      <w:r>
+        <w:rPr>
+          <w:rFonts w:ascii="Courier New" w:cs="Courier New" w:eastAsia="Courier New" w:hAnsi="Courier New"/>
+          <w:sz w:val="18"/>
+          <w:szCs w:val="18"/>
+        </w:rPr>
+        <w:t xml:space="preserve">pause(100)</w:t>
+      </w:r>
+      <w:r>
+        <w:rPr>
+          <w:rFonts w:ascii="Montserrat" w:cs="Montserrat" w:eastAsia="Montserrat" w:hAnsi="Montserrat"/>
+          <w:sz w:val="20"/>
+          <w:szCs w:val="20"/>
+        </w:rPr>
+        <w:t xml:space="preserve"> da ~8 Hz reales. Para fenómenos rápidos usá </w:t>
+      </w:r>
+      <w:r>
+        <w:rPr>
+          <w:rFonts w:ascii="Courier New" w:cs="Courier New" w:eastAsia="Courier New" w:hAnsi="Courier New"/>
+          <w:sz w:val="18"/>
+          <w:szCs w:val="18"/>
+        </w:rPr>
+        <w:t xml:space="preserve">loops.everyInterval(10, ...)</w:t>
+      </w:r>
+      <w:r>
+        <w:rPr>
+          <w:rFonts w:ascii="Montserrat" w:cs="Montserrat" w:eastAsia="Montserrat" w:hAnsi="Montserrat"/>
+          <w:sz w:val="20"/>
+          <w:szCs w:val="20"/>
+        </w:rPr>
+        <w:t xml:space="preserve"> (~100 Hz reales, el máximo recomendado):</w:t>
+      </w:r>
+    </w:p>
+    <w:p>
+      <w:pPr>
         <w:pBdr>
-          <w:left w:val="single" w:color="000000" w:sz="36" w:space="10"/>
+          <w:left w:val="single" w:color="000000" w:sz="24" w:space="8"/>
         </w:pBdr>
         <w:shd w:fill="F5F5F5" w:val="clear"/>
-        <w:spacing w:after="220" w:before="160" w:line="290"/>
-        <w:ind w:left="120" w:right="120"/>
-      </w:pPr>
-      <w:r>
-        <w:rPr>
-          <w:rFonts w:ascii="Montserrat" w:cs="Montserrat" w:eastAsia="Montserrat" w:hAnsi="Montserrat"/>
-          <w:b/>
-          <w:bCs/>
-          <w:sz w:val="20"/>
-          <w:szCs w:val="20"/>
-        </w:rPr>
-        <w:t xml:space="preserve">Importante: </w:t>
-      </w:r>
-      <w:r>
-        <w:rPr>
-          <w:rFonts w:ascii="Montserrat" w:cs="Montserrat" w:eastAsia="Montserrat" w:hAnsi="Montserrat"/>
-          <w:sz w:val="20"/>
-          <w:szCs w:val="20"/>
-        </w:rPr>
-        <w:t xml:space="preserve">al agregar la extensión Bluetooth se desactiva el serial USB. Para volver a usar USB hay que quitar la extensión Bluetooth.</w:t>
-      </w:r>
+        <w:spacing w:after="0" w:line="260"/>
+        <w:ind w:left="240"/>
+      </w:pPr>
+      <w:r>
+        <w:rPr>
+          <w:rFonts w:ascii="Courier New" w:cs="Courier New" w:eastAsia="Courier New" w:hAnsi="Courier New"/>
+          <w:sz w:val="18"/>
+          <w:szCs w:val="18"/>
+        </w:rPr>
+        <w:t xml:space="preserve">// Alta velocidad: ~100 Hz reales</w:t>
+      </w:r>
+    </w:p>
+    <w:p>
+      <w:pPr>
+        <w:pBdr>
+          <w:left w:val="single" w:color="000000" w:sz="24" w:space="8"/>
+        </w:pBdr>
+        <w:shd w:fill="F5F5F5" w:val="clear"/>
+        <w:spacing w:after="0" w:line="260"/>
+        <w:ind w:left="240"/>
+      </w:pPr>
+      <w:r>
+        <w:rPr>
+          <w:rFonts w:ascii="Courier New" w:cs="Courier New" w:eastAsia="Courier New" w:hAnsi="Courier New"/>
+          <w:sz w:val="18"/>
+          <w:szCs w:val="18"/>
+        </w:rPr>
+        <w:t xml:space="preserve">loops.everyInterval(10, function () {</w:t>
+      </w:r>
+    </w:p>
+    <w:p>
+      <w:pPr>
+        <w:pBdr>
+          <w:left w:val="single" w:color="000000" w:sz="24" w:space="8"/>
+        </w:pBdr>
+        <w:shd w:fill="F5F5F5" w:val="clear"/>
+        <w:spacing w:after="0" w:line="260"/>
+        <w:ind w:left="240"/>
+      </w:pPr>
+      <w:r>
+        <w:rPr>
+          <w:rFonts w:ascii="Courier New" w:cs="Courier New" w:eastAsia="Courier New" w:hAnsi="Courier New"/>
+          <w:sz w:val="18"/>
+          <w:szCs w:val="18"/>
+        </w:rPr>
+        <w:t xml:space="preserve">    let t = input.runningTime()</w:t>
+      </w:r>
+    </w:p>
+    <w:p>
+      <w:pPr>
+        <w:pBdr>
+          <w:left w:val="single" w:color="000000" w:sz="24" w:space="8"/>
+        </w:pBdr>
+        <w:shd w:fill="F5F5F5" w:val="clear"/>
+        <w:spacing w:after="0" w:line="260"/>
+        <w:ind w:left="240"/>
+      </w:pPr>
+      <w:r>
+        <w:rPr>
+          <w:rFonts w:ascii="Courier New" w:cs="Courier New" w:eastAsia="Courier New" w:hAnsi="Courier New"/>
+          <w:sz w:val="18"/>
+          <w:szCs w:val="18"/>
+        </w:rPr>
+        <w:t xml:space="preserve">    let valor = input.acceleration(Dimension.X)</w:t>
+      </w:r>
+    </w:p>
+    <w:p>
+      <w:pPr>
+        <w:pBdr>
+          <w:left w:val="single" w:color="000000" w:sz="24" w:space="8"/>
+        </w:pBdr>
+        <w:shd w:fill="F5F5F5" w:val="clear"/>
+        <w:spacing w:after="0" w:line="260"/>
+        <w:ind w:left="240"/>
+      </w:pPr>
+      <w:r>
+        <w:rPr>
+          <w:rFonts w:ascii="Courier New" w:cs="Courier New" w:eastAsia="Courier New" w:hAnsi="Courier New"/>
+          <w:sz w:val="18"/>
+          <w:szCs w:val="18"/>
+        </w:rPr>
+        <w:t xml:space="preserve">    serial.writeLine("" + t + "," + valor)</w:t>
+      </w:r>
+    </w:p>
+    <w:p>
+      <w:pPr>
+        <w:pBdr>
+          <w:left w:val="single" w:color="000000" w:sz="24" w:space="8"/>
+        </w:pBdr>
+        <w:shd w:fill="F5F5F5" w:val="clear"/>
+        <w:spacing w:after="200" w:line="260"/>
+        <w:ind w:left="240"/>
+      </w:pPr>
+      <w:r>
+        <w:rPr>
+          <w:rFonts w:ascii="Courier New" w:cs="Courier New" w:eastAsia="Courier New" w:hAnsi="Courier New"/>
+          <w:sz w:val="18"/>
+          <w:szCs w:val="18"/>
+        </w:rPr>
+        <w:t xml:space="preserve">})</w:t>
+      </w:r>
+    </w:p>
+    <w:p>
+      <w:pPr>
+        <w:spacing w:after="140" w:line="300"/>
+      </w:pPr>
+      <w:r>
+        <w:rPr>
+          <w:rFonts w:ascii="Montserrat" w:cs="Montserrat" w:eastAsia="Montserrat" w:hAnsi="Montserrat"/>
+          <w:sz w:val="20"/>
+          <w:szCs w:val="20"/>
+        </w:rPr>
+        <w:t xml:space="preserve">Frecuencias recomendadas según el experimento:</w:t>
+      </w:r>
+    </w:p>
+    <w:tbl>
+      <w:tblPr>
+        <w:tblW w:type="dxa" w:w="9072"/>
+        <w:tblBorders>
+          <w:top w:val="single" w:color="000000" w:sz="8"/>
+          <w:left w:val="none" w:color="FFFFFF" w:sz="0"/>
+          <w:bottom w:val="single" w:color="000000" w:sz="8"/>
+          <w:right w:val="none" w:color="FFFFFF" w:sz="0"/>
+          <w:insideH w:val="single" w:color="CCCCCC" w:sz="4"/>
+          <w:insideV w:val="none" w:color="FFFFFF" w:sz="0"/>
+        </w:tblBorders>
+      </w:tblPr>
+      <w:tblGrid>
+        <w:gridCol w:w="3200"/>
+        <w:gridCol w:w="2600"/>
+        <w:gridCol w:w="3272"/>
+      </w:tblGrid>
+      <w:tr>
+        <w:trPr>
+          <w:tblHeader/>
+        </w:trPr>
+        <w:tc>
+          <w:tcPr>
+            <w:tcW w:type="dxa" w:w="3200"/>
+            <w:shd w:fill="000000" w:val="clear"/>
+            <w:tcMar>
+              <w:top w:type="dxa" w:w="80"/>
+              <w:left w:type="dxa" w:w="120"/>
+              <w:bottom w:type="dxa" w:w="80"/>
+              <w:right w:type="dxa" w:w="120"/>
+            </w:tcMar>
+            <w:vAlign w:val="center"/>
+          </w:tcPr>
+          <w:p>
+            <w:pPr>
+              <w:spacing w:after="0"/>
+            </w:pPr>
+            <w:r>
+              <w:rPr>
+                <w:rFonts w:ascii="Montserrat" w:cs="Montserrat" w:eastAsia="Montserrat" w:hAnsi="Montserrat"/>
+                <w:b/>
+                <w:bCs/>
+                <w:color w:val="FFFFFF"/>
+                <w:sz w:val="18"/>
+                <w:szCs w:val="18"/>
+              </w:rPr>
+              <w:t xml:space="preserve">Experimento</w:t>
+            </w:r>
+          </w:p>
+        </w:tc>
+        <w:tc>
+          <w:tcPr>
+            <w:tcW w:type="dxa" w:w="2600"/>
+            <w:shd w:fill="000000" w:val="clear"/>
+            <w:tcMar>
+              <w:top w:type="dxa" w:w="80"/>
+              <w:left w:type="dxa" w:w="120"/>
+              <w:bottom w:type="dxa" w:w="80"/>
+              <w:right w:type="dxa" w:w="120"/>
+            </w:tcMar>
+            <w:vAlign w:val="center"/>
+          </w:tcPr>
+          <w:p>
+            <w:pPr>
+              <w:spacing w:after="0"/>
+            </w:pPr>
+            <w:r>
+              <w:rPr>
+                <w:rFonts w:ascii="Montserrat" w:cs="Montserrat" w:eastAsia="Montserrat" w:hAnsi="Montserrat"/>
+                <w:b/>
+                <w:bCs/>
+                <w:color w:val="FFFFFF"/>
+                <w:sz w:val="18"/>
+                <w:szCs w:val="18"/>
+              </w:rPr>
+              <w:t xml:space="preserve">Frecuencia</w:t>
+            </w:r>
+          </w:p>
+        </w:tc>
+        <w:tc>
+          <w:tcPr>
+            <w:tcW w:type="dxa" w:w="3272"/>
+            <w:shd w:fill="000000" w:val="clear"/>
+            <w:tcMar>
+              <w:top w:type="dxa" w:w="80"/>
+              <w:left w:type="dxa" w:w="120"/>
+              <w:bottom w:type="dxa" w:w="80"/>
+              <w:right w:type="dxa" w:w="120"/>
+            </w:tcMar>
+            <w:vAlign w:val="center"/>
+          </w:tcPr>
+          <w:p>
+            <w:pPr>
+              <w:spacing w:after="0"/>
+            </w:pPr>
+            <w:r>
+              <w:rPr>
+                <w:rFonts w:ascii="Montserrat" w:cs="Montserrat" w:eastAsia="Montserrat" w:hAnsi="Montserrat"/>
+                <w:b/>
+                <w:bCs/>
+                <w:color w:val="FFFFFF"/>
+                <w:sz w:val="18"/>
+                <w:szCs w:val="18"/>
+              </w:rPr>
+              <w:t xml:space="preserve">Pausa (ms)</w:t>
+            </w:r>
+          </w:p>
+        </w:tc>
+      </w:tr>
+      <w:tr>
+        <w:tc>
+          <w:tcPr>
+            <w:tcW w:type="dxa" w:w="3200"/>
+            <w:shd w:fill="FFFFFF" w:val="clear"/>
+            <w:tcMar>
+              <w:top w:type="dxa" w:w="80"/>
+              <w:left w:type="dxa" w:w="120"/>
+              <w:bottom w:type="dxa" w:w="80"/>
+              <w:right w:type="dxa" w:w="120"/>
+            </w:tcMar>
+            <w:vAlign w:val="center"/>
+          </w:tcPr>
+          <w:p>
+            <w:pPr>
+              <w:spacing w:after="0"/>
+            </w:pPr>
+            <w:r>
+              <w:rPr>
+                <w:rFonts w:ascii="Montserrat" w:cs="Montserrat" w:eastAsia="Montserrat" w:hAnsi="Montserrat"/>
+                <w:b w:val="false"/>
+                <w:bCs w:val="false"/>
+                <w:color w:val="000000"/>
+                <w:sz w:val="18"/>
+                <w:szCs w:val="18"/>
+              </w:rPr>
+              <w:t xml:space="preserve">Temperatura</w:t>
+            </w:r>
+          </w:p>
+        </w:tc>
+        <w:tc>
+          <w:tcPr>
+            <w:tcW w:type="dxa" w:w="2600"/>
+            <w:shd w:fill="FFFFFF" w:val="clear"/>
+            <w:tcMar>
+              <w:top w:type="dxa" w:w="80"/>
+              <w:left w:type="dxa" w:w="120"/>
+              <w:bottom w:type="dxa" w:w="80"/>
+              <w:right w:type="dxa" w:w="120"/>
+            </w:tcMar>
+            <w:vAlign w:val="center"/>
+          </w:tcPr>
+          <w:p>
+            <w:pPr>
+              <w:spacing w:after="0"/>
+            </w:pPr>
+            <w:r>
+              <w:rPr>
+                <w:rFonts w:ascii="Montserrat" w:cs="Montserrat" w:eastAsia="Montserrat" w:hAnsi="Montserrat"/>
+                <w:b w:val="false"/>
+                <w:bCs w:val="false"/>
+                <w:color w:val="000000"/>
+                <w:sz w:val="18"/>
+                <w:szCs w:val="18"/>
+              </w:rPr>
+              <w:t xml:space="preserve">1–2 Hz</w:t>
+            </w:r>
+          </w:p>
+        </w:tc>
+        <w:tc>
+          <w:tcPr>
+            <w:tcW w:type="dxa" w:w="3272"/>
+            <w:shd w:fill="FFFFFF" w:val="clear"/>
+            <w:tcMar>
+              <w:top w:type="dxa" w:w="80"/>
+              <w:left w:type="dxa" w:w="120"/>
+              <w:bottom w:type="dxa" w:w="80"/>
+              <w:right w:type="dxa" w:w="120"/>
+            </w:tcMar>
+            <w:vAlign w:val="center"/>
+          </w:tcPr>
+          <w:p>
+            <w:pPr>
+              <w:spacing w:after="0"/>
+            </w:pPr>
+            <w:r>
+              <w:rPr>
+                <w:rFonts w:ascii="Montserrat" w:cs="Montserrat" w:eastAsia="Montserrat" w:hAnsi="Montserrat"/>
+                <w:b w:val="false"/>
+                <w:bCs w:val="false"/>
+                <w:color w:val="000000"/>
+                <w:sz w:val="18"/>
+                <w:szCs w:val="18"/>
+              </w:rPr>
+              <w:t xml:space="preserve">500–1000</w:t>
+            </w:r>
+          </w:p>
+        </w:tc>
+      </w:tr>
+      <w:tr>
+        <w:tc>
+          <w:tcPr>
+            <w:tcW w:type="dxa" w:w="3200"/>
+            <w:shd w:fill="FFFFFF" w:val="clear"/>
+            <w:tcMar>
+              <w:top w:type="dxa" w:w="80"/>
+              <w:left w:type="dxa" w:w="120"/>
+              <w:bottom w:type="dxa" w:w="80"/>
+              <w:right w:type="dxa" w:w="120"/>
+            </w:tcMar>
+            <w:vAlign w:val="center"/>
+          </w:tcPr>
+          <w:p>
+            <w:pPr>
+              <w:spacing w:after="0"/>
+            </w:pPr>
+            <w:r>
+              <w:rPr>
+                <w:rFonts w:ascii="Montserrat" w:cs="Montserrat" w:eastAsia="Montserrat" w:hAnsi="Montserrat"/>
+                <w:b w:val="false"/>
+                <w:bCs w:val="false"/>
+                <w:color w:val="000000"/>
+                <w:sz w:val="18"/>
+                <w:szCs w:val="18"/>
+              </w:rPr>
+              <w:t xml:space="preserve">Luz ambiental</w:t>
+            </w:r>
+          </w:p>
+        </w:tc>
+        <w:tc>
+          <w:tcPr>
+            <w:tcW w:type="dxa" w:w="2600"/>
+            <w:shd w:fill="FFFFFF" w:val="clear"/>
+            <w:tcMar>
+              <w:top w:type="dxa" w:w="80"/>
+              <w:left w:type="dxa" w:w="120"/>
+              <w:bottom w:type="dxa" w:w="80"/>
+              <w:right w:type="dxa" w:w="120"/>
+            </w:tcMar>
+            <w:vAlign w:val="center"/>
+          </w:tcPr>
+          <w:p>
+            <w:pPr>
+              <w:spacing w:after="0"/>
+            </w:pPr>
+            <w:r>
+              <w:rPr>
+                <w:rFonts w:ascii="Montserrat" w:cs="Montserrat" w:eastAsia="Montserrat" w:hAnsi="Montserrat"/>
+                <w:b w:val="false"/>
+                <w:bCs w:val="false"/>
+                <w:color w:val="000000"/>
+                <w:sz w:val="18"/>
+                <w:szCs w:val="18"/>
+              </w:rPr>
+              <w:t xml:space="preserve">5–10 Hz</w:t>
+            </w:r>
+          </w:p>
+        </w:tc>
+        <w:tc>
+          <w:tcPr>
+            <w:tcW w:type="dxa" w:w="3272"/>
+            <w:shd w:fill="FFFFFF" w:val="clear"/>
+            <w:tcMar>
+              <w:top w:type="dxa" w:w="80"/>
+              <w:left w:type="dxa" w:w="120"/>
+              <w:bottom w:type="dxa" w:w="80"/>
+              <w:right w:type="dxa" w:w="120"/>
+            </w:tcMar>
+            <w:vAlign w:val="center"/>
+          </w:tcPr>
+          <w:p>
+            <w:pPr>
+              <w:spacing w:after="0"/>
+            </w:pPr>
+            <w:r>
+              <w:rPr>
+                <w:rFonts w:ascii="Montserrat" w:cs="Montserrat" w:eastAsia="Montserrat" w:hAnsi="Montserrat"/>
+                <w:b w:val="false"/>
+                <w:bCs w:val="false"/>
+                <w:color w:val="000000"/>
+                <w:sz w:val="18"/>
+                <w:szCs w:val="18"/>
+              </w:rPr>
+              <w:t xml:space="preserve">100–200</w:t>
+            </w:r>
+          </w:p>
+        </w:tc>
+      </w:tr>
+      <w:tr>
+        <w:tc>
+          <w:tcPr>
+            <w:tcW w:type="dxa" w:w="3200"/>
+            <w:shd w:fill="FFFFFF" w:val="clear"/>
+            <w:tcMar>
+              <w:top w:type="dxa" w:w="80"/>
+              <w:left w:type="dxa" w:w="120"/>
+              <w:bottom w:type="dxa" w:w="80"/>
+              <w:right w:type="dxa" w:w="120"/>
+            </w:tcMar>
+            <w:vAlign w:val="center"/>
+          </w:tcPr>
+          <w:p>
+            <w:pPr>
+              <w:spacing w:after="0"/>
+            </w:pPr>
+            <w:r>
+              <w:rPr>
+                <w:rFonts w:ascii="Montserrat" w:cs="Montserrat" w:eastAsia="Montserrat" w:hAnsi="Montserrat"/>
+                <w:b w:val="false"/>
+                <w:bCs w:val="false"/>
+                <w:color w:val="000000"/>
+                <w:sz w:val="18"/>
+                <w:szCs w:val="18"/>
+              </w:rPr>
+              <w:t xml:space="preserve">Acelerómetro / movimiento</w:t>
+            </w:r>
+          </w:p>
+        </w:tc>
+        <w:tc>
+          <w:tcPr>
+            <w:tcW w:type="dxa" w:w="2600"/>
+            <w:shd w:fill="FFFFFF" w:val="clear"/>
+            <w:tcMar>
+              <w:top w:type="dxa" w:w="80"/>
+              <w:left w:type="dxa" w:w="120"/>
+              <w:bottom w:type="dxa" w:w="80"/>
+              <w:right w:type="dxa" w:w="120"/>
+            </w:tcMar>
+            <w:vAlign w:val="center"/>
+          </w:tcPr>
+          <w:p>
+            <w:pPr>
+              <w:spacing w:after="0"/>
+            </w:pPr>
+            <w:r>
+              <w:rPr>
+                <w:rFonts w:ascii="Montserrat" w:cs="Montserrat" w:eastAsia="Montserrat" w:hAnsi="Montserrat"/>
+                <w:b w:val="false"/>
+                <w:bCs w:val="false"/>
+                <w:color w:val="000000"/>
+                <w:sz w:val="18"/>
+                <w:szCs w:val="18"/>
+              </w:rPr>
+              <w:t xml:space="preserve">20–50 Hz</w:t>
+            </w:r>
+          </w:p>
+        </w:tc>
+        <w:tc>
+          <w:tcPr>
+            <w:tcW w:type="dxa" w:w="3272"/>
+            <w:shd w:fill="FFFFFF" w:val="clear"/>
+            <w:tcMar>
+              <w:top w:type="dxa" w:w="80"/>
+              <w:left w:type="dxa" w:w="120"/>
+              <w:bottom w:type="dxa" w:w="80"/>
+              <w:right w:type="dxa" w:w="120"/>
+            </w:tcMar>
+            <w:vAlign w:val="center"/>
+          </w:tcPr>
+          <w:p>
+            <w:pPr>
+              <w:spacing w:after="0"/>
+            </w:pPr>
+            <w:r>
+              <w:rPr>
+                <w:rFonts w:ascii="Montserrat" w:cs="Montserrat" w:eastAsia="Montserrat" w:hAnsi="Montserrat"/>
+                <w:b w:val="false"/>
+                <w:bCs w:val="false"/>
+                <w:color w:val="000000"/>
+                <w:sz w:val="18"/>
+                <w:szCs w:val="18"/>
+              </w:rPr>
+              <w:t xml:space="preserve">20–50 (o everyInterval)</w:t>
+            </w:r>
+          </w:p>
+        </w:tc>
+      </w:tr>
+    </w:tbl>
+    <w:p>
+      <w:pPr>
+        <w:spacing w:after="160"/>
+      </w:pPr>
     </w:p>
     <w:p>
       <w:pPr>
@@ -1496,6 +2945,91 @@
     </w:p>
     <w:p>
       <w:pPr>
+        <w:spacing w:after="140" w:line="300"/>
+      </w:pPr>
+      <w:r>
+        <w:rPr>
+          <w:rFonts w:ascii="Montserrat" w:cs="Montserrat" w:eastAsia="Montserrat" w:hAnsi="Montserrat"/>
+          <w:sz w:val="20"/>
+          <w:szCs w:val="20"/>
+        </w:rPr>
+        <w:t xml:space="preserve">La plataforma se conecta de dos maneras: por </w:t>
+      </w:r>
+      <w:r>
+        <w:rPr>
+          <w:rFonts w:ascii="Montserrat" w:cs="Montserrat" w:eastAsia="Montserrat" w:hAnsi="Montserrat"/>
+          <w:b/>
+          <w:bCs/>
+          <w:sz w:val="20"/>
+          <w:szCs w:val="20"/>
+        </w:rPr>
+        <w:t xml:space="preserve">cable USB</w:t>
+      </w:r>
+      <w:r>
+        <w:rPr>
+          <w:rFonts w:ascii="Montserrat" w:cs="Montserrat" w:eastAsia="Montserrat" w:hAnsi="Montserrat"/>
+          <w:sz w:val="20"/>
+          <w:szCs w:val="20"/>
+        </w:rPr>
+        <w:t xml:space="preserve"> (Web Serial) o por </w:t>
+      </w:r>
+      <w:r>
+        <w:rPr>
+          <w:rFonts w:ascii="Montserrat" w:cs="Montserrat" w:eastAsia="Montserrat" w:hAnsi="Montserrat"/>
+          <w:b/>
+          <w:bCs/>
+          <w:sz w:val="20"/>
+          <w:szCs w:val="20"/>
+        </w:rPr>
+        <w:t xml:space="preserve">Bluetooth</w:t>
+      </w:r>
+      <w:r>
+        <w:rPr>
+          <w:rFonts w:ascii="Montserrat" w:cs="Montserrat" w:eastAsia="Montserrat" w:hAnsi="Montserrat"/>
+          <w:sz w:val="20"/>
+          <w:szCs w:val="20"/>
+        </w:rPr>
+        <w:t xml:space="preserve"> (Web Bluetooth). En ambos casos funciona en </w:t>
+      </w:r>
+      <w:r>
+        <w:rPr>
+          <w:rFonts w:ascii="Montserrat" w:cs="Montserrat" w:eastAsia="Montserrat" w:hAnsi="Montserrat"/>
+          <w:b/>
+          <w:bCs/>
+          <w:sz w:val="20"/>
+          <w:szCs w:val="20"/>
+        </w:rPr>
+        <w:t xml:space="preserve">Chrome</w:t>
+      </w:r>
+      <w:r>
+        <w:rPr>
+          <w:rFonts w:ascii="Montserrat" w:cs="Montserrat" w:eastAsia="Montserrat" w:hAnsi="Montserrat"/>
+          <w:sz w:val="20"/>
+          <w:szCs w:val="20"/>
+        </w:rPr>
+        <w:t xml:space="preserve"> o </w:t>
+      </w:r>
+      <w:r>
+        <w:rPr>
+          <w:rFonts w:ascii="Montserrat" w:cs="Montserrat" w:eastAsia="Montserrat" w:hAnsi="Montserrat"/>
+          <w:b/>
+          <w:bCs/>
+          <w:sz w:val="20"/>
+          <w:szCs w:val="20"/>
+        </w:rPr>
+        <w:t xml:space="preserve">Edge</w:t>
+      </w:r>
+      <w:r>
+        <w:rPr>
+          <w:rFonts w:ascii="Montserrat" w:cs="Montserrat" w:eastAsia="Montserrat" w:hAnsi="Montserrat"/>
+          <w:sz w:val="20"/>
+          <w:szCs w:val="20"/>
+        </w:rPr>
+        <w:t xml:space="preserve">; en iOS/iPadOS Apple no permite ninguna de las dos.</w:t>
+      </w:r>
+    </w:p>
+    <w:p>
+      <w:pPr>
         <w:pStyle w:val="Heading2"/>
         <w:spacing w:after="140" w:before="300"/>
       </w:pPr>
@@ -1508,7 +3042,7 @@
           <w:sz w:val="22"/>
           <w:szCs w:val="22"/>
         </w:rPr>
-        <w:t xml:space="preserve">5.1 · Conectar</w:t>
+        <w:t xml:space="preserve">5.1 · Conexión por USB (serial)</w:t>
       </w:r>
     </w:p>
     <w:p>
@@ -1532,43 +3066,25 @@
           <w:sz w:val="20"/>
           <w:szCs w:val="20"/>
         </w:rPr>
-        <w:t xml:space="preserve">Conectá la micro:bit por cable y presioná </w:t>
-      </w:r>
-      <w:r>
-        <w:rPr>
-          <w:rFonts w:ascii="Montserrat" w:cs="Montserrat" w:eastAsia="Montserrat" w:hAnsi="Montserrat"/>
-          <w:b/>
-          <w:bCs/>
-          <w:sz w:val="20"/>
-          <w:szCs w:val="20"/>
-        </w:rPr>
-        <w:t xml:space="preserve">CONECTAR</w:t>
-      </w:r>
-      <w:r>
-        <w:rPr>
-          <w:rFonts w:ascii="Montserrat" w:cs="Montserrat" w:eastAsia="Montserrat" w:hAnsi="Montserrat"/>
-          <w:sz w:val="20"/>
-          <w:szCs w:val="20"/>
-        </w:rPr>
-        <w:t xml:space="preserve"> (USB), o presioná </w:t>
-      </w:r>
-      <w:r>
-        <w:rPr>
-          <w:rFonts w:ascii="Montserrat" w:cs="Montserrat" w:eastAsia="Montserrat" w:hAnsi="Montserrat"/>
-          <w:b/>
-          <w:bCs/>
-          <w:sz w:val="20"/>
-          <w:szCs w:val="20"/>
-        </w:rPr>
-        <w:t xml:space="preserve">BLUETOOTH</w:t>
-      </w:r>
-      <w:r>
-        <w:rPr>
-          <w:rFonts w:ascii="Montserrat" w:cs="Montserrat" w:eastAsia="Montserrat" w:hAnsi="Montserrat"/>
-          <w:sz w:val="20"/>
-          <w:szCs w:val="20"/>
-        </w:rPr>
-        <w:t xml:space="preserve"> para la conexión inalámbrica.</w:t>
+        <w:t xml:space="preserve">Conectá la micro:bit a la computadora con un </w:t>
+      </w:r>
+      <w:r>
+        <w:rPr>
+          <w:rFonts w:ascii="Montserrat" w:cs="Montserrat" w:eastAsia="Montserrat" w:hAnsi="Montserrat"/>
+          <w:b/>
+          <w:bCs/>
+          <w:sz w:val="20"/>
+          <w:szCs w:val="20"/>
+        </w:rPr>
+        <w:t xml:space="preserve">cable USB de datos</w:t>
+      </w:r>
+      <w:r>
+        <w:rPr>
+          <w:rFonts w:ascii="Montserrat" w:cs="Montserrat" w:eastAsia="Montserrat" w:hAnsi="Montserrat"/>
+          <w:sz w:val="20"/>
+          <w:szCs w:val="20"/>
+        </w:rPr>
+        <w:t xml:space="preserve"> (algunos cables solo cargan y no transmiten datos).</w:t>
       </w:r>
     </w:p>
     <w:p>
@@ -1592,25 +3108,232 @@
           <w:sz w:val="20"/>
           <w:szCs w:val="20"/>
         </w:rPr>
-        <w:t xml:space="preserve">En la ventana del navegador elegí el dispositivo </w:t>
-      </w:r>
-      <w:r>
-        <w:rPr>
-          <w:rFonts w:ascii="Montserrat" w:cs="Montserrat" w:eastAsia="Montserrat" w:hAnsi="Montserrat"/>
-          <w:b/>
-          <w:bCs/>
-          <w:sz w:val="20"/>
-          <w:szCs w:val="20"/>
-        </w:rPr>
-        <w:t xml:space="preserve">“BBC micro:bit”</w:t>
-      </w:r>
-      <w:r>
-        <w:rPr>
-          <w:rFonts w:ascii="Montserrat" w:cs="Montserrat" w:eastAsia="Montserrat" w:hAnsi="Montserrat"/>
-          <w:sz w:val="20"/>
-          <w:szCs w:val="20"/>
-        </w:rPr>
-        <w:t xml:space="preserve"> y aceptá.</w:t>
+        <w:t xml:space="preserve">Presioná </w:t>
+      </w:r>
+      <w:r>
+        <w:rPr>
+          <w:rFonts w:ascii="Montserrat" w:cs="Montserrat" w:eastAsia="Montserrat" w:hAnsi="Montserrat"/>
+          <w:b/>
+          <w:bCs/>
+          <w:sz w:val="20"/>
+          <w:szCs w:val="20"/>
+        </w:rPr>
+        <w:t xml:space="preserve">CONECTAR</w:t>
+      </w:r>
+      <w:r>
+        <w:rPr>
+          <w:rFonts w:ascii="Montserrat" w:cs="Montserrat" w:eastAsia="Montserrat" w:hAnsi="Montserrat"/>
+          <w:sz w:val="20"/>
+          <w:szCs w:val="20"/>
+        </w:rPr>
+        <w:t xml:space="preserve"> en la barra de herramientas.</w:t>
+      </w:r>
+    </w:p>
+    <w:p>
+      <w:pPr>
+        <w:spacing w:after="100" w:before="120" w:line="300"/>
+        <w:ind w:left="360" w:hanging="360"/>
+      </w:pPr>
+      <w:r>
+        <w:rPr>
+          <w:rFonts w:ascii="Montserrat" w:cs="Montserrat" w:eastAsia="Montserrat" w:hAnsi="Montserrat"/>
+          <w:b/>
+          <w:bCs/>
+          <w:sz w:val="20"/>
+          <w:szCs w:val="20"/>
+        </w:rPr>
+        <w:t xml:space="preserve">3.  </w:t>
+      </w:r>
+      <w:r>
+        <w:rPr>
+          <w:rFonts w:ascii="Montserrat" w:cs="Montserrat" w:eastAsia="Montserrat" w:hAnsi="Montserrat"/>
+          <w:sz w:val="20"/>
+          <w:szCs w:val="20"/>
+        </w:rPr>
+        <w:t xml:space="preserve">El navegador abre una ventanita con los puertos disponibles: elegí el de la micro:bit (aparece como </w:t>
+      </w:r>
+      <w:r>
+        <w:rPr>
+          <w:rFonts w:ascii="Montserrat" w:cs="Montserrat" w:eastAsia="Montserrat" w:hAnsi="Montserrat"/>
+          <w:b/>
+          <w:bCs/>
+          <w:sz w:val="20"/>
+          <w:szCs w:val="20"/>
+        </w:rPr>
+        <w:t xml:space="preserve">“BBC micro:bit CMSIS-DAP”</w:t>
+      </w:r>
+      <w:r>
+        <w:rPr>
+          <w:rFonts w:ascii="Montserrat" w:cs="Montserrat" w:eastAsia="Montserrat" w:hAnsi="Montserrat"/>
+          <w:sz w:val="20"/>
+          <w:szCs w:val="20"/>
+        </w:rPr>
+        <w:t xml:space="preserve"> o similar) y presioná </w:t>
+      </w:r>
+      <w:r>
+        <w:rPr>
+          <w:rFonts w:ascii="Montserrat" w:cs="Montserrat" w:eastAsia="Montserrat" w:hAnsi="Montserrat"/>
+          <w:b/>
+          <w:bCs/>
+          <w:sz w:val="20"/>
+          <w:szCs w:val="20"/>
+        </w:rPr>
+        <w:t xml:space="preserve">Conectar</w:t>
+      </w:r>
+      <w:r>
+        <w:rPr>
+          <w:rFonts w:ascii="Montserrat" w:cs="Montserrat" w:eastAsia="Montserrat" w:hAnsi="Montserrat"/>
+          <w:sz w:val="20"/>
+          <w:szCs w:val="20"/>
+        </w:rPr>
+        <w:t xml:space="preserve">. La velocidad (115200 baudios) la configura la plataforma sola.</w:t>
+      </w:r>
+    </w:p>
+    <w:p>
+      <w:pPr>
+        <w:pBdr>
+          <w:left w:val="single" w:color="000000" w:sz="36" w:space="10"/>
+        </w:pBdr>
+        <w:shd w:fill="F5F5F5" w:val="clear"/>
+        <w:spacing w:after="220" w:before="160" w:line="290"/>
+        <w:ind w:left="120" w:right="120"/>
+      </w:pPr>
+      <w:r>
+        <w:rPr>
+          <w:rFonts w:ascii="Montserrat" w:cs="Montserrat" w:eastAsia="Montserrat" w:hAnsi="Montserrat"/>
+          <w:b/>
+          <w:bCs/>
+          <w:sz w:val="20"/>
+          <w:szCs w:val="20"/>
+        </w:rPr>
+        <w:t xml:space="preserve">Consejo: </w:t>
+      </w:r>
+      <w:r>
+        <w:rPr>
+          <w:rFonts w:ascii="Montserrat" w:cs="Montserrat" w:eastAsia="Montserrat" w:hAnsi="Montserrat"/>
+          <w:sz w:val="20"/>
+          <w:szCs w:val="20"/>
+        </w:rPr>
+        <w:t xml:space="preserve">cerrá MakeCode (o cualquier consola serial) antes de conectar: si otra pestaña tiene el puerto abierto, la plataforma no va a poder usarlo.</w:t>
+      </w:r>
+    </w:p>
+    <w:p>
+      <w:pPr>
+        <w:pStyle w:val="Heading2"/>
+        <w:spacing w:after="140" w:before="300"/>
+      </w:pPr>
+      <w:r>
+        <w:rPr>
+          <w:rFonts w:ascii="Montserrat" w:cs="Montserrat" w:eastAsia="Montserrat" w:hAnsi="Montserrat"/>
+          <w:b/>
+          <w:bCs/>
+          <w:color w:val="000000"/>
+          <w:sz w:val="22"/>
+          <w:szCs w:val="22"/>
+        </w:rPr>
+        <w:t xml:space="preserve">5.2 · Conexión por Bluetooth</w:t>
+      </w:r>
+    </w:p>
+    <w:p>
+      <w:pPr>
+        <w:spacing w:after="100" w:before="120" w:line="300"/>
+        <w:ind w:left="360" w:hanging="360"/>
+      </w:pPr>
+      <w:r>
+        <w:rPr>
+          <w:rFonts w:ascii="Montserrat" w:cs="Montserrat" w:eastAsia="Montserrat" w:hAnsi="Montserrat"/>
+          <w:b/>
+          <w:bCs/>
+          <w:sz w:val="20"/>
+          <w:szCs w:val="20"/>
+        </w:rPr>
+        <w:t xml:space="preserve">1.  </w:t>
+      </w:r>
+      <w:r>
+        <w:rPr>
+          <w:rFonts w:ascii="Montserrat" w:cs="Montserrat" w:eastAsia="Montserrat" w:hAnsi="Montserrat"/>
+          <w:sz w:val="20"/>
+          <w:szCs w:val="20"/>
+        </w:rPr>
+        <w:t xml:space="preserve">Grabá antes el programa con la extensión Bluetooth y </w:t>
+      </w:r>
+      <w:r>
+        <w:rPr>
+          <w:rFonts w:ascii="Montserrat" w:cs="Montserrat" w:eastAsia="Montserrat" w:hAnsi="Montserrat"/>
+          <w:b/>
+          <w:bCs/>
+          <w:sz w:val="20"/>
+          <w:szCs w:val="20"/>
+        </w:rPr>
+        <w:t xml:space="preserve">“No Pairing Required”</w:t>
+      </w:r>
+      <w:r>
+        <w:rPr>
+          <w:rFonts w:ascii="Montserrat" w:cs="Montserrat" w:eastAsia="Montserrat" w:hAnsi="Montserrat"/>
+          <w:sz w:val="20"/>
+          <w:szCs w:val="20"/>
+        </w:rPr>
+        <w:t xml:space="preserve"> (sección 3.3). Encendé la micro:bit — puede ser a batería, sin cable.</w:t>
+      </w:r>
+    </w:p>
+    <w:p>
+      <w:pPr>
+        <w:spacing w:after="100" w:before="120" w:line="300"/>
+        <w:ind w:left="360" w:hanging="360"/>
+      </w:pPr>
+      <w:r>
+        <w:rPr>
+          <w:rFonts w:ascii="Montserrat" w:cs="Montserrat" w:eastAsia="Montserrat" w:hAnsi="Montserrat"/>
+          <w:b/>
+          <w:bCs/>
+          <w:sz w:val="20"/>
+          <w:szCs w:val="20"/>
+        </w:rPr>
+        <w:t xml:space="preserve">2.  </w:t>
+      </w:r>
+      <w:r>
+        <w:rPr>
+          <w:rFonts w:ascii="Montserrat" w:cs="Montserrat" w:eastAsia="Montserrat" w:hAnsi="Montserrat"/>
+          <w:sz w:val="20"/>
+          <w:szCs w:val="20"/>
+        </w:rPr>
+        <w:t xml:space="preserve">Presioná el botón azul </w:t>
+      </w:r>
+      <w:r>
+        <w:rPr>
+          <w:rFonts w:ascii="Montserrat" w:cs="Montserrat" w:eastAsia="Montserrat" w:hAnsi="Montserrat"/>
+          <w:b/>
+          <w:bCs/>
+          <w:sz w:val="20"/>
+          <w:szCs w:val="20"/>
+        </w:rPr>
+        <w:t xml:space="preserve">BLUETOOTH</w:t>
+      </w:r>
+      <w:r>
+        <w:rPr>
+          <w:rFonts w:ascii="Montserrat" w:cs="Montserrat" w:eastAsia="Montserrat" w:hAnsi="Montserrat"/>
+          <w:sz w:val="20"/>
+          <w:szCs w:val="20"/>
+        </w:rPr>
+        <w:t xml:space="preserve">. La plataforma muestra primero una guía con los requisitos; verificá los tres puntos y presioná </w:t>
+      </w:r>
+      <w:r>
+        <w:rPr>
+          <w:rFonts w:ascii="Montserrat" w:cs="Montserrat" w:eastAsia="Montserrat" w:hAnsi="Montserrat"/>
+          <w:b/>
+          <w:bCs/>
+          <w:sz w:val="20"/>
+          <w:szCs w:val="20"/>
+        </w:rPr>
+        <w:t xml:space="preserve">CONECTAR</w:t>
+      </w:r>
+      <w:r>
+        <w:rPr>
+          <w:rFonts w:ascii="Montserrat" w:cs="Montserrat" w:eastAsia="Montserrat" w:hAnsi="Montserrat"/>
+          <w:sz w:val="20"/>
+          <w:szCs w:val="20"/>
+        </w:rPr>
+        <w:t xml:space="preserve">.</w:t>
       </w:r>
     </w:p>
     <w:p>
@@ -1679,7 +3402,7 @@
           <w:sz w:val="17"/>
           <w:szCs w:val="17"/>
         </w:rPr>
-        <w:t xml:space="preserve">Guía de conexión Bluetooth: pasos previos y botón CONECTAR.</w:t>
+        <w:t xml:space="preserve">Guía de conexión Bluetooth: configuración del proyecto, reinicio y botón CONECTAR.</w:t>
       </w:r>
     </w:p>
     <w:p>
@@ -1703,7 +3426,112 @@
           <w:sz w:val="20"/>
           <w:szCs w:val="20"/>
         </w:rPr>
-        <w:t xml:space="preserve">El estado cambia a </w:t>
+        <w:t xml:space="preserve">En el selector del navegador elegí tu placa: aparece como </w:t>
+      </w:r>
+      <w:r>
+        <w:rPr>
+          <w:rFonts w:ascii="Montserrat" w:cs="Montserrat" w:eastAsia="Montserrat" w:hAnsi="Montserrat"/>
+          <w:b/>
+          <w:bCs/>
+          <w:sz w:val="20"/>
+          <w:szCs w:val="20"/>
+        </w:rPr>
+        <w:t xml:space="preserve">“BBC micro:bit [XXXXX]”</w:t>
+      </w:r>
+      <w:r>
+        <w:rPr>
+          <w:rFonts w:ascii="Montserrat" w:cs="Montserrat" w:eastAsia="Montserrat" w:hAnsi="Montserrat"/>
+          <w:sz w:val="20"/>
+          <w:szCs w:val="20"/>
+        </w:rPr>
+        <w:t xml:space="preserve"> (las letras entre corchetes identifican a cada micro:bit). Esperá a que el botón cambie a </w:t>
+      </w:r>
+      <w:r>
+        <w:rPr>
+          <w:rFonts w:ascii="Montserrat" w:cs="Montserrat" w:eastAsia="Montserrat" w:hAnsi="Montserrat"/>
+          <w:b/>
+          <w:bCs/>
+          <w:sz w:val="20"/>
+          <w:szCs w:val="20"/>
+        </w:rPr>
+        <w:t xml:space="preserve">BLUETOOTH CONECTADO</w:t>
+      </w:r>
+      <w:r>
+        <w:rPr>
+          <w:rFonts w:ascii="Montserrat" w:cs="Montserrat" w:eastAsia="Montserrat" w:hAnsi="Montserrat"/>
+          <w:sz w:val="20"/>
+          <w:szCs w:val="20"/>
+        </w:rPr>
+        <w:t xml:space="preserve">.</w:t>
+      </w:r>
+    </w:p>
+    <w:p>
+      <w:pPr>
+        <w:pBdr>
+          <w:left w:val="single" w:color="000000" w:sz="36" w:space="10"/>
+        </w:pBdr>
+        <w:shd w:fill="F5F5F5" w:val="clear"/>
+        <w:spacing w:after="220" w:before="160" w:line="290"/>
+        <w:ind w:left="120" w:right="120"/>
+      </w:pPr>
+      <w:r>
+        <w:rPr>
+          <w:rFonts w:ascii="Montserrat" w:cs="Montserrat" w:eastAsia="Montserrat" w:hAnsi="Montserrat"/>
+          <w:b/>
+          <w:bCs/>
+          <w:sz w:val="20"/>
+          <w:szCs w:val="20"/>
+        </w:rPr>
+        <w:t xml:space="preserve">Reconexión automática: </w:t>
+      </w:r>
+      <w:r>
+        <w:rPr>
+          <w:rFonts w:ascii="Montserrat" w:cs="Montserrat" w:eastAsia="Montserrat" w:hAnsi="Montserrat"/>
+          <w:sz w:val="20"/>
+          <w:szCs w:val="20"/>
+        </w:rPr>
+        <w:t xml:space="preserve">si la micro:bit se aleja o pierde señal (alcance típico ~10 m), la plataforma intenta reconectarse sola hasta 4 veces. Si la placa no aparece en el selector, reiniciala con el botón RESET y verificá que no esté conectada a otro dispositivo.</w:t>
+      </w:r>
+    </w:p>
+    <w:p>
+      <w:pPr>
+        <w:pStyle w:val="Heading2"/>
+        <w:spacing w:after="140" w:before="300"/>
+      </w:pPr>
+      <w:r>
+        <w:rPr>
+          <w:rFonts w:ascii="Montserrat" w:cs="Montserrat" w:eastAsia="Montserrat" w:hAnsi="Montserrat"/>
+          <w:b/>
+          <w:bCs/>
+          <w:color w:val="000000"/>
+          <w:sz w:val="22"/>
+          <w:szCs w:val="22"/>
+        </w:rPr>
+        <w:t xml:space="preserve">5.3 · Capturar datos</w:t>
+      </w:r>
+    </w:p>
+    <w:p>
+      <w:pPr>
+        <w:spacing w:after="100" w:before="120" w:line="300"/>
+        <w:ind w:left="360" w:hanging="360"/>
+      </w:pPr>
+      <w:r>
+        <w:rPr>
+          <w:rFonts w:ascii="Montserrat" w:cs="Montserrat" w:eastAsia="Montserrat" w:hAnsi="Montserrat"/>
+          <w:b/>
+          <w:bCs/>
+          <w:sz w:val="20"/>
+          <w:szCs w:val="20"/>
+        </w:rPr>
+        <w:t xml:space="preserve">1.  </w:t>
+      </w:r>
+      <w:r>
+        <w:rPr>
+          <w:rFonts w:ascii="Montserrat" w:cs="Montserrat" w:eastAsia="Montserrat" w:hAnsi="Montserrat"/>
+          <w:sz w:val="20"/>
+          <w:szCs w:val="20"/>
+        </w:rPr>
+        <w:t xml:space="preserve">Con la conexión establecida, el estado cambia a </w:t>
       </w:r>
       <w:r>
         <w:rPr>
@@ -1813,23 +3641,6 @@
     </w:p>
     <w:p>
       <w:pPr>
-        <w:pStyle w:val="Heading2"/>
-        <w:spacing w:after="140" w:before="300"/>
-      </w:pPr>
-      <w:r>
-        <w:rPr>
-          <w:rFonts w:ascii="Montserrat" w:cs="Montserrat" w:eastAsia="Montserrat" w:hAnsi="Montserrat"/>
-          <w:b/>
-          <w:bCs/>
-          <w:color w:val="000000"/>
-          <w:sz w:val="22"/>
-          <w:szCs w:val="22"/>
-        </w:rPr>
-        <w:t xml:space="preserve">5.2 · Capturar datos</w:t>
-      </w:r>
-    </w:p>
-    <w:p>
-      <w:pPr>
         <w:spacing w:after="100" w:before="120" w:line="300"/>
         <w:ind w:left="360" w:hanging="360"/>
       </w:pPr>
@@ -1841,7 +3652,7 @@
           <w:sz w:val="20"/>
           <w:szCs w:val="20"/>
         </w:rPr>
-        <w:t xml:space="preserve">4.  </w:t>
+        <w:t xml:space="preserve">2.  </w:t>
       </w:r>
       <w:r>
         <w:rPr>
@@ -1970,7 +3781,7 @@
           <w:sz w:val="20"/>
           <w:szCs w:val="20"/>
         </w:rPr>
-        <w:t xml:space="preserve">5.  </w:t>
+        <w:t xml:space="preserve">3.  </w:t>
       </w:r>
       <w:r>
         <w:rPr>
@@ -3314,6 +5125,23 @@
     </w:p>
     <w:p>
       <w:pPr>
+        <w:pStyle w:val="Heading2"/>
+        <w:spacing w:after="140" w:before="300"/>
+      </w:pPr>
+      <w:r>
+        <w:rPr>
+          <w:rFonts w:ascii="Montserrat" w:cs="Montserrat" w:eastAsia="Montserrat" w:hAnsi="Montserrat"/>
+          <w:b/>
+          <w:bCs/>
+          <w:color w:val="000000"/>
+          <w:sz w:val="22"/>
+          <w:szCs w:val="22"/>
+        </w:rPr>
+        <w:t xml:space="preserve">Conexión USB (serial)</w:t>
+      </w:r>
+    </w:p>
+    <w:p>
+      <w:pPr>
         <w:pStyle w:val="ListParagraph"/>
         <w:numPr>
           <w:ilvl w:val="0"/>
@@ -3329,15 +5157,15 @@
           <w:sz w:val="20"/>
           <w:szCs w:val="20"/>
         </w:rPr>
-        <w:t xml:space="preserve">No aparece el dispositivo al conectar: </w:t>
-      </w:r>
-      <w:r>
-        <w:rPr>
-          <w:rFonts w:ascii="Montserrat" w:cs="Montserrat" w:eastAsia="Montserrat" w:hAnsi="Montserrat"/>
-          <w:sz w:val="20"/>
-          <w:szCs w:val="20"/>
-        </w:rPr>
-        <w:t xml:space="preserve">verificá que el programa esté grabado en la micro:bit y, en Bluetooth, que la extensión bluetooth esté agregada con “No Pairing Required”.</w:t>
+        <w:t xml:space="preserve">No aparece el puerto: </w:t>
+      </w:r>
+      <w:r>
+        <w:rPr>
+          <w:rFonts w:ascii="Montserrat" w:cs="Montserrat" w:eastAsia="Montserrat" w:hAnsi="Montserrat"/>
+          <w:sz w:val="20"/>
+          <w:szCs w:val="20"/>
+        </w:rPr>
+        <w:t xml:space="preserve">verificá que el cable USB sea de datos (no solo de carga), probá otro puerto USB y reiniciá el navegador. Cerrá MakeCode u otras consolas seriales que puedan tener el puerto tomado.</w:t>
       </w:r>
     </w:p>
     <w:p>
@@ -3357,15 +5185,64 @@
           <w:sz w:val="20"/>
           <w:szCs w:val="20"/>
         </w:rPr>
-        <w:t xml:space="preserve">Se conecta pero no llegan datos: </w:t>
-      </w:r>
-      <w:r>
-        <w:rPr>
-          <w:rFonts w:ascii="Montserrat" w:cs="Montserrat" w:eastAsia="Montserrat" w:hAnsi="Montserrat"/>
-          <w:sz w:val="20"/>
-          <w:szCs w:val="20"/>
-        </w:rPr>
-        <w:t xml:space="preserve">presioná CAPTURAR después de conectar y verificá que la casilla “Micro:bit envía timestamp” coincida con el formato del programa.</w:t>
+        <w:t xml:space="preserve">No llegan datos por USB: </w:t>
+      </w:r>
+      <w:r>
+        <w:rPr>
+          <w:rFonts w:ascii="Montserrat" w:cs="Montserrat" w:eastAsia="Montserrat" w:hAnsi="Montserrat"/>
+          <w:sz w:val="20"/>
+          <w:szCs w:val="20"/>
+        </w:rPr>
+        <w:t xml:space="preserve">el programa debe usar </w:t>
+      </w:r>
+      <w:r>
+        <w:rPr>
+          <w:rFonts w:ascii="Courier New" w:cs="Courier New" w:eastAsia="Courier New" w:hAnsi="Courier New"/>
+          <w:sz w:val="18"/>
+          <w:szCs w:val="18"/>
+        </w:rPr>
+        <w:t xml:space="preserve">serial.writeLine()</w:t>
+      </w:r>
+      <w:r>
+        <w:rPr>
+          <w:rFonts w:ascii="Montserrat" w:cs="Montserrat" w:eastAsia="Montserrat" w:hAnsi="Montserrat"/>
+          <w:sz w:val="20"/>
+          <w:szCs w:val="20"/>
+        </w:rPr>
+        <w:t xml:space="preserve"> (no </w:t>
+      </w:r>
+      <w:r>
+        <w:rPr>
+          <w:rFonts w:ascii="Courier New" w:cs="Courier New" w:eastAsia="Courier New" w:hAnsi="Courier New"/>
+          <w:sz w:val="18"/>
+          <w:szCs w:val="18"/>
+        </w:rPr>
+        <w:t xml:space="preserve">writeNumber</w:t>
+      </w:r>
+      <w:r>
+        <w:rPr>
+          <w:rFonts w:ascii="Montserrat" w:cs="Montserrat" w:eastAsia="Montserrat" w:hAnsi="Montserrat"/>
+          <w:sz w:val="20"/>
+          <w:szCs w:val="20"/>
+        </w:rPr>
+        <w:t xml:space="preserve"> solo). Presioná CAPTURAR después de conectar y verificá que el número de variables configurado coincida con lo que envía el código.</w:t>
+      </w:r>
+    </w:p>
+    <w:p>
+      <w:pPr>
+        <w:pStyle w:val="Heading2"/>
+        <w:spacing w:after="140" w:before="300"/>
+      </w:pPr>
+      <w:r>
+        <w:rPr>
+          <w:rFonts w:ascii="Montserrat" w:cs="Montserrat" w:eastAsia="Montserrat" w:hAnsi="Montserrat"/>
+          <w:b/>
+          <w:bCs/>
+          <w:color w:val="000000"/>
+          <w:sz w:val="22"/>
+          <w:szCs w:val="22"/>
+        </w:rPr>
+        <w:t xml:space="preserve">Conexión Bluetooth</w:t>
       </w:r>
     </w:p>
     <w:p>
@@ -3385,15 +5262,31 @@
           <w:sz w:val="20"/>
           <w:szCs w:val="20"/>
         </w:rPr>
-        <w:t xml:space="preserve">Aviso de formato: </w:t>
-      </w:r>
-      <w:r>
-        <w:rPr>
-          <w:rFonts w:ascii="Montserrat" w:cs="Montserrat" w:eastAsia="Montserrat" w:hAnsi="Montserrat"/>
-          <w:sz w:val="20"/>
-          <w:szCs w:val="20"/>
-        </w:rPr>
-        <w:t xml:space="preserve">el número de valores por línea no coincide con el número de variables configurado. Ajustá NÚMERO DE VARIABLES o el programa.</w:t>
+        <w:t xml:space="preserve">No aparece en el selector: </w:t>
+      </w:r>
+      <w:r>
+        <w:rPr>
+          <w:rFonts w:ascii="Montserrat" w:cs="Montserrat" w:eastAsia="Montserrat" w:hAnsi="Montserrat"/>
+          <w:sz w:val="20"/>
+          <w:szCs w:val="20"/>
+        </w:rPr>
+        <w:t xml:space="preserve">el programa debe tener </w:t>
+      </w:r>
+      <w:r>
+        <w:rPr>
+          <w:rFonts w:ascii="Courier New" w:cs="Courier New" w:eastAsia="Courier New" w:hAnsi="Courier New"/>
+          <w:sz w:val="18"/>
+          <w:szCs w:val="18"/>
+        </w:rPr>
+        <w:t xml:space="preserve">bluetooth.startUartService()</w:t>
+      </w:r>
+      <w:r>
+        <w:rPr>
+          <w:rFonts w:ascii="Montserrat" w:cs="Montserrat" w:eastAsia="Montserrat" w:hAnsi="Montserrat"/>
+          <w:sz w:val="20"/>
+          <w:szCs w:val="20"/>
+        </w:rPr>
+        <w:t xml:space="preserve">. Reiniciá la micro:bit (botón RESET) y verificá que no esté conectada a otro dispositivo o celular.</w:t>
       </w:r>
     </w:p>
     <w:p>
@@ -3413,6 +5306,317 @@
           <w:sz w:val="20"/>
           <w:szCs w:val="20"/>
         </w:rPr>
+        <w:t xml:space="preserve">Aparece pero se queda en “Conectando…”: </w:t>
+      </w:r>
+      <w:r>
+        <w:rPr>
+          <w:rFonts w:ascii="Montserrat" w:cs="Montserrat" w:eastAsia="Montserrat" w:hAnsi="Montserrat"/>
+          <w:sz w:val="20"/>
+          <w:szCs w:val="20"/>
+        </w:rPr>
+        <w:t xml:space="preserve">falta </w:t>
+      </w:r>
+      <w:r>
+        <w:rPr>
+          <w:rFonts w:ascii="Montserrat" w:cs="Montserrat" w:eastAsia="Montserrat" w:hAnsi="Montserrat"/>
+          <w:b/>
+          <w:bCs/>
+          <w:sz w:val="20"/>
+          <w:szCs w:val="20"/>
+        </w:rPr>
+        <w:t xml:space="preserve">“No Pairing Required”</w:t>
+      </w:r>
+      <w:r>
+        <w:rPr>
+          <w:rFonts w:ascii="Montserrat" w:cs="Montserrat" w:eastAsia="Montserrat" w:hAnsi="Montserrat"/>
+          <w:sz w:val="20"/>
+          <w:szCs w:val="20"/>
+        </w:rPr>
+        <w:t xml:space="preserve"> en la configuración del proyecto de MakeCode (en </w:t>
+      </w:r>
+      <w:r>
+        <w:rPr>
+          <w:rFonts w:ascii="Courier New" w:cs="Courier New" w:eastAsia="Courier New" w:hAnsi="Courier New"/>
+          <w:sz w:val="18"/>
+          <w:szCs w:val="18"/>
+        </w:rPr>
+        <w:t xml:space="preserve">pxt.json</w:t>
+      </w:r>
+      <w:r>
+        <w:rPr>
+          <w:rFonts w:ascii="Montserrat" w:cs="Montserrat" w:eastAsia="Montserrat" w:hAnsi="Montserrat"/>
+          <w:sz w:val="20"/>
+          <w:szCs w:val="20"/>
+        </w:rPr>
+        <w:t xml:space="preserve"> debe estar </w:t>
+      </w:r>
+      <w:r>
+        <w:rPr>
+          <w:rFonts w:ascii="Courier New" w:cs="Courier New" w:eastAsia="Courier New" w:hAnsi="Courier New"/>
+          <w:sz w:val="18"/>
+          <w:szCs w:val="18"/>
+        </w:rPr>
+        <w:t xml:space="preserve">"pairing_mode": 0</w:t>
+      </w:r>
+      <w:r>
+        <w:rPr>
+          <w:rFonts w:ascii="Montserrat" w:cs="Montserrat" w:eastAsia="Montserrat" w:hAnsi="Montserrat"/>
+          <w:sz w:val="20"/>
+          <w:szCs w:val="20"/>
+        </w:rPr>
+        <w:t xml:space="preserve">). Corregí, volvé a descargar el .hex y reintentá.</w:t>
+      </w:r>
+    </w:p>
+    <w:p>
+      <w:pPr>
+        <w:pStyle w:val="ListParagraph"/>
+        <w:numPr>
+          <w:ilvl w:val="0"/>
+          <w:numId w:val="2"/>
+        </w:numPr>
+        <w:spacing w:after="80" w:line="280"/>
+      </w:pPr>
+      <w:r>
+        <w:rPr>
+          <w:rFonts w:ascii="Montserrat" w:cs="Montserrat" w:eastAsia="Montserrat" w:hAnsi="Montserrat"/>
+          <w:b/>
+          <w:bCs/>
+          <w:sz w:val="20"/>
+          <w:szCs w:val="20"/>
+        </w:rPr>
+        <w:t xml:space="preserve">Se conecta pero no llegan datos: </w:t>
+      </w:r>
+      <w:r>
+        <w:rPr>
+          <w:rFonts w:ascii="Montserrat" w:cs="Montserrat" w:eastAsia="Montserrat" w:hAnsi="Montserrat"/>
+          <w:sz w:val="20"/>
+          <w:szCs w:val="20"/>
+        </w:rPr>
+        <w:t xml:space="preserve">el programa debe usar </w:t>
+      </w:r>
+      <w:r>
+        <w:rPr>
+          <w:rFonts w:ascii="Courier New" w:cs="Courier New" w:eastAsia="Courier New" w:hAnsi="Courier New"/>
+          <w:sz w:val="18"/>
+          <w:szCs w:val="18"/>
+        </w:rPr>
+        <w:t xml:space="preserve">bluetooth.uartWriteLine()</w:t>
+      </w:r>
+      <w:r>
+        <w:rPr>
+          <w:rFonts w:ascii="Montserrat" w:cs="Montserrat" w:eastAsia="Montserrat" w:hAnsi="Montserrat"/>
+          <w:sz w:val="20"/>
+          <w:szCs w:val="20"/>
+        </w:rPr>
+        <w:t xml:space="preserve">. Presioná CAPTURAR después de conectar y verificá la casilla “Micro:bit envía timestamp”.</w:t>
+      </w:r>
+    </w:p>
+    <w:p>
+      <w:pPr>
+        <w:pStyle w:val="ListParagraph"/>
+        <w:numPr>
+          <w:ilvl w:val="0"/>
+          <w:numId w:val="2"/>
+        </w:numPr>
+        <w:spacing w:after="80" w:line="280"/>
+      </w:pPr>
+      <w:r>
+        <w:rPr>
+          <w:rFonts w:ascii="Montserrat" w:cs="Montserrat" w:eastAsia="Montserrat" w:hAnsi="Montserrat"/>
+          <w:b/>
+          <w:bCs/>
+          <w:sz w:val="20"/>
+          <w:szCs w:val="20"/>
+        </w:rPr>
+        <w:t xml:space="preserve">Error “UART no encontrado”: </w:t>
+      </w:r>
+      <w:r>
+        <w:rPr>
+          <w:rFonts w:ascii="Montserrat" w:cs="Montserrat" w:eastAsia="Montserrat" w:hAnsi="Montserrat"/>
+          <w:sz w:val="20"/>
+          <w:szCs w:val="20"/>
+        </w:rPr>
+        <w:t xml:space="preserve">al programa le falta </w:t>
+      </w:r>
+      <w:r>
+        <w:rPr>
+          <w:rFonts w:ascii="Courier New" w:cs="Courier New" w:eastAsia="Courier New" w:hAnsi="Courier New"/>
+          <w:sz w:val="18"/>
+          <w:szCs w:val="18"/>
+        </w:rPr>
+        <w:t xml:space="preserve">bluetooth.startUartService()</w:t>
+      </w:r>
+      <w:r>
+        <w:rPr>
+          <w:rFonts w:ascii="Montserrat" w:cs="Montserrat" w:eastAsia="Montserrat" w:hAnsi="Montserrat"/>
+          <w:sz w:val="20"/>
+          <w:szCs w:val="20"/>
+        </w:rPr>
+        <w:t xml:space="preserve">. Agregalo y volvé a grabar.</w:t>
+      </w:r>
+    </w:p>
+    <w:p>
+      <w:pPr>
+        <w:pStyle w:val="ListParagraph"/>
+        <w:numPr>
+          <w:ilvl w:val="0"/>
+          <w:numId w:val="2"/>
+        </w:numPr>
+        <w:spacing w:after="80" w:line="280"/>
+      </w:pPr>
+      <w:r>
+        <w:rPr>
+          <w:rFonts w:ascii="Montserrat" w:cs="Montserrat" w:eastAsia="Montserrat" w:hAnsi="Montserrat"/>
+          <w:b/>
+          <w:bCs/>
+          <w:sz w:val="20"/>
+          <w:szCs w:val="20"/>
+        </w:rPr>
+        <w:t xml:space="preserve">Error “Not supported” o conexión rara: </w:t>
+      </w:r>
+      <w:r>
+        <w:rPr>
+          <w:rFonts w:ascii="Montserrat" w:cs="Montserrat" w:eastAsia="Montserrat" w:hAnsi="Montserrat"/>
+          <w:sz w:val="20"/>
+          <w:szCs w:val="20"/>
+        </w:rPr>
+        <w:t xml:space="preserve">caché Bluetooth corrupto del navegador. Entrá a </w:t>
+      </w:r>
+      <w:r>
+        <w:rPr>
+          <w:rFonts w:ascii="Courier New" w:cs="Courier New" w:eastAsia="Courier New" w:hAnsi="Courier New"/>
+          <w:sz w:val="18"/>
+          <w:szCs w:val="18"/>
+        </w:rPr>
+        <w:t xml:space="preserve">chrome://bluetooth-internals</w:t>
+      </w:r>
+      <w:r>
+        <w:rPr>
+          <w:rFonts w:ascii="Montserrat" w:cs="Montserrat" w:eastAsia="Montserrat" w:hAnsi="Montserrat"/>
+          <w:sz w:val="20"/>
+          <w:szCs w:val="20"/>
+        </w:rPr>
+        <w:t xml:space="preserve"> → Devices → olvidá la micro:bit y reconectá. En macOS, quitala también de Preferencias del Sistema → Bluetooth.</w:t>
+      </w:r>
+    </w:p>
+    <w:p>
+      <w:pPr>
+        <w:pStyle w:val="ListParagraph"/>
+        <w:numPr>
+          <w:ilvl w:val="0"/>
+          <w:numId w:val="2"/>
+        </w:numPr>
+        <w:spacing w:after="80" w:line="280"/>
+      </w:pPr>
+      <w:r>
+        <w:rPr>
+          <w:rFonts w:ascii="Montserrat" w:cs="Montserrat" w:eastAsia="Montserrat" w:hAnsi="Montserrat"/>
+          <w:b/>
+          <w:bCs/>
+          <w:sz w:val="20"/>
+          <w:szCs w:val="20"/>
+        </w:rPr>
+        <w:t xml:space="preserve">Se desconecta seguido: </w:t>
+      </w:r>
+      <w:r>
+        <w:rPr>
+          <w:rFonts w:ascii="Montserrat" w:cs="Montserrat" w:eastAsia="Montserrat" w:hAnsi="Montserrat"/>
+          <w:sz w:val="20"/>
+          <w:szCs w:val="20"/>
+        </w:rPr>
+        <w:t xml:space="preserve">acercá la micro:bit (~10 m máximo) y revisá la batería. La plataforma reconecta sola hasta 4 veces.</w:t>
+      </w:r>
+    </w:p>
+    <w:p>
+      <w:pPr>
+        <w:pStyle w:val="ListParagraph"/>
+        <w:numPr>
+          <w:ilvl w:val="0"/>
+          <w:numId w:val="2"/>
+        </w:numPr>
+        <w:spacing w:after="80" w:line="280"/>
+      </w:pPr>
+      <w:r>
+        <w:rPr>
+          <w:rFonts w:ascii="Montserrat" w:cs="Montserrat" w:eastAsia="Montserrat" w:hAnsi="Montserrat"/>
+          <w:b/>
+          <w:bCs/>
+          <w:sz w:val="20"/>
+          <w:szCs w:val="20"/>
+        </w:rPr>
+        <w:t xml:space="preserve">No funciona en iPhone/iPad: </w:t>
+      </w:r>
+      <w:r>
+        <w:rPr>
+          <w:rFonts w:ascii="Montserrat" w:cs="Montserrat" w:eastAsia="Montserrat" w:hAnsi="Montserrat"/>
+          <w:sz w:val="20"/>
+          <w:szCs w:val="20"/>
+        </w:rPr>
+        <w:t xml:space="preserve">Apple no permite Web Bluetooth ni Web Serial en iOS. Usá Chrome o Edge en computadora o Android; en iPad podés cargar datos por CSV.</w:t>
+      </w:r>
+    </w:p>
+    <w:p>
+      <w:pPr>
+        <w:pStyle w:val="Heading2"/>
+        <w:spacing w:after="140" w:before="300"/>
+      </w:pPr>
+      <w:r>
+        <w:rPr>
+          <w:rFonts w:ascii="Montserrat" w:cs="Montserrat" w:eastAsia="Montserrat" w:hAnsi="Montserrat"/>
+          <w:b/>
+          <w:bCs/>
+          <w:color w:val="000000"/>
+          <w:sz w:val="22"/>
+          <w:szCs w:val="22"/>
+        </w:rPr>
+        <w:t xml:space="preserve">Datos</w:t>
+      </w:r>
+    </w:p>
+    <w:p>
+      <w:pPr>
+        <w:pStyle w:val="ListParagraph"/>
+        <w:numPr>
+          <w:ilvl w:val="0"/>
+          <w:numId w:val="2"/>
+        </w:numPr>
+        <w:spacing w:after="80" w:line="280"/>
+      </w:pPr>
+      <w:r>
+        <w:rPr>
+          <w:rFonts w:ascii="Montserrat" w:cs="Montserrat" w:eastAsia="Montserrat" w:hAnsi="Montserrat"/>
+          <w:b/>
+          <w:bCs/>
+          <w:sz w:val="20"/>
+          <w:szCs w:val="20"/>
+        </w:rPr>
+        <w:t xml:space="preserve">Aviso de formato: </w:t>
+      </w:r>
+      <w:r>
+        <w:rPr>
+          <w:rFonts w:ascii="Montserrat" w:cs="Montserrat" w:eastAsia="Montserrat" w:hAnsi="Montserrat"/>
+          <w:sz w:val="20"/>
+          <w:szCs w:val="20"/>
+        </w:rPr>
+        <w:t xml:space="preserve">el número de valores por línea no coincide con el número de variables configurado. Ajustá NÚMERO DE VARIABLES o el programa.</w:t>
+      </w:r>
+    </w:p>
+    <w:p>
+      <w:pPr>
+        <w:pStyle w:val="ListParagraph"/>
+        <w:numPr>
+          <w:ilvl w:val="0"/>
+          <w:numId w:val="2"/>
+        </w:numPr>
+        <w:spacing w:after="80" w:line="280"/>
+      </w:pPr>
+      <w:r>
+        <w:rPr>
+          <w:rFonts w:ascii="Montserrat" w:cs="Montserrat" w:eastAsia="Montserrat" w:hAnsi="Montserrat"/>
+          <w:b/>
+          <w:bCs/>
+          <w:sz w:val="20"/>
+          <w:szCs w:val="20"/>
+        </w:rPr>
         <w:t xml:space="preserve">Datos con saltos de tiempo: </w:t>
       </w:r>
       <w:r>
@@ -3438,6 +5642,52 @@
           <w:szCs w:val="20"/>
         </w:rPr>
         <w:t xml:space="preserve"> en el programa; el reloj del navegador tiene resolución limitada (~16 ms).</w:t>
+      </w:r>
+    </w:p>
+    <w:p>
+      <w:pPr>
+        <w:pStyle w:val="ListParagraph"/>
+        <w:numPr>
+          <w:ilvl w:val="0"/>
+          <w:numId w:val="2"/>
+        </w:numPr>
+        <w:spacing w:after="80" w:line="280"/>
+      </w:pPr>
+      <w:r>
+        <w:rPr>
+          <w:rFonts w:ascii="Montserrat" w:cs="Montserrat" w:eastAsia="Montserrat" w:hAnsi="Montserrat"/>
+          <w:b/>
+          <w:bCs/>
+          <w:sz w:val="20"/>
+          <w:szCs w:val="20"/>
+        </w:rPr>
+        <w:t xml:space="preserve">Datos con picos (spikes): </w:t>
+      </w:r>
+      <w:r>
+        <w:rPr>
+          <w:rFonts w:ascii="Montserrat" w:cs="Montserrat" w:eastAsia="Montserrat" w:hAnsi="Montserrat"/>
+          <w:sz w:val="20"/>
+          <w:szCs w:val="20"/>
+        </w:rPr>
+        <w:t xml:space="preserve">activá el </w:t>
+      </w:r>
+      <w:r>
+        <w:rPr>
+          <w:rFonts w:ascii="Montserrat" w:cs="Montserrat" w:eastAsia="Montserrat" w:hAnsi="Montserrat"/>
+          <w:b/>
+          <w:bCs/>
+          <w:sz w:val="20"/>
+          <w:szCs w:val="20"/>
+        </w:rPr>
+        <w:t xml:space="preserve">Filtro de picos</w:t>
+      </w:r>
+      <w:r>
+        <w:rPr>
+          <w:rFonts w:ascii="Montserrat" w:cs="Montserrat" w:eastAsia="Montserrat" w:hAnsi="Montserrat"/>
+          <w:sz w:val="20"/>
+          <w:szCs w:val="20"/>
+        </w:rPr>
+        <w:t xml:space="preserve"> en la sección VARIABLES; si persiste, bajá la velocidad de envío.</w:t>
       </w:r>
     </w:p>
     <w:p>

</xml_diff>

<commit_message>
Guía 1: glosario, notas al pie y recuadros '¿Cómo funciona?' para hacerla autocontenida
Pensado para docentes de física sin bagaje informático:
- 12 notas al pie que definen cada término técnico en su primera
  aparición (timestamp, Web Serial/Bluetooth, lote, baudios, scheduler,
  Hz, WebUSB, .hex, UART, emparejamiento, pxt.json, CSV).
- Tres recuadros '¿CÓMO FUNCIONA?' con banda negra de título: la
  comunicación serial por USB, qué pasa al presionar Descargar en
  MakeCode (compilación a .hex y grabado en flash), y el UART sobre BLE
  (intervalos de conexión, notificaciones de 20 bytes, ráfagas).
- Sección 13 · GLOSARIO: 22 términos en tabla alfabética, enlazada con
  hipervínculo interno desde la introducción.

Co-Authored-By: Claude Fable 5 <noreply@anthropic.com>
Claude-Session: https://claude.ai/code/session_01QWAyZdE9BkJvizLVTZzmVb
</commit_message>
<xml_diff>
--- a/manuales/Manual-1-Captura-1-variable-timestamp.docx
+++ b/manuales/Manual-1-Captura-1-variable-timestamp.docx
@@ -166,7 +166,43 @@
           <w:sz w:val="20"/>
           <w:szCs w:val="20"/>
         </w:rPr>
-        <w:t xml:space="preserve">Esta guía recorre, paso a paso, el uso básico de la plataforma micro:bit DataLab Pro con el flujo más común: capturar datos de una sola variable enviados por la micro:bit junto con su timestamp (marca de tiempo), y luego aplicar un procesamiento básico a esos datos.</w:t>
+        <w:t xml:space="preserve">Esta guía recorre, paso a paso, el uso básico de la plataforma micro:bit DataLab Pro con el flujo más común: capturar datos de una sola variable enviados por la micro:bit junto con su timestamp</w:t>
+      </w:r>
+      <w:r>
+        <w:rPr>
+          <w:rStyle w:val="FootnoteReference"/>
+        </w:rPr>
+        <w:footnoteReference w:id="1"/>
+      </w:r>
+      <w:r>
+        <w:rPr>
+          <w:rFonts w:ascii="Montserrat" w:cs="Montserrat" w:eastAsia="Montserrat" w:hAnsi="Montserrat"/>
+          <w:sz w:val="20"/>
+          <w:szCs w:val="20"/>
+        </w:rPr>
+        <w:t xml:space="preserve"> (marca de tiempo), y luego aplicar un procesamiento básico a esos datos. Los términos técnicos llevan una nota al pie la primera vez que aparecen y están reunidos al final, en el </w:t>
+      </w:r>
+      <w:hyperlink w:history="1" w:anchor="glosario">
+        <w:r>
+          <w:rPr>
+            <w:rFonts w:ascii="Montserrat" w:cs="Montserrat" w:eastAsia="Montserrat" w:hAnsi="Montserrat"/>
+            <w:b/>
+            <w:bCs/>
+            <w:color w:val="000000"/>
+            <w:sz w:val="20"/>
+            <w:szCs w:val="20"/>
+            <w:u w:val="single"/>
+          </w:rPr>
+          <w:t xml:space="preserve">Glosario (sección 13)</w:t>
+        </w:r>
+      </w:hyperlink>
+      <w:r>
+        <w:rPr>
+          <w:rFonts w:ascii="Montserrat" w:cs="Montserrat" w:eastAsia="Montserrat" w:hAnsi="Montserrat"/>
+          <w:sz w:val="20"/>
+          <w:szCs w:val="20"/>
+        </w:rPr>
+        <w:t xml:space="preserve">.</w:t>
       </w:r>
     </w:p>
     <w:p>
@@ -356,7 +392,21 @@
           <w:sz w:val="20"/>
           <w:szCs w:val="20"/>
         </w:rPr>
-        <w:t xml:space="preserve"> en computadora o Android. Ni Web Serial ni Web Bluetooth funcionan en iOS/iPadOS.</w:t>
+        <w:t xml:space="preserve"> en computadora o Android. Ni Web Serial ni Web Bluetooth</w:t>
+      </w:r>
+      <w:r>
+        <w:rPr>
+          <w:rStyle w:val="FootnoteReference"/>
+        </w:rPr>
+        <w:footnoteReference w:id="2"/>
+      </w:r>
+      <w:r>
+        <w:rPr>
+          <w:rFonts w:ascii="Montserrat" w:cs="Montserrat" w:eastAsia="Montserrat" w:hAnsi="Montserrat"/>
+          <w:sz w:val="20"/>
+          <w:szCs w:val="20"/>
+        </w:rPr>
+        <w:t xml:space="preserve"> funcionan en iOS/iPadOS.</w:t>
       </w:r>
     </w:p>
     <w:p>
@@ -1319,6 +1369,12 @@
       </w:r>
       <w:r>
         <w:rPr>
+          <w:rStyle w:val="FootnoteReference"/>
+        </w:rPr>
+        <w:footnoteReference w:id="3"/>
+      </w:r>
+      <w:r>
+        <w:rPr>
           <w:rFonts w:ascii="Montserrat" w:cs="Montserrat" w:eastAsia="Montserrat" w:hAnsi="Montserrat"/>
           <w:sz w:val="20"/>
           <w:szCs w:val="20"/>
@@ -1924,6 +1980,39 @@
     </w:p>
     <w:p>
       <w:pPr>
+        <w:shd w:fill="000000" w:val="clear"/>
+        <w:spacing w:after="0" w:before="200"/>
+        <w:ind w:left="120" w:right="120"/>
+      </w:pPr>
+      <w:r>
+        <w:rPr>
+          <w:rFonts w:ascii="Montserrat" w:cs="Montserrat" w:eastAsia="Montserrat" w:hAnsi="Montserrat"/>
+          <w:b/>
+          <w:bCs/>
+          <w:color w:val="FFFFFF"/>
+          <w:sz w:val="18"/>
+          <w:szCs w:val="18"/>
+        </w:rPr>
+        <w:t xml:space="preserve">¿CÓMO FUNCIONA?  ·  LA COMUNICACIÓN SERIAL POR USB</w:t>
+      </w:r>
+    </w:p>
+    <w:p>
+      <w:pPr>
+        <w:shd w:fill="F5F5F5" w:val="clear"/>
+        <w:spacing w:after="240" w:before="0" w:line="290"/>
+        <w:ind w:left="120" w:right="120"/>
+      </w:pPr>
+      <w:r>
+        <w:rPr>
+          <w:rFonts w:ascii="Montserrat" w:cs="Montserrat" w:eastAsia="Montserrat" w:hAnsi="Montserrat"/>
+          <w:sz w:val="20"/>
+          <w:szCs w:val="20"/>
+        </w:rPr>
+        <w:t xml:space="preserve">La micro:bit convierte cada línea de texto en una secuencia de bytes que viaja por el cable. Del lado de la computadora, el navegador la recibe mediante Web Serial y la entrega a la plataforma, que corta el flujo en líneas (por el salto de línea) y en columnas (por las comas). Es el mismo mecanismo de los viejos puertos serie de PC: simple, robusto y con latencia baja y pareja. A 115200 baudios viajan unos 11.500 caracteres por segundo — muchísimo más de lo que el programa llega a generar.</w:t>
+      </w:r>
+    </w:p>
+    <w:p>
+      <w:pPr>
         <w:pStyle w:val="Heading2"/>
         <w:spacing w:after="140" w:before="300"/>
       </w:pPr>
@@ -1949,7 +2038,21 @@
           <w:sz w:val="20"/>
           <w:szCs w:val="20"/>
         </w:rPr>
-        <w:t xml:space="preserve">El límite de velocidad no lo pone el puerto (115200 baudios ≈ 11.500 caracteres/segundo) sino el </w:t>
+        <w:t xml:space="preserve">El límite de velocidad no lo pone el puerto (115200 baudios</w:t>
+      </w:r>
+      <w:r>
+        <w:rPr>
+          <w:rStyle w:val="FootnoteReference"/>
+        </w:rPr>
+        <w:footnoteReference w:id="4"/>
+      </w:r>
+      <w:r>
+        <w:rPr>
+          <w:rFonts w:ascii="Montserrat" w:cs="Montserrat" w:eastAsia="Montserrat" w:hAnsi="Montserrat"/>
+          <w:sz w:val="20"/>
+          <w:szCs w:val="20"/>
+        </w:rPr>
+        <w:t xml:space="preserve"> ≈ 11.500 caracteres/segundo) sino el </w:t>
       </w:r>
       <w:r>
         <w:rPr>
@@ -1960,6 +2063,12 @@
           <w:szCs w:val="20"/>
         </w:rPr>
         <w:t xml:space="preserve">scheduler de MakeCode</w:t>
+      </w:r>
+      <w:r>
+        <w:rPr>
+          <w:rStyle w:val="FootnoteReference"/>
+        </w:rPr>
+        <w:footnoteReference w:id="5"/>
       </w:r>
       <w:r>
         <w:rPr>
@@ -1999,7 +2108,21 @@
           <w:sz w:val="20"/>
           <w:szCs w:val="20"/>
         </w:rPr>
-        <w:t xml:space="preserve"> se obtienen ~8 Hz reales, y aunque saques la pausa, </w:t>
+        <w:t xml:space="preserve"> se obtienen ~8 Hz</w:t>
+      </w:r>
+      <w:r>
+        <w:rPr>
+          <w:rStyle w:val="FootnoteReference"/>
+        </w:rPr>
+        <w:footnoteReference w:id="6"/>
+      </w:r>
+      <w:r>
+        <w:rPr>
+          <w:rFonts w:ascii="Montserrat" w:cs="Montserrat" w:eastAsia="Montserrat" w:hAnsi="Montserrat"/>
+          <w:sz w:val="20"/>
+          <w:szCs w:val="20"/>
+        </w:rPr>
+        <w:t xml:space="preserve"> reales, y aunque saques la pausa, </w:t>
       </w:r>
       <w:r>
         <w:rPr>
@@ -2765,6 +2888,12 @@
       </w:r>
       <w:r>
         <w:rPr>
+          <w:rStyle w:val="FootnoteReference"/>
+        </w:rPr>
+        <w:footnoteReference w:id="7"/>
+      </w:r>
+      <w:r>
+        <w:rPr>
           <w:rFonts w:ascii="Montserrat" w:cs="Montserrat" w:eastAsia="Montserrat" w:hAnsi="Montserrat"/>
           <w:sz w:val="20"/>
           <w:szCs w:val="20"/>
@@ -2781,6 +2910,12 @@
       </w:r>
       <w:r>
         <w:rPr>
+          <w:rStyle w:val="FootnoteReference"/>
+        </w:rPr>
+        <w:footnoteReference w:id="8"/>
+      </w:r>
+      <w:r>
+        <w:rPr>
           <w:rFonts w:ascii="Montserrat" w:cs="Montserrat" w:eastAsia="Montserrat" w:hAnsi="Montserrat"/>
           <w:sz w:val="20"/>
           <w:szCs w:val="20"/>
@@ -2828,6 +2963,39 @@
           <w:szCs w:val="20"/>
         </w:rPr>
         <w:t xml:space="preserve">Esperá a que la luz naranja del reverso deje de parpadear: el programa ya está corriendo.</w:t>
+      </w:r>
+    </w:p>
+    <w:p>
+      <w:pPr>
+        <w:shd w:fill="000000" w:val="clear"/>
+        <w:spacing w:after="0" w:before="200"/>
+        <w:ind w:left="120" w:right="120"/>
+      </w:pPr>
+      <w:r>
+        <w:rPr>
+          <w:rFonts w:ascii="Montserrat" w:cs="Montserrat" w:eastAsia="Montserrat" w:hAnsi="Montserrat"/>
+          <w:b/>
+          <w:bCs/>
+          <w:color w:val="FFFFFF"/>
+          <w:sz w:val="18"/>
+          <w:szCs w:val="18"/>
+        </w:rPr>
+        <w:t xml:space="preserve">¿CÓMO FUNCIONA?  ·  QUÉ PASA AL PRESIONAR “DESCARGAR”</w:t>
+      </w:r>
+    </w:p>
+    <w:p>
+      <w:pPr>
+        <w:shd w:fill="F5F5F5" w:val="clear"/>
+        <w:spacing w:after="240" w:before="0" w:line="290"/>
+        <w:ind w:left="120" w:right="120"/>
+      </w:pPr>
+      <w:r>
+        <w:rPr>
+          <w:rFonts w:ascii="Montserrat" w:cs="Montserrat" w:eastAsia="Montserrat" w:hAnsi="Montserrat"/>
+          <w:sz w:val="20"/>
+          <w:szCs w:val="20"/>
+        </w:rPr>
+        <w:t xml:space="preserve">MakeCode compila tu programa (bloques o JavaScript) junto con su sistema de ejecución y lo empaqueta en un único archivo .hex: una imagen de la memoria del microcontrolador. La micro:bit tiene un segundo chip dedicado a la interfaz USB que, al recibir ese archivo, lo graba en la memoria flash del chip principal (la luz naranja parpadea mientras tanto). Desde entonces el programa corre solo cada vez que la placa recibe energía: no necesita la computadora ni MakeCode para funcionar.</w:t>
       </w:r>
     </w:p>
     <w:p>
@@ -3060,7 +3228,31 @@
           <w:sz w:val="20"/>
           <w:szCs w:val="20"/>
         </w:rPr>
-        <w:t xml:space="preserve">UART sobre Bluetooth Low Energy</w:t>
+        <w:t xml:space="preserve">UART</w:t>
+      </w:r>
+      <w:r>
+        <w:rPr>
+          <w:rStyle w:val="FootnoteReference"/>
+        </w:rPr>
+        <w:footnoteReference w:id="9"/>
+      </w:r>
+      <w:r>
+        <w:rPr>
+          <w:rFonts w:ascii="Montserrat" w:cs="Montserrat" w:eastAsia="Montserrat" w:hAnsi="Montserrat"/>
+          <w:sz w:val="20"/>
+          <w:szCs w:val="20"/>
+        </w:rPr>
+        <w:t xml:space="preserve"> sobre </w:t>
+      </w:r>
+      <w:r>
+        <w:rPr>
+          <w:rFonts w:ascii="Montserrat" w:cs="Montserrat" w:eastAsia="Montserrat" w:hAnsi="Montserrat"/>
+          <w:b/>
+          <w:bCs/>
+          <w:sz w:val="20"/>
+          <w:szCs w:val="20"/>
+        </w:rPr>
+        <w:t xml:space="preserve">Bluetooth Low Energy</w:t>
       </w:r>
       <w:r>
         <w:rPr>
@@ -3241,7 +3433,21 @@
           <w:sz w:val="20"/>
           <w:szCs w:val="20"/>
         </w:rPr>
-        <w:t xml:space="preserve">. Guardá. Sin esto, Chrome/Edge suelen quedarse en “Conectando…”: la micro:bit pide un emparejamiento que el navegador no completa.</w:t>
+        <w:t xml:space="preserve">. Guardá. Sin esto, Chrome/Edge suelen quedarse en “Conectando…”: la micro:bit pide un emparejamiento</w:t>
+      </w:r>
+      <w:r>
+        <w:rPr>
+          <w:rStyle w:val="FootnoteReference"/>
+        </w:rPr>
+        <w:footnoteReference w:id="10"/>
+      </w:r>
+      <w:r>
+        <w:rPr>
+          <w:rFonts w:ascii="Montserrat" w:cs="Montserrat" w:eastAsia="Montserrat" w:hAnsi="Montserrat"/>
+          <w:sz w:val="20"/>
+          <w:szCs w:val="20"/>
+        </w:rPr>
+        <w:t xml:space="preserve"> que el navegador no completa.</w:t>
       </w:r>
     </w:p>
     <w:p>
@@ -3274,6 +3480,12 @@
           <w:szCs w:val="18"/>
         </w:rPr>
         <w:t xml:space="preserve">pxt.json</w:t>
+      </w:r>
+      <w:r>
+        <w:rPr>
+          <w:rStyle w:val="FootnoteReference"/>
+        </w:rPr>
+        <w:footnoteReference w:id="11"/>
       </w:r>
       <w:r>
         <w:rPr>
@@ -3914,6 +4126,39 @@
           <w:szCs w:val="20"/>
         </w:rPr>
         <w:t xml:space="preserve">.</w:t>
+      </w:r>
+    </w:p>
+    <w:p>
+      <w:pPr>
+        <w:shd w:fill="000000" w:val="clear"/>
+        <w:spacing w:after="0" w:before="200"/>
+        <w:ind w:left="120" w:right="120"/>
+      </w:pPr>
+      <w:r>
+        <w:rPr>
+          <w:rFonts w:ascii="Montserrat" w:cs="Montserrat" w:eastAsia="Montserrat" w:hAnsi="Montserrat"/>
+          <w:b/>
+          <w:bCs/>
+          <w:color w:val="FFFFFF"/>
+          <w:sz w:val="18"/>
+          <w:szCs w:val="18"/>
+        </w:rPr>
+        <w:t xml:space="preserve">¿CÓMO FUNCIONA?  ·  EL UART SOBRE BLUETOOTH LOW ENERGY</w:t>
+      </w:r>
+    </w:p>
+    <w:p>
+      <w:pPr>
+        <w:shd w:fill="F5F5F5" w:val="clear"/>
+        <w:spacing w:after="240" w:before="0" w:line="290"/>
+        <w:ind w:left="120" w:right="120"/>
+      </w:pPr>
+      <w:r>
+        <w:rPr>
+          <w:rFonts w:ascii="Montserrat" w:cs="Montserrat" w:eastAsia="Montserrat" w:hAnsi="Montserrat"/>
+          <w:sz w:val="20"/>
+          <w:szCs w:val="20"/>
+        </w:rPr>
+        <w:t xml:space="preserve">BLE está pensado para gastar poca energía: la radio no transmite continuo sino en ventanas breves acordadas entre los dos equipos (el intervalo de conexión, típicamente 30–50 ms). El servicio UART simula un puerto serie sobre ese esquema: la micro:bit acumula los caracteres y los envía en paquetes (notificaciones) de hasta 20 bytes cuando se abre la ventana. Por eso los datos llegan en ráfagas y la latencia varía punto a punto — y por eso el timestamp lo pone la micro:bit, no el navegador.</w:t>
       </w:r>
     </w:p>
     <w:p>
@@ -5902,6 +6147,12 @@
       </w:r>
       <w:r>
         <w:rPr>
+          <w:rStyle w:val="FootnoteReference"/>
+        </w:rPr>
+        <w:footnoteReference w:id="12"/>
+      </w:r>
+      <w:r>
+        <w:rPr>
           <w:rFonts w:ascii="Montserrat" w:cs="Montserrat" w:eastAsia="Montserrat" w:hAnsi="Montserrat"/>
           <w:sz w:val="20"/>
           <w:szCs w:val="20"/>
@@ -6711,6 +6962,1441 @@
         <w:t xml:space="preserve"> dentro de la plataforma, con tutoriales completos de conexión, código para 2 y 3 variables y solución de problemas.</w:t>
       </w:r>
     </w:p>
+    <w:p>
+      <w:pPr>
+        <w:pStyle w:val="Heading1"/>
+        <w:pBdr>
+          <w:bottom w:val="single" w:color="000000" w:sz="18" w:space="4"/>
+        </w:pBdr>
+        <w:spacing w:after="200" w:before="420"/>
+      </w:pPr>
+      <w:bookmarkStart w:name="glosario" w:id="104"/>
+      <w:r>
+        <w:rPr>
+          <w:rFonts w:ascii="Montserrat" w:cs="Montserrat" w:eastAsia="Montserrat" w:hAnsi="Montserrat"/>
+          <w:b/>
+          <w:bCs/>
+          <w:color w:val="000000"/>
+          <w:sz w:val="26"/>
+          <w:szCs w:val="26"/>
+        </w:rPr>
+        <w:t xml:space="preserve">13 · GLOSARIO</w:t>
+      </w:r>
+      <w:bookmarkEnd w:id="104"/>
+    </w:p>
+    <w:p>
+      <w:pPr>
+        <w:spacing w:after="140" w:line="300"/>
+      </w:pPr>
+      <w:r>
+        <w:rPr>
+          <w:rFonts w:ascii="Montserrat" w:cs="Montserrat" w:eastAsia="Montserrat" w:hAnsi="Montserrat"/>
+          <w:sz w:val="20"/>
+          <w:szCs w:val="20"/>
+        </w:rPr>
+        <w:t xml:space="preserve">Los términos técnicos usados en esta guía, en orden alfabético.</w:t>
+      </w:r>
+    </w:p>
+    <w:tbl>
+      <w:tblPr>
+        <w:tblW w:type="dxa" w:w="9072"/>
+        <w:tblBorders>
+          <w:top w:val="single" w:color="000000" w:sz="8"/>
+          <w:left w:val="none" w:color="FFFFFF" w:sz="0"/>
+          <w:bottom w:val="single" w:color="000000" w:sz="8"/>
+          <w:right w:val="none" w:color="FFFFFF" w:sz="0"/>
+          <w:insideH w:val="single" w:color="CCCCCC" w:sz="4"/>
+          <w:insideV w:val="single" w:color="CCCCCC" w:sz="4"/>
+        </w:tblBorders>
+      </w:tblPr>
+      <w:tblGrid>
+        <w:gridCol w:w="2600"/>
+        <w:gridCol w:w="6472"/>
+      </w:tblGrid>
+      <w:tr>
+        <w:trPr>
+          <w:tblHeader/>
+        </w:trPr>
+        <w:tc>
+          <w:tcPr>
+            <w:tcW w:type="dxa" w:w="2600"/>
+            <w:shd w:fill="000000" w:val="clear"/>
+            <w:tcMar>
+              <w:top w:type="dxa" w:w="80"/>
+              <w:left w:type="dxa" w:w="120"/>
+              <w:bottom w:type="dxa" w:w="80"/>
+              <w:right w:type="dxa" w:w="120"/>
+            </w:tcMar>
+            <w:vAlign w:val="center"/>
+          </w:tcPr>
+          <w:p>
+            <w:pPr>
+              <w:spacing w:after="0" w:line="264"/>
+            </w:pPr>
+            <w:r>
+              <w:rPr>
+                <w:rFonts w:ascii="Montserrat" w:cs="Montserrat" w:eastAsia="Montserrat" w:hAnsi="Montserrat"/>
+                <w:b/>
+                <w:bCs/>
+                <w:color w:val="FFFFFF"/>
+                <w:sz w:val="18"/>
+                <w:szCs w:val="18"/>
+              </w:rPr>
+              <w:t xml:space="preserve">Término</w:t>
+            </w:r>
+          </w:p>
+        </w:tc>
+        <w:tc>
+          <w:tcPr>
+            <w:tcW w:type="dxa" w:w="6472"/>
+            <w:shd w:fill="000000" w:val="clear"/>
+            <w:tcMar>
+              <w:top w:type="dxa" w:w="80"/>
+              <w:left w:type="dxa" w:w="120"/>
+              <w:bottom w:type="dxa" w:w="80"/>
+              <w:right w:type="dxa" w:w="120"/>
+            </w:tcMar>
+            <w:vAlign w:val="center"/>
+          </w:tcPr>
+          <w:p>
+            <w:pPr>
+              <w:spacing w:after="0" w:line="264"/>
+            </w:pPr>
+            <w:r>
+              <w:rPr>
+                <w:rFonts w:ascii="Montserrat" w:cs="Montserrat" w:eastAsia="Montserrat" w:hAnsi="Montserrat"/>
+                <w:b/>
+                <w:bCs/>
+                <w:color w:val="FFFFFF"/>
+                <w:sz w:val="18"/>
+                <w:szCs w:val="18"/>
+              </w:rPr>
+              <w:t xml:space="preserve">Qué significa</w:t>
+            </w:r>
+          </w:p>
+        </w:tc>
+      </w:tr>
+      <w:tr>
+        <w:tc>
+          <w:tcPr>
+            <w:tcW w:type="dxa" w:w="2600"/>
+            <w:shd w:fill="FFFFFF" w:val="clear"/>
+            <w:tcMar>
+              <w:top w:type="dxa" w:w="80"/>
+              <w:left w:type="dxa" w:w="120"/>
+              <w:bottom w:type="dxa" w:w="80"/>
+              <w:right w:type="dxa" w:w="120"/>
+            </w:tcMar>
+            <w:vAlign w:val="center"/>
+          </w:tcPr>
+          <w:p>
+            <w:pPr>
+              <w:spacing w:after="0" w:line="264"/>
+            </w:pPr>
+            <w:r>
+              <w:rPr>
+                <w:rFonts w:ascii="Montserrat" w:cs="Montserrat" w:eastAsia="Montserrat" w:hAnsi="Montserrat"/>
+                <w:b w:val="false"/>
+                <w:bCs w:val="false"/>
+                <w:color w:val="000000"/>
+                <w:sz w:val="18"/>
+                <w:szCs w:val="18"/>
+              </w:rPr>
+              <w:t xml:space="preserve">Baudios</w:t>
+            </w:r>
+          </w:p>
+        </w:tc>
+        <w:tc>
+          <w:tcPr>
+            <w:tcW w:type="dxa" w:w="6472"/>
+            <w:shd w:fill="FFFFFF" w:val="clear"/>
+            <w:tcMar>
+              <w:top w:type="dxa" w:w="80"/>
+              <w:left w:type="dxa" w:w="120"/>
+              <w:bottom w:type="dxa" w:w="80"/>
+              <w:right w:type="dxa" w:w="120"/>
+            </w:tcMar>
+            <w:vAlign w:val="center"/>
+          </w:tcPr>
+          <w:p>
+            <w:pPr>
+              <w:spacing w:after="0" w:line="264"/>
+            </w:pPr>
+            <w:r>
+              <w:rPr>
+                <w:rFonts w:ascii="Montserrat" w:cs="Montserrat" w:eastAsia="Montserrat" w:hAnsi="Montserrat"/>
+                <w:b w:val="false"/>
+                <w:bCs w:val="false"/>
+                <w:color w:val="000000"/>
+                <w:sz w:val="18"/>
+                <w:szCs w:val="18"/>
+              </w:rPr>
+              <w:t xml:space="preserve">Unidad de velocidad de un puerto serial: símbolos por segundo. A 115200 baudios viajan ~11.500 caracteres por segundo. La plataforma lo configura sola.</w:t>
+            </w:r>
+          </w:p>
+        </w:tc>
+      </w:tr>
+      <w:tr>
+        <w:tc>
+          <w:tcPr>
+            <w:tcW w:type="dxa" w:w="2600"/>
+            <w:shd w:fill="FFFFFF" w:val="clear"/>
+            <w:tcMar>
+              <w:top w:type="dxa" w:w="80"/>
+              <w:left w:type="dxa" w:w="120"/>
+              <w:bottom w:type="dxa" w:w="80"/>
+              <w:right w:type="dxa" w:w="120"/>
+            </w:tcMar>
+            <w:vAlign w:val="center"/>
+          </w:tcPr>
+          <w:p>
+            <w:pPr>
+              <w:spacing w:after="0" w:line="264"/>
+            </w:pPr>
+            <w:r>
+              <w:rPr>
+                <w:rFonts w:ascii="Montserrat" w:cs="Montserrat" w:eastAsia="Montserrat" w:hAnsi="Montserrat"/>
+                <w:b w:val="false"/>
+                <w:bCs w:val="false"/>
+                <w:color w:val="000000"/>
+                <w:sz w:val="18"/>
+                <w:szCs w:val="18"/>
+              </w:rPr>
+              <w:t xml:space="preserve">BLE (Bluetooth Low Energy)</w:t>
+            </w:r>
+          </w:p>
+        </w:tc>
+        <w:tc>
+          <w:tcPr>
+            <w:tcW w:type="dxa" w:w="6472"/>
+            <w:shd w:fill="FFFFFF" w:val="clear"/>
+            <w:tcMar>
+              <w:top w:type="dxa" w:w="80"/>
+              <w:left w:type="dxa" w:w="120"/>
+              <w:bottom w:type="dxa" w:w="80"/>
+              <w:right w:type="dxa" w:w="120"/>
+            </w:tcMar>
+            <w:vAlign w:val="center"/>
+          </w:tcPr>
+          <w:p>
+            <w:pPr>
+              <w:spacing w:after="0" w:line="264"/>
+            </w:pPr>
+            <w:r>
+              <w:rPr>
+                <w:rFonts w:ascii="Montserrat" w:cs="Montserrat" w:eastAsia="Montserrat" w:hAnsi="Montserrat"/>
+                <w:b w:val="false"/>
+                <w:bCs w:val="false"/>
+                <w:color w:val="000000"/>
+                <w:sz w:val="18"/>
+                <w:szCs w:val="18"/>
+              </w:rPr>
+              <w:t xml:space="preserve">Variante del Bluetooth diseñada para consumir poca energía: transmite en ventanas breves en lugar de mantener la radio siempre encendida. Es el Bluetooth de la micro:bit.</w:t>
+            </w:r>
+          </w:p>
+        </w:tc>
+      </w:tr>
+      <w:tr>
+        <w:tc>
+          <w:tcPr>
+            <w:tcW w:type="dxa" w:w="2600"/>
+            <w:shd w:fill="FFFFFF" w:val="clear"/>
+            <w:tcMar>
+              <w:top w:type="dxa" w:w="80"/>
+              <w:left w:type="dxa" w:w="120"/>
+              <w:bottom w:type="dxa" w:w="80"/>
+              <w:right w:type="dxa" w:w="120"/>
+            </w:tcMar>
+            <w:vAlign w:val="center"/>
+          </w:tcPr>
+          <w:p>
+            <w:pPr>
+              <w:spacing w:after="0" w:line="264"/>
+            </w:pPr>
+            <w:r>
+              <w:rPr>
+                <w:rFonts w:ascii="Montserrat" w:cs="Montserrat" w:eastAsia="Montserrat" w:hAnsi="Montserrat"/>
+                <w:b w:val="false"/>
+                <w:bCs w:val="false"/>
+                <w:color w:val="000000"/>
+                <w:sz w:val="18"/>
+                <w:szCs w:val="18"/>
+              </w:rPr>
+              <w:t xml:space="preserve">CSV</w:t>
+            </w:r>
+          </w:p>
+        </w:tc>
+        <w:tc>
+          <w:tcPr>
+            <w:tcW w:type="dxa" w:w="6472"/>
+            <w:shd w:fill="FFFFFF" w:val="clear"/>
+            <w:tcMar>
+              <w:top w:type="dxa" w:w="80"/>
+              <w:left w:type="dxa" w:w="120"/>
+              <w:bottom w:type="dxa" w:w="80"/>
+              <w:right w:type="dxa" w:w="120"/>
+            </w:tcMar>
+            <w:vAlign w:val="center"/>
+          </w:tcPr>
+          <w:p>
+            <w:pPr>
+              <w:spacing w:after="0" w:line="264"/>
+            </w:pPr>
+            <w:r>
+              <w:rPr>
+                <w:rFonts w:ascii="Montserrat" w:cs="Montserrat" w:eastAsia="Montserrat" w:hAnsi="Montserrat"/>
+                <w:b w:val="false"/>
+                <w:bCs w:val="false"/>
+                <w:color w:val="000000"/>
+                <w:sz w:val="18"/>
+                <w:szCs w:val="18"/>
+              </w:rPr>
+              <w:t xml:space="preserve">Formato de texto plano para tablas: una fila por línea, columnas separadas por comas (comma-separated values). Lo abren Excel, LibreOffice, GeoGebra y Python sin conversión.</w:t>
+            </w:r>
+          </w:p>
+        </w:tc>
+      </w:tr>
+      <w:tr>
+        <w:tc>
+          <w:tcPr>
+            <w:tcW w:type="dxa" w:w="2600"/>
+            <w:shd w:fill="FFFFFF" w:val="clear"/>
+            <w:tcMar>
+              <w:top w:type="dxa" w:w="80"/>
+              <w:left w:type="dxa" w:w="120"/>
+              <w:bottom w:type="dxa" w:w="80"/>
+              <w:right w:type="dxa" w:w="120"/>
+            </w:tcMar>
+            <w:vAlign w:val="center"/>
+          </w:tcPr>
+          <w:p>
+            <w:pPr>
+              <w:spacing w:after="0" w:line="264"/>
+            </w:pPr>
+            <w:r>
+              <w:rPr>
+                <w:rFonts w:ascii="Montserrat" w:cs="Montserrat" w:eastAsia="Montserrat" w:hAnsi="Montserrat"/>
+                <w:b w:val="false"/>
+                <w:bCs w:val="false"/>
+                <w:color w:val="000000"/>
+                <w:sz w:val="18"/>
+                <w:szCs w:val="18"/>
+              </w:rPr>
+              <w:t xml:space="preserve">Emparejamiento (pairing)</w:t>
+            </w:r>
+          </w:p>
+        </w:tc>
+        <w:tc>
+          <w:tcPr>
+            <w:tcW w:type="dxa" w:w="6472"/>
+            <w:shd w:fill="FFFFFF" w:val="clear"/>
+            <w:tcMar>
+              <w:top w:type="dxa" w:w="80"/>
+              <w:left w:type="dxa" w:w="120"/>
+              <w:bottom w:type="dxa" w:w="80"/>
+              <w:right w:type="dxa" w:w="120"/>
+            </w:tcMar>
+            <w:vAlign w:val="center"/>
+          </w:tcPr>
+          <w:p>
+            <w:pPr>
+              <w:spacing w:after="0" w:line="264"/>
+            </w:pPr>
+            <w:r>
+              <w:rPr>
+                <w:rFonts w:ascii="Montserrat" w:cs="Montserrat" w:eastAsia="Montserrat" w:hAnsi="Montserrat"/>
+                <w:b w:val="false"/>
+                <w:bCs w:val="false"/>
+                <w:color w:val="000000"/>
+                <w:sz w:val="18"/>
+                <w:szCs w:val="18"/>
+              </w:rPr>
+              <w:t xml:space="preserve">Procedimiento de “presentación” entre dos equipos Bluetooth, a veces con PIN. La opción JustWorks (“No Pairing Required”) lo omite: cualquiera puede conectarse, ideal para el aula.</w:t>
+            </w:r>
+          </w:p>
+        </w:tc>
+      </w:tr>
+      <w:tr>
+        <w:tc>
+          <w:tcPr>
+            <w:tcW w:type="dxa" w:w="2600"/>
+            <w:shd w:fill="FFFFFF" w:val="clear"/>
+            <w:tcMar>
+              <w:top w:type="dxa" w:w="80"/>
+              <w:left w:type="dxa" w:w="120"/>
+              <w:bottom w:type="dxa" w:w="80"/>
+              <w:right w:type="dxa" w:w="120"/>
+            </w:tcMar>
+            <w:vAlign w:val="center"/>
+          </w:tcPr>
+          <w:p>
+            <w:pPr>
+              <w:spacing w:after="0" w:line="264"/>
+            </w:pPr>
+            <w:r>
+              <w:rPr>
+                <w:rFonts w:ascii="Montserrat" w:cs="Montserrat" w:eastAsia="Montserrat" w:hAnsi="Montserrat"/>
+                <w:b w:val="false"/>
+                <w:bCs w:val="false"/>
+                <w:color w:val="000000"/>
+                <w:sz w:val="18"/>
+                <w:szCs w:val="18"/>
+              </w:rPr>
+              <w:t xml:space="preserve">everyInterval</w:t>
+            </w:r>
+          </w:p>
+        </w:tc>
+        <w:tc>
+          <w:tcPr>
+            <w:tcW w:type="dxa" w:w="6472"/>
+            <w:shd w:fill="FFFFFF" w:val="clear"/>
+            <w:tcMar>
+              <w:top w:type="dxa" w:w="80"/>
+              <w:left w:type="dxa" w:w="120"/>
+              <w:bottom w:type="dxa" w:w="80"/>
+              <w:right w:type="dxa" w:w="120"/>
+            </w:tcMar>
+            <w:vAlign w:val="center"/>
+          </w:tcPr>
+          <w:p>
+            <w:pPr>
+              <w:spacing w:after="0" w:line="264"/>
+            </w:pPr>
+            <w:r>
+              <w:rPr>
+                <w:rFonts w:ascii="Montserrat" w:cs="Montserrat" w:eastAsia="Montserrat" w:hAnsi="Montserrat"/>
+                <w:b w:val="false"/>
+                <w:bCs w:val="false"/>
+                <w:color w:val="000000"/>
+                <w:sz w:val="18"/>
+                <w:szCs w:val="18"/>
+              </w:rPr>
+              <w:t xml:space="preserve">Bloque de MakeCode que ejecuta código cada N milisegundos exactos, sin el sobrecosto de forever. Es la vía para llegar a ~100 Hz.</w:t>
+            </w:r>
+          </w:p>
+        </w:tc>
+      </w:tr>
+      <w:tr>
+        <w:tc>
+          <w:tcPr>
+            <w:tcW w:type="dxa" w:w="2600"/>
+            <w:shd w:fill="FFFFFF" w:val="clear"/>
+            <w:tcMar>
+              <w:top w:type="dxa" w:w="80"/>
+              <w:left w:type="dxa" w:w="120"/>
+              <w:bottom w:type="dxa" w:w="80"/>
+              <w:right w:type="dxa" w:w="120"/>
+            </w:tcMar>
+            <w:vAlign w:val="center"/>
+          </w:tcPr>
+          <w:p>
+            <w:pPr>
+              <w:spacing w:after="0" w:line="264"/>
+            </w:pPr>
+            <w:r>
+              <w:rPr>
+                <w:rFonts w:ascii="Montserrat" w:cs="Montserrat" w:eastAsia="Montserrat" w:hAnsi="Montserrat"/>
+                <w:b w:val="false"/>
+                <w:bCs w:val="false"/>
+                <w:color w:val="000000"/>
+                <w:sz w:val="18"/>
+                <w:szCs w:val="18"/>
+              </w:rPr>
+              <w:t xml:space="preserve">Extensión (MakeCode)</w:t>
+            </w:r>
+          </w:p>
+        </w:tc>
+        <w:tc>
+          <w:tcPr>
+            <w:tcW w:type="dxa" w:w="6472"/>
+            <w:shd w:fill="FFFFFF" w:val="clear"/>
+            <w:tcMar>
+              <w:top w:type="dxa" w:w="80"/>
+              <w:left w:type="dxa" w:w="120"/>
+              <w:bottom w:type="dxa" w:w="80"/>
+              <w:right w:type="dxa" w:w="120"/>
+            </w:tcMar>
+            <w:vAlign w:val="center"/>
+          </w:tcPr>
+          <w:p>
+            <w:pPr>
+              <w:spacing w:after="0" w:line="264"/>
+            </w:pPr>
+            <w:r>
+              <w:rPr>
+                <w:rFonts w:ascii="Montserrat" w:cs="Montserrat" w:eastAsia="Montserrat" w:hAnsi="Montserrat"/>
+                <w:b w:val="false"/>
+                <w:bCs w:val="false"/>
+                <w:color w:val="000000"/>
+                <w:sz w:val="18"/>
+                <w:szCs w:val="18"/>
+              </w:rPr>
+              <w:t xml:space="preserve">Paquete de bloques adicionales que se agrega a un proyecto (menú Extensiones). La extensión bluetooth agrega los bloques BLE y reemplaza a radio.</w:t>
+            </w:r>
+          </w:p>
+        </w:tc>
+      </w:tr>
+      <w:tr>
+        <w:tc>
+          <w:tcPr>
+            <w:tcW w:type="dxa" w:w="2600"/>
+            <w:shd w:fill="FFFFFF" w:val="clear"/>
+            <w:tcMar>
+              <w:top w:type="dxa" w:w="80"/>
+              <w:left w:type="dxa" w:w="120"/>
+              <w:bottom w:type="dxa" w:w="80"/>
+              <w:right w:type="dxa" w:w="120"/>
+            </w:tcMar>
+            <w:vAlign w:val="center"/>
+          </w:tcPr>
+          <w:p>
+            <w:pPr>
+              <w:spacing w:after="0" w:line="264"/>
+            </w:pPr>
+            <w:r>
+              <w:rPr>
+                <w:rFonts w:ascii="Montserrat" w:cs="Montserrat" w:eastAsia="Montserrat" w:hAnsi="Montserrat"/>
+                <w:b w:val="false"/>
+                <w:bCs w:val="false"/>
+                <w:color w:val="000000"/>
+                <w:sz w:val="18"/>
+                <w:szCs w:val="18"/>
+              </w:rPr>
+              <w:t xml:space="preserve">forever</w:t>
+            </w:r>
+          </w:p>
+        </w:tc>
+        <w:tc>
+          <w:tcPr>
+            <w:tcW w:type="dxa" w:w="6472"/>
+            <w:shd w:fill="FFFFFF" w:val="clear"/>
+            <w:tcMar>
+              <w:top w:type="dxa" w:w="80"/>
+              <w:left w:type="dxa" w:w="120"/>
+              <w:bottom w:type="dxa" w:w="80"/>
+              <w:right w:type="dxa" w:w="120"/>
+            </w:tcMar>
+            <w:vAlign w:val="center"/>
+          </w:tcPr>
+          <w:p>
+            <w:pPr>
+              <w:spacing w:after="0" w:line="264"/>
+            </w:pPr>
+            <w:r>
+              <w:rPr>
+                <w:rFonts w:ascii="Montserrat" w:cs="Montserrat" w:eastAsia="Montserrat" w:hAnsi="Montserrat"/>
+                <w:b w:val="false"/>
+                <w:bCs w:val="false"/>
+                <w:color w:val="000000"/>
+                <w:sz w:val="18"/>
+                <w:szCs w:val="18"/>
+              </w:rPr>
+              <w:t xml:space="preserve">Bloque de MakeCode que repite su contenido indefinidamente. Cada vuelta agrega ~20 ms ocultos, lo que limita la frecuencia real de muestreo.</w:t>
+            </w:r>
+          </w:p>
+        </w:tc>
+      </w:tr>
+      <w:tr>
+        <w:tc>
+          <w:tcPr>
+            <w:tcW w:type="dxa" w:w="2600"/>
+            <w:shd w:fill="FFFFFF" w:val="clear"/>
+            <w:tcMar>
+              <w:top w:type="dxa" w:w="80"/>
+              <w:left w:type="dxa" w:w="120"/>
+              <w:bottom w:type="dxa" w:w="80"/>
+              <w:right w:type="dxa" w:w="120"/>
+            </w:tcMar>
+            <w:vAlign w:val="center"/>
+          </w:tcPr>
+          <w:p>
+            <w:pPr>
+              <w:spacing w:after="0" w:line="264"/>
+            </w:pPr>
+            <w:r>
+              <w:rPr>
+                <w:rFonts w:ascii="Montserrat" w:cs="Montserrat" w:eastAsia="Montserrat" w:hAnsi="Montserrat"/>
+                <w:b w:val="false"/>
+                <w:bCs w:val="false"/>
+                <w:color w:val="000000"/>
+                <w:sz w:val="18"/>
+                <w:szCs w:val="18"/>
+              </w:rPr>
+              <w:t xml:space="preserve">.hex (archivo)</w:t>
+            </w:r>
+          </w:p>
+        </w:tc>
+        <w:tc>
+          <w:tcPr>
+            <w:tcW w:type="dxa" w:w="6472"/>
+            <w:shd w:fill="FFFFFF" w:val="clear"/>
+            <w:tcMar>
+              <w:top w:type="dxa" w:w="80"/>
+              <w:left w:type="dxa" w:w="120"/>
+              <w:bottom w:type="dxa" w:w="80"/>
+              <w:right w:type="dxa" w:w="120"/>
+            </w:tcMar>
+            <w:vAlign w:val="center"/>
+          </w:tcPr>
+          <w:p>
+            <w:pPr>
+              <w:spacing w:after="0" w:line="264"/>
+            </w:pPr>
+            <w:r>
+              <w:rPr>
+                <w:rFonts w:ascii="Montserrat" w:cs="Montserrat" w:eastAsia="Montserrat" w:hAnsi="Montserrat"/>
+                <w:b w:val="false"/>
+                <w:bCs w:val="false"/>
+                <w:color w:val="000000"/>
+                <w:sz w:val="18"/>
+                <w:szCs w:val="18"/>
+              </w:rPr>
+              <w:t xml:space="preserve">Imagen compilada del programa que se graba en la memoria de la micro:bit. Contiene el código y su sistema de ejecución; la placa lo corre sola al encender.</w:t>
+            </w:r>
+          </w:p>
+        </w:tc>
+      </w:tr>
+      <w:tr>
+        <w:tc>
+          <w:tcPr>
+            <w:tcW w:type="dxa" w:w="2600"/>
+            <w:shd w:fill="FFFFFF" w:val="clear"/>
+            <w:tcMar>
+              <w:top w:type="dxa" w:w="80"/>
+              <w:left w:type="dxa" w:w="120"/>
+              <w:bottom w:type="dxa" w:w="80"/>
+              <w:right w:type="dxa" w:w="120"/>
+            </w:tcMar>
+            <w:vAlign w:val="center"/>
+          </w:tcPr>
+          <w:p>
+            <w:pPr>
+              <w:spacing w:after="0" w:line="264"/>
+            </w:pPr>
+            <w:r>
+              <w:rPr>
+                <w:rFonts w:ascii="Montserrat" w:cs="Montserrat" w:eastAsia="Montserrat" w:hAnsi="Montserrat"/>
+                <w:b w:val="false"/>
+                <w:bCs w:val="false"/>
+                <w:color w:val="000000"/>
+                <w:sz w:val="18"/>
+                <w:szCs w:val="18"/>
+              </w:rPr>
+              <w:t xml:space="preserve">Hz (hertz)</w:t>
+            </w:r>
+          </w:p>
+        </w:tc>
+        <w:tc>
+          <w:tcPr>
+            <w:tcW w:type="dxa" w:w="6472"/>
+            <w:shd w:fill="FFFFFF" w:val="clear"/>
+            <w:tcMar>
+              <w:top w:type="dxa" w:w="80"/>
+              <w:left w:type="dxa" w:w="120"/>
+              <w:bottom w:type="dxa" w:w="80"/>
+              <w:right w:type="dxa" w:w="120"/>
+            </w:tcMar>
+            <w:vAlign w:val="center"/>
+          </w:tcPr>
+          <w:p>
+            <w:pPr>
+              <w:spacing w:after="0" w:line="264"/>
+            </w:pPr>
+            <w:r>
+              <w:rPr>
+                <w:rFonts w:ascii="Montserrat" w:cs="Montserrat" w:eastAsia="Montserrat" w:hAnsi="Montserrat"/>
+                <w:b w:val="false"/>
+                <w:bCs w:val="false"/>
+                <w:color w:val="000000"/>
+                <w:sz w:val="18"/>
+                <w:szCs w:val="18"/>
+              </w:rPr>
+              <w:t xml:space="preserve">Mediciones por segundo. 10 Hz = un dato cada 100 ms. En esta guía siempre refiere a la frecuencia de muestreo del sensor.</w:t>
+            </w:r>
+          </w:p>
+        </w:tc>
+      </w:tr>
+      <w:tr>
+        <w:tc>
+          <w:tcPr>
+            <w:tcW w:type="dxa" w:w="2600"/>
+            <w:shd w:fill="FFFFFF" w:val="clear"/>
+            <w:tcMar>
+              <w:top w:type="dxa" w:w="80"/>
+              <w:left w:type="dxa" w:w="120"/>
+              <w:bottom w:type="dxa" w:w="80"/>
+              <w:right w:type="dxa" w:w="120"/>
+            </w:tcMar>
+            <w:vAlign w:val="center"/>
+          </w:tcPr>
+          <w:p>
+            <w:pPr>
+              <w:spacing w:after="0" w:line="264"/>
+            </w:pPr>
+            <w:r>
+              <w:rPr>
+                <w:rFonts w:ascii="Montserrat" w:cs="Montserrat" w:eastAsia="Montserrat" w:hAnsi="Montserrat"/>
+                <w:b w:val="false"/>
+                <w:bCs w:val="false"/>
+                <w:color w:val="000000"/>
+                <w:sz w:val="18"/>
+                <w:szCs w:val="18"/>
+              </w:rPr>
+              <w:t xml:space="preserve">Intervalo de conexión</w:t>
+            </w:r>
+          </w:p>
+        </w:tc>
+        <w:tc>
+          <w:tcPr>
+            <w:tcW w:type="dxa" w:w="6472"/>
+            <w:shd w:fill="FFFFFF" w:val="clear"/>
+            <w:tcMar>
+              <w:top w:type="dxa" w:w="80"/>
+              <w:left w:type="dxa" w:w="120"/>
+              <w:bottom w:type="dxa" w:w="80"/>
+              <w:right w:type="dxa" w:w="120"/>
+            </w:tcMar>
+            <w:vAlign w:val="center"/>
+          </w:tcPr>
+          <w:p>
+            <w:pPr>
+              <w:spacing w:after="0" w:line="264"/>
+            </w:pPr>
+            <w:r>
+              <w:rPr>
+                <w:rFonts w:ascii="Montserrat" w:cs="Montserrat" w:eastAsia="Montserrat" w:hAnsi="Montserrat"/>
+                <w:b w:val="false"/>
+                <w:bCs w:val="false"/>
+                <w:color w:val="000000"/>
+                <w:sz w:val="18"/>
+                <w:szCs w:val="18"/>
+              </w:rPr>
+              <w:t xml:space="preserve">En BLE, el período acordado entre los dos equipos para intercambiar datos (típico: 30–50 ms). Define el “ritmo” al que llegan las ráfagas.</w:t>
+            </w:r>
+          </w:p>
+        </w:tc>
+      </w:tr>
+      <w:tr>
+        <w:tc>
+          <w:tcPr>
+            <w:tcW w:type="dxa" w:w="2600"/>
+            <w:shd w:fill="FFFFFF" w:val="clear"/>
+            <w:tcMar>
+              <w:top w:type="dxa" w:w="80"/>
+              <w:left w:type="dxa" w:w="120"/>
+              <w:bottom w:type="dxa" w:w="80"/>
+              <w:right w:type="dxa" w:w="120"/>
+            </w:tcMar>
+            <w:vAlign w:val="center"/>
+          </w:tcPr>
+          <w:p>
+            <w:pPr>
+              <w:spacing w:after="0" w:line="264"/>
+            </w:pPr>
+            <w:r>
+              <w:rPr>
+                <w:rFonts w:ascii="Montserrat" w:cs="Montserrat" w:eastAsia="Montserrat" w:hAnsi="Montserrat"/>
+                <w:b w:val="false"/>
+                <w:bCs w:val="false"/>
+                <w:color w:val="000000"/>
+                <w:sz w:val="18"/>
+                <w:szCs w:val="18"/>
+              </w:rPr>
+              <w:t xml:space="preserve">Latencia</w:t>
+            </w:r>
+          </w:p>
+        </w:tc>
+        <w:tc>
+          <w:tcPr>
+            <w:tcW w:type="dxa" w:w="6472"/>
+            <w:shd w:fill="FFFFFF" w:val="clear"/>
+            <w:tcMar>
+              <w:top w:type="dxa" w:w="80"/>
+              <w:left w:type="dxa" w:w="120"/>
+              <w:bottom w:type="dxa" w:w="80"/>
+              <w:right w:type="dxa" w:w="120"/>
+            </w:tcMar>
+            <w:vAlign w:val="center"/>
+          </w:tcPr>
+          <w:p>
+            <w:pPr>
+              <w:spacing w:after="0" w:line="264"/>
+            </w:pPr>
+            <w:r>
+              <w:rPr>
+                <w:rFonts w:ascii="Montserrat" w:cs="Montserrat" w:eastAsia="Montserrat" w:hAnsi="Montserrat"/>
+                <w:b w:val="false"/>
+                <w:bCs w:val="false"/>
+                <w:color w:val="000000"/>
+                <w:sz w:val="18"/>
+                <w:szCs w:val="18"/>
+              </w:rPr>
+              <w:t xml:space="preserve">Tiempo entre que la micro:bit mide un dato y la plataforma lo recibe. En USB es baja y estable; en BLE es variable porque los datos esperan a la próxima ventana de radio.</w:t>
+            </w:r>
+          </w:p>
+        </w:tc>
+      </w:tr>
+      <w:tr>
+        <w:tc>
+          <w:tcPr>
+            <w:tcW w:type="dxa" w:w="2600"/>
+            <w:shd w:fill="FFFFFF" w:val="clear"/>
+            <w:tcMar>
+              <w:top w:type="dxa" w:w="80"/>
+              <w:left w:type="dxa" w:w="120"/>
+              <w:bottom w:type="dxa" w:w="80"/>
+              <w:right w:type="dxa" w:w="120"/>
+            </w:tcMar>
+            <w:vAlign w:val="center"/>
+          </w:tcPr>
+          <w:p>
+            <w:pPr>
+              <w:spacing w:after="0" w:line="264"/>
+            </w:pPr>
+            <w:r>
+              <w:rPr>
+                <w:rFonts w:ascii="Montserrat" w:cs="Montserrat" w:eastAsia="Montserrat" w:hAnsi="Montserrat"/>
+                <w:b w:val="false"/>
+                <w:bCs w:val="false"/>
+                <w:color w:val="000000"/>
+                <w:sz w:val="18"/>
+                <w:szCs w:val="18"/>
+              </w:rPr>
+              <w:t xml:space="preserve">Lote (batch)</w:t>
+            </w:r>
+          </w:p>
+        </w:tc>
+        <w:tc>
+          <w:tcPr>
+            <w:tcW w:type="dxa" w:w="6472"/>
+            <w:shd w:fill="FFFFFF" w:val="clear"/>
+            <w:tcMar>
+              <w:top w:type="dxa" w:w="80"/>
+              <w:left w:type="dxa" w:w="120"/>
+              <w:bottom w:type="dxa" w:w="80"/>
+              <w:right w:type="dxa" w:w="120"/>
+            </w:tcMar>
+            <w:vAlign w:val="center"/>
+          </w:tcPr>
+          <w:p>
+            <w:pPr>
+              <w:spacing w:after="0" w:line="264"/>
+            </w:pPr>
+            <w:r>
+              <w:rPr>
+                <w:rFonts w:ascii="Montserrat" w:cs="Montserrat" w:eastAsia="Montserrat" w:hAnsi="Montserrat"/>
+                <w:b w:val="false"/>
+                <w:bCs w:val="false"/>
+                <w:color w:val="000000"/>
+                <w:sz w:val="18"/>
+                <w:szCs w:val="18"/>
+              </w:rPr>
+              <w:t xml:space="preserve">Grupo de datos que llega junto al navegador en una sola entrega. Sin timestamp de la micro:bit, todos los puntos de un lote quedarían con la misma hora.</w:t>
+            </w:r>
+          </w:p>
+        </w:tc>
+      </w:tr>
+      <w:tr>
+        <w:tc>
+          <w:tcPr>
+            <w:tcW w:type="dxa" w:w="2600"/>
+            <w:shd w:fill="FFFFFF" w:val="clear"/>
+            <w:tcMar>
+              <w:top w:type="dxa" w:w="80"/>
+              <w:left w:type="dxa" w:w="120"/>
+              <w:bottom w:type="dxa" w:w="80"/>
+              <w:right w:type="dxa" w:w="120"/>
+            </w:tcMar>
+            <w:vAlign w:val="center"/>
+          </w:tcPr>
+          <w:p>
+            <w:pPr>
+              <w:spacing w:after="0" w:line="264"/>
+            </w:pPr>
+            <w:r>
+              <w:rPr>
+                <w:rFonts w:ascii="Montserrat" w:cs="Montserrat" w:eastAsia="Montserrat" w:hAnsi="Montserrat"/>
+                <w:b w:val="false"/>
+                <w:bCs w:val="false"/>
+                <w:color w:val="000000"/>
+                <w:sz w:val="18"/>
+                <w:szCs w:val="18"/>
+              </w:rPr>
+              <w:t xml:space="preserve">MakeCode</w:t>
+            </w:r>
+          </w:p>
+        </w:tc>
+        <w:tc>
+          <w:tcPr>
+            <w:tcW w:type="dxa" w:w="6472"/>
+            <w:shd w:fill="FFFFFF" w:val="clear"/>
+            <w:tcMar>
+              <w:top w:type="dxa" w:w="80"/>
+              <w:left w:type="dxa" w:w="120"/>
+              <w:bottom w:type="dxa" w:w="80"/>
+              <w:right w:type="dxa" w:w="120"/>
+            </w:tcMar>
+            <w:vAlign w:val="center"/>
+          </w:tcPr>
+          <w:p>
+            <w:pPr>
+              <w:spacing w:after="0" w:line="264"/>
+            </w:pPr>
+            <w:r>
+              <w:rPr>
+                <w:rFonts w:ascii="Montserrat" w:cs="Montserrat" w:eastAsia="Montserrat" w:hAnsi="Montserrat"/>
+                <w:b w:val="false"/>
+                <w:bCs w:val="false"/>
+                <w:color w:val="000000"/>
+                <w:sz w:val="18"/>
+                <w:szCs w:val="18"/>
+              </w:rPr>
+              <w:t xml:space="preserve">Editor de programación de la micro:bit (makecode.microbit.org). Funciona en el navegador, en bloques o JavaScript, y compila el programa a un archivo .hex.</w:t>
+            </w:r>
+          </w:p>
+        </w:tc>
+      </w:tr>
+      <w:tr>
+        <w:tc>
+          <w:tcPr>
+            <w:tcW w:type="dxa" w:w="2600"/>
+            <w:shd w:fill="FFFFFF" w:val="clear"/>
+            <w:tcMar>
+              <w:top w:type="dxa" w:w="80"/>
+              <w:left w:type="dxa" w:w="120"/>
+              <w:bottom w:type="dxa" w:w="80"/>
+              <w:right w:type="dxa" w:w="120"/>
+            </w:tcMar>
+            <w:vAlign w:val="center"/>
+          </w:tcPr>
+          <w:p>
+            <w:pPr>
+              <w:spacing w:after="0" w:line="264"/>
+            </w:pPr>
+            <w:r>
+              <w:rPr>
+                <w:rFonts w:ascii="Montserrat" w:cs="Montserrat" w:eastAsia="Montserrat" w:hAnsi="Montserrat"/>
+                <w:b w:val="false"/>
+                <w:bCs w:val="false"/>
+                <w:color w:val="000000"/>
+                <w:sz w:val="18"/>
+                <w:szCs w:val="18"/>
+              </w:rPr>
+              <w:t xml:space="preserve">Notificación BLE</w:t>
+            </w:r>
+          </w:p>
+        </w:tc>
+        <w:tc>
+          <w:tcPr>
+            <w:tcW w:type="dxa" w:w="6472"/>
+            <w:shd w:fill="FFFFFF" w:val="clear"/>
+            <w:tcMar>
+              <w:top w:type="dxa" w:w="80"/>
+              <w:left w:type="dxa" w:w="120"/>
+              <w:bottom w:type="dxa" w:w="80"/>
+              <w:right w:type="dxa" w:w="120"/>
+            </w:tcMar>
+            <w:vAlign w:val="center"/>
+          </w:tcPr>
+          <w:p>
+            <w:pPr>
+              <w:spacing w:after="0" w:line="264"/>
+            </w:pPr>
+            <w:r>
+              <w:rPr>
+                <w:rFonts w:ascii="Montserrat" w:cs="Montserrat" w:eastAsia="Montserrat" w:hAnsi="Montserrat"/>
+                <w:b w:val="false"/>
+                <w:bCs w:val="false"/>
+                <w:color w:val="000000"/>
+                <w:sz w:val="18"/>
+                <w:szCs w:val="18"/>
+              </w:rPr>
+              <w:t xml:space="preserve">Paquete de hasta 20 bytes con el que el servicio UART envía datos por Bluetooth. Una línea larga puede repartirse en varias notificaciones.</w:t>
+            </w:r>
+          </w:p>
+        </w:tc>
+      </w:tr>
+      <w:tr>
+        <w:tc>
+          <w:tcPr>
+            <w:tcW w:type="dxa" w:w="2600"/>
+            <w:shd w:fill="FFFFFF" w:val="clear"/>
+            <w:tcMar>
+              <w:top w:type="dxa" w:w="80"/>
+              <w:left w:type="dxa" w:w="120"/>
+              <w:bottom w:type="dxa" w:w="80"/>
+              <w:right w:type="dxa" w:w="120"/>
+            </w:tcMar>
+            <w:vAlign w:val="center"/>
+          </w:tcPr>
+          <w:p>
+            <w:pPr>
+              <w:spacing w:after="0" w:line="264"/>
+            </w:pPr>
+            <w:r>
+              <w:rPr>
+                <w:rFonts w:ascii="Montserrat" w:cs="Montserrat" w:eastAsia="Montserrat" w:hAnsi="Montserrat"/>
+                <w:b w:val="false"/>
+                <w:bCs w:val="false"/>
+                <w:color w:val="000000"/>
+                <w:sz w:val="18"/>
+                <w:szCs w:val="18"/>
+              </w:rPr>
+              <w:t xml:space="preserve">Puerto serial</w:t>
+            </w:r>
+          </w:p>
+        </w:tc>
+        <w:tc>
+          <w:tcPr>
+            <w:tcW w:type="dxa" w:w="6472"/>
+            <w:shd w:fill="FFFFFF" w:val="clear"/>
+            <w:tcMar>
+              <w:top w:type="dxa" w:w="80"/>
+              <w:left w:type="dxa" w:w="120"/>
+              <w:bottom w:type="dxa" w:w="80"/>
+              <w:right w:type="dxa" w:w="120"/>
+            </w:tcMar>
+            <w:vAlign w:val="center"/>
+          </w:tcPr>
+          <w:p>
+            <w:pPr>
+              <w:spacing w:after="0" w:line="264"/>
+            </w:pPr>
+            <w:r>
+              <w:rPr>
+                <w:rFonts w:ascii="Montserrat" w:cs="Montserrat" w:eastAsia="Montserrat" w:hAnsi="Montserrat"/>
+                <w:b w:val="false"/>
+                <w:bCs w:val="false"/>
+                <w:color w:val="000000"/>
+                <w:sz w:val="18"/>
+                <w:szCs w:val="18"/>
+              </w:rPr>
+              <w:t xml:space="preserve">Canal de comunicación que envía los bytes uno tras otro por un mismo hilo. La micro:bit lo ofrece a través del cable USB; el navegador lo lee con Web Serial.</w:t>
+            </w:r>
+          </w:p>
+        </w:tc>
+      </w:tr>
+      <w:tr>
+        <w:tc>
+          <w:tcPr>
+            <w:tcW w:type="dxa" w:w="2600"/>
+            <w:shd w:fill="FFFFFF" w:val="clear"/>
+            <w:tcMar>
+              <w:top w:type="dxa" w:w="80"/>
+              <w:left w:type="dxa" w:w="120"/>
+              <w:bottom w:type="dxa" w:w="80"/>
+              <w:right w:type="dxa" w:w="120"/>
+            </w:tcMar>
+            <w:vAlign w:val="center"/>
+          </w:tcPr>
+          <w:p>
+            <w:pPr>
+              <w:spacing w:after="0" w:line="264"/>
+            </w:pPr>
+            <w:r>
+              <w:rPr>
+                <w:rFonts w:ascii="Montserrat" w:cs="Montserrat" w:eastAsia="Montserrat" w:hAnsi="Montserrat"/>
+                <w:b w:val="false"/>
+                <w:bCs w:val="false"/>
+                <w:color w:val="000000"/>
+                <w:sz w:val="18"/>
+                <w:szCs w:val="18"/>
+              </w:rPr>
+              <w:t xml:space="preserve">pxt.json</w:t>
+            </w:r>
+          </w:p>
+        </w:tc>
+        <w:tc>
+          <w:tcPr>
+            <w:tcW w:type="dxa" w:w="6472"/>
+            <w:shd w:fill="FFFFFF" w:val="clear"/>
+            <w:tcMar>
+              <w:top w:type="dxa" w:w="80"/>
+              <w:left w:type="dxa" w:w="120"/>
+              <w:bottom w:type="dxa" w:w="80"/>
+              <w:right w:type="dxa" w:w="120"/>
+            </w:tcMar>
+            <w:vAlign w:val="center"/>
+          </w:tcPr>
+          <w:p>
+            <w:pPr>
+              <w:spacing w:after="0" w:line="264"/>
+            </w:pPr>
+            <w:r>
+              <w:rPr>
+                <w:rFonts w:ascii="Montserrat" w:cs="Montserrat" w:eastAsia="Montserrat" w:hAnsi="Montserrat"/>
+                <w:b w:val="false"/>
+                <w:bCs w:val="false"/>
+                <w:color w:val="000000"/>
+                <w:sz w:val="18"/>
+                <w:szCs w:val="18"/>
+              </w:rPr>
+              <w:t xml:space="preserve">Archivo de configuración del proyecto MakeCode. Ahí queda guardada, entre otras cosas, la configuración Bluetooth (pairing_mode: 0 = sin emparejamiento).</w:t>
+            </w:r>
+          </w:p>
+        </w:tc>
+      </w:tr>
+      <w:tr>
+        <w:tc>
+          <w:tcPr>
+            <w:tcW w:type="dxa" w:w="2600"/>
+            <w:shd w:fill="FFFFFF" w:val="clear"/>
+            <w:tcMar>
+              <w:top w:type="dxa" w:w="80"/>
+              <w:left w:type="dxa" w:w="120"/>
+              <w:bottom w:type="dxa" w:w="80"/>
+              <w:right w:type="dxa" w:w="120"/>
+            </w:tcMar>
+            <w:vAlign w:val="center"/>
+          </w:tcPr>
+          <w:p>
+            <w:pPr>
+              <w:spacing w:after="0" w:line="264"/>
+            </w:pPr>
+            <w:r>
+              <w:rPr>
+                <w:rFonts w:ascii="Montserrat" w:cs="Montserrat" w:eastAsia="Montserrat" w:hAnsi="Montserrat"/>
+                <w:b w:val="false"/>
+                <w:bCs w:val="false"/>
+                <w:color w:val="000000"/>
+                <w:sz w:val="18"/>
+                <w:szCs w:val="18"/>
+              </w:rPr>
+              <w:t xml:space="preserve">runningTime()</w:t>
+            </w:r>
+          </w:p>
+        </w:tc>
+        <w:tc>
+          <w:tcPr>
+            <w:tcW w:type="dxa" w:w="6472"/>
+            <w:shd w:fill="FFFFFF" w:val="clear"/>
+            <w:tcMar>
+              <w:top w:type="dxa" w:w="80"/>
+              <w:left w:type="dxa" w:w="120"/>
+              <w:bottom w:type="dxa" w:w="80"/>
+              <w:right w:type="dxa" w:w="120"/>
+            </w:tcMar>
+            <w:vAlign w:val="center"/>
+          </w:tcPr>
+          <w:p>
+            <w:pPr>
+              <w:spacing w:after="0" w:line="264"/>
+            </w:pPr>
+            <w:r>
+              <w:rPr>
+                <w:rFonts w:ascii="Montserrat" w:cs="Montserrat" w:eastAsia="Montserrat" w:hAnsi="Montserrat"/>
+                <w:b w:val="false"/>
+                <w:bCs w:val="false"/>
+                <w:color w:val="000000"/>
+                <w:sz w:val="18"/>
+                <w:szCs w:val="18"/>
+              </w:rPr>
+              <w:t xml:space="preserve">Función de MakeCode que devuelve los milisegundos transcurridos desde que la micro:bit encendió. Es el reloj con el que se arma el timestamp.</w:t>
+            </w:r>
+          </w:p>
+        </w:tc>
+      </w:tr>
+      <w:tr>
+        <w:tc>
+          <w:tcPr>
+            <w:tcW w:type="dxa" w:w="2600"/>
+            <w:shd w:fill="FFFFFF" w:val="clear"/>
+            <w:tcMar>
+              <w:top w:type="dxa" w:w="80"/>
+              <w:left w:type="dxa" w:w="120"/>
+              <w:bottom w:type="dxa" w:w="80"/>
+              <w:right w:type="dxa" w:w="120"/>
+            </w:tcMar>
+            <w:vAlign w:val="center"/>
+          </w:tcPr>
+          <w:p>
+            <w:pPr>
+              <w:spacing w:after="0" w:line="264"/>
+            </w:pPr>
+            <w:r>
+              <w:rPr>
+                <w:rFonts w:ascii="Montserrat" w:cs="Montserrat" w:eastAsia="Montserrat" w:hAnsi="Montserrat"/>
+                <w:b w:val="false"/>
+                <w:bCs w:val="false"/>
+                <w:color w:val="000000"/>
+                <w:sz w:val="18"/>
+                <w:szCs w:val="18"/>
+              </w:rPr>
+              <w:t xml:space="preserve">Scheduler</w:t>
+            </w:r>
+          </w:p>
+        </w:tc>
+        <w:tc>
+          <w:tcPr>
+            <w:tcW w:type="dxa" w:w="6472"/>
+            <w:shd w:fill="FFFFFF" w:val="clear"/>
+            <w:tcMar>
+              <w:top w:type="dxa" w:w="80"/>
+              <w:left w:type="dxa" w:w="120"/>
+              <w:bottom w:type="dxa" w:w="80"/>
+              <w:right w:type="dxa" w:w="120"/>
+            </w:tcMar>
+            <w:vAlign w:val="center"/>
+          </w:tcPr>
+          <w:p>
+            <w:pPr>
+              <w:spacing w:after="0" w:line="264"/>
+            </w:pPr>
+            <w:r>
+              <w:rPr>
+                <w:rFonts w:ascii="Montserrat" w:cs="Montserrat" w:eastAsia="Montserrat" w:hAnsi="Montserrat"/>
+                <w:b w:val="false"/>
+                <w:bCs w:val="false"/>
+                <w:color w:val="000000"/>
+                <w:sz w:val="18"/>
+                <w:szCs w:val="18"/>
+              </w:rPr>
+              <w:t xml:space="preserve">Componente del sistema de MakeCode que reparte el tiempo del procesador entre las tareas del programa. Su sobrecosto es lo que limita la velocidad real de forever.</w:t>
+            </w:r>
+          </w:p>
+        </w:tc>
+      </w:tr>
+      <w:tr>
+        <w:tc>
+          <w:tcPr>
+            <w:tcW w:type="dxa" w:w="2600"/>
+            <w:shd w:fill="FFFFFF" w:val="clear"/>
+            <w:tcMar>
+              <w:top w:type="dxa" w:w="80"/>
+              <w:left w:type="dxa" w:w="120"/>
+              <w:bottom w:type="dxa" w:w="80"/>
+              <w:right w:type="dxa" w:w="120"/>
+            </w:tcMar>
+            <w:vAlign w:val="center"/>
+          </w:tcPr>
+          <w:p>
+            <w:pPr>
+              <w:spacing w:after="0" w:line="264"/>
+            </w:pPr>
+            <w:r>
+              <w:rPr>
+                <w:rFonts w:ascii="Montserrat" w:cs="Montserrat" w:eastAsia="Montserrat" w:hAnsi="Montserrat"/>
+                <w:b w:val="false"/>
+                <w:bCs w:val="false"/>
+                <w:color w:val="000000"/>
+                <w:sz w:val="18"/>
+                <w:szCs w:val="18"/>
+              </w:rPr>
+              <w:t xml:space="preserve">Timestamp</w:t>
+            </w:r>
+          </w:p>
+        </w:tc>
+        <w:tc>
+          <w:tcPr>
+            <w:tcW w:type="dxa" w:w="6472"/>
+            <w:shd w:fill="FFFFFF" w:val="clear"/>
+            <w:tcMar>
+              <w:top w:type="dxa" w:w="80"/>
+              <w:left w:type="dxa" w:w="120"/>
+              <w:bottom w:type="dxa" w:w="80"/>
+              <w:right w:type="dxa" w:w="120"/>
+            </w:tcMar>
+            <w:vAlign w:val="center"/>
+          </w:tcPr>
+          <w:p>
+            <w:pPr>
+              <w:spacing w:after="0" w:line="264"/>
+            </w:pPr>
+            <w:r>
+              <w:rPr>
+                <w:rFonts w:ascii="Montserrat" w:cs="Montserrat" w:eastAsia="Montserrat" w:hAnsi="Montserrat"/>
+                <w:b w:val="false"/>
+                <w:bCs w:val="false"/>
+                <w:color w:val="000000"/>
+                <w:sz w:val="18"/>
+                <w:szCs w:val="18"/>
+              </w:rPr>
+              <w:t xml:space="preserve">Marca de tiempo: número que acompaña a cada dato indicando el instante en que se midió (acá, en ms desde el encendido de la micro:bit).</w:t>
+            </w:r>
+          </w:p>
+        </w:tc>
+      </w:tr>
+      <w:tr>
+        <w:tc>
+          <w:tcPr>
+            <w:tcW w:type="dxa" w:w="2600"/>
+            <w:shd w:fill="FFFFFF" w:val="clear"/>
+            <w:tcMar>
+              <w:top w:type="dxa" w:w="80"/>
+              <w:left w:type="dxa" w:w="120"/>
+              <w:bottom w:type="dxa" w:w="80"/>
+              <w:right w:type="dxa" w:w="120"/>
+            </w:tcMar>
+            <w:vAlign w:val="center"/>
+          </w:tcPr>
+          <w:p>
+            <w:pPr>
+              <w:spacing w:after="0" w:line="264"/>
+            </w:pPr>
+            <w:r>
+              <w:rPr>
+                <w:rFonts w:ascii="Montserrat" w:cs="Montserrat" w:eastAsia="Montserrat" w:hAnsi="Montserrat"/>
+                <w:b w:val="false"/>
+                <w:bCs w:val="false"/>
+                <w:color w:val="000000"/>
+                <w:sz w:val="18"/>
+                <w:szCs w:val="18"/>
+              </w:rPr>
+              <w:t xml:space="preserve">UART</w:t>
+            </w:r>
+          </w:p>
+        </w:tc>
+        <w:tc>
+          <w:tcPr>
+            <w:tcW w:type="dxa" w:w="6472"/>
+            <w:shd w:fill="FFFFFF" w:val="clear"/>
+            <w:tcMar>
+              <w:top w:type="dxa" w:w="80"/>
+              <w:left w:type="dxa" w:w="120"/>
+              <w:bottom w:type="dxa" w:w="80"/>
+              <w:right w:type="dxa" w:w="120"/>
+            </w:tcMar>
+            <w:vAlign w:val="center"/>
+          </w:tcPr>
+          <w:p>
+            <w:pPr>
+              <w:spacing w:after="0" w:line="264"/>
+            </w:pPr>
+            <w:r>
+              <w:rPr>
+                <w:rFonts w:ascii="Montserrat" w:cs="Montserrat" w:eastAsia="Montserrat" w:hAnsi="Montserrat"/>
+                <w:b w:val="false"/>
+                <w:bCs w:val="false"/>
+                <w:color w:val="000000"/>
+                <w:sz w:val="18"/>
+                <w:szCs w:val="18"/>
+              </w:rPr>
+              <w:t xml:space="preserve">Protocolo clásico de puerto serie. “UART sobre BLE” es un servicio estándar que simula ese canal por radio; es lo que usa la plataforma para recibir datos por Bluetooth.</w:t>
+            </w:r>
+          </w:p>
+        </w:tc>
+      </w:tr>
+      <w:tr>
+        <w:tc>
+          <w:tcPr>
+            <w:tcW w:type="dxa" w:w="2600"/>
+            <w:shd w:fill="FFFFFF" w:val="clear"/>
+            <w:tcMar>
+              <w:top w:type="dxa" w:w="80"/>
+              <w:left w:type="dxa" w:w="120"/>
+              <w:bottom w:type="dxa" w:w="80"/>
+              <w:right w:type="dxa" w:w="120"/>
+            </w:tcMar>
+            <w:vAlign w:val="center"/>
+          </w:tcPr>
+          <w:p>
+            <w:pPr>
+              <w:spacing w:after="0" w:line="264"/>
+            </w:pPr>
+            <w:r>
+              <w:rPr>
+                <w:rFonts w:ascii="Montserrat" w:cs="Montserrat" w:eastAsia="Montserrat" w:hAnsi="Montserrat"/>
+                <w:b w:val="false"/>
+                <w:bCs w:val="false"/>
+                <w:color w:val="000000"/>
+                <w:sz w:val="18"/>
+                <w:szCs w:val="18"/>
+              </w:rPr>
+              <w:t xml:space="preserve">Web Bluetooth / Web Serial</w:t>
+            </w:r>
+          </w:p>
+        </w:tc>
+        <w:tc>
+          <w:tcPr>
+            <w:tcW w:type="dxa" w:w="6472"/>
+            <w:shd w:fill="FFFFFF" w:val="clear"/>
+            <w:tcMar>
+              <w:top w:type="dxa" w:w="80"/>
+              <w:left w:type="dxa" w:w="120"/>
+              <w:bottom w:type="dxa" w:w="80"/>
+              <w:right w:type="dxa" w:w="120"/>
+            </w:tcMar>
+            <w:vAlign w:val="center"/>
+          </w:tcPr>
+          <w:p>
+            <w:pPr>
+              <w:spacing w:after="0" w:line="264"/>
+            </w:pPr>
+            <w:r>
+              <w:rPr>
+                <w:rFonts w:ascii="Montserrat" w:cs="Montserrat" w:eastAsia="Montserrat" w:hAnsi="Montserrat"/>
+                <w:b w:val="false"/>
+                <w:bCs w:val="false"/>
+                <w:color w:val="000000"/>
+                <w:sz w:val="18"/>
+                <w:szCs w:val="18"/>
+              </w:rPr>
+              <w:t xml:space="preserve">Capacidades del navegador (Chrome/Edge) que permiten a una página web hablar con dispositivos Bluetooth o seriales, previa autorización del usuario. Apple no las permite en iOS.</w:t>
+            </w:r>
+          </w:p>
+        </w:tc>
+      </w:tr>
+      <w:tr>
+        <w:tc>
+          <w:tcPr>
+            <w:tcW w:type="dxa" w:w="2600"/>
+            <w:shd w:fill="FFFFFF" w:val="clear"/>
+            <w:tcMar>
+              <w:top w:type="dxa" w:w="80"/>
+              <w:left w:type="dxa" w:w="120"/>
+              <w:bottom w:type="dxa" w:w="80"/>
+              <w:right w:type="dxa" w:w="120"/>
+            </w:tcMar>
+            <w:vAlign w:val="center"/>
+          </w:tcPr>
+          <w:p>
+            <w:pPr>
+              <w:spacing w:after="0" w:line="264"/>
+            </w:pPr>
+            <w:r>
+              <w:rPr>
+                <w:rFonts w:ascii="Montserrat" w:cs="Montserrat" w:eastAsia="Montserrat" w:hAnsi="Montserrat"/>
+                <w:b w:val="false"/>
+                <w:bCs w:val="false"/>
+                <w:color w:val="000000"/>
+                <w:sz w:val="18"/>
+                <w:szCs w:val="18"/>
+              </w:rPr>
+              <w:t xml:space="preserve">WebUSB</w:t>
+            </w:r>
+          </w:p>
+        </w:tc>
+        <w:tc>
+          <w:tcPr>
+            <w:tcW w:type="dxa" w:w="6472"/>
+            <w:shd w:fill="FFFFFF" w:val="clear"/>
+            <w:tcMar>
+              <w:top w:type="dxa" w:w="80"/>
+              <w:left w:type="dxa" w:w="120"/>
+              <w:bottom w:type="dxa" w:w="80"/>
+              <w:right w:type="dxa" w:w="120"/>
+            </w:tcMar>
+            <w:vAlign w:val="center"/>
+          </w:tcPr>
+          <w:p>
+            <w:pPr>
+              <w:spacing w:after="0" w:line="264"/>
+            </w:pPr>
+            <w:r>
+              <w:rPr>
+                <w:rFonts w:ascii="Montserrat" w:cs="Montserrat" w:eastAsia="Montserrat" w:hAnsi="Montserrat"/>
+                <w:b w:val="false"/>
+                <w:bCs w:val="false"/>
+                <w:color w:val="000000"/>
+                <w:sz w:val="18"/>
+                <w:szCs w:val="18"/>
+              </w:rPr>
+              <w:t xml:space="preserve">Capacidad del navegador que permite a MakeCode grabar el programa en la micro:bit directamente, sin copiar el archivo a mano.</w:t>
+            </w:r>
+          </w:p>
+        </w:tc>
+      </w:tr>
+    </w:tbl>
     <w:sectPr>
       <w:pgSz w:w="11906" w:h="16838" w:orient="portrait"/>
       <w:pgMar w:top="1247" w:right="1133" w:bottom="1247" w:left="1133" w:header="708" w:footer="708" w:gutter="0"/>
@@ -6793,6 +8479,378 @@
       </w:r>
       <w:r>
         <w:continuationSeparator/>
+      </w:r>
+    </w:p>
+  </w:footnote>
+  <w:footnote w:id="1">
+    <w:p>
+      <w:pPr>
+        <w:spacing w:after="40" w:line="240"/>
+      </w:pPr>
+      <w:r>
+        <w:rPr>
+          <w:rStyle w:val="FootnoteReference"/>
+        </w:rPr>
+        <w:footnoteRef/>
+      </w:r>
+      <w:r>
+        <w:rPr>
+          <w:rFonts w:ascii="Montserrat" w:cs="Montserrat" w:eastAsia="Montserrat" w:hAnsi="Montserrat"/>
+          <w:b/>
+          <w:bCs/>
+          <w:sz w:val="16"/>
+          <w:szCs w:val="16"/>
+        </w:rPr>
+        <w:t xml:space="preserve">Timestamp: </w:t>
+      </w:r>
+      <w:r>
+        <w:rPr>
+          <w:rFonts w:ascii="Montserrat" w:cs="Montserrat" w:eastAsia="Montserrat" w:hAnsi="Montserrat"/>
+          <w:sz w:val="16"/>
+          <w:szCs w:val="16"/>
+        </w:rPr>
+        <w:t xml:space="preserve">marca de tiempo. Número que acompaña a cada dato indicando el instante en que se midió; acá, los milisegundos desde que encendió la micro:bit.</w:t>
+      </w:r>
+    </w:p>
+  </w:footnote>
+  <w:footnote w:id="2">
+    <w:p>
+      <w:pPr>
+        <w:spacing w:after="40" w:line="240"/>
+      </w:pPr>
+      <w:r>
+        <w:rPr>
+          <w:rStyle w:val="FootnoteReference"/>
+        </w:rPr>
+        <w:footnoteRef/>
+      </w:r>
+      <w:r>
+        <w:rPr>
+          <w:rFonts w:ascii="Montserrat" w:cs="Montserrat" w:eastAsia="Montserrat" w:hAnsi="Montserrat"/>
+          <w:b/>
+          <w:bCs/>
+          <w:sz w:val="16"/>
+          <w:szCs w:val="16"/>
+        </w:rPr>
+        <w:t xml:space="preserve">Web Serial y Web Bluetooth: </w:t>
+      </w:r>
+      <w:r>
+        <w:rPr>
+          <w:rFonts w:ascii="Montserrat" w:cs="Montserrat" w:eastAsia="Montserrat" w:hAnsi="Montserrat"/>
+          <w:sz w:val="16"/>
+          <w:szCs w:val="16"/>
+        </w:rPr>
+        <w:t xml:space="preserve">capacidades del navegador (Chrome/Edge) que permiten a una página web comunicarse con un dispositivo por cable o por Bluetooth, siempre con autorización del usuario.</w:t>
+      </w:r>
+    </w:p>
+  </w:footnote>
+  <w:footnote w:id="3">
+    <w:p>
+      <w:pPr>
+        <w:spacing w:after="40" w:line="240"/>
+      </w:pPr>
+      <w:r>
+        <w:rPr>
+          <w:rStyle w:val="FootnoteReference"/>
+        </w:rPr>
+        <w:footnoteRef/>
+      </w:r>
+      <w:r>
+        <w:rPr>
+          <w:rFonts w:ascii="Montserrat" w:cs="Montserrat" w:eastAsia="Montserrat" w:hAnsi="Montserrat"/>
+          <w:b/>
+          <w:bCs/>
+          <w:sz w:val="16"/>
+          <w:szCs w:val="16"/>
+        </w:rPr>
+        <w:t xml:space="preserve">Lote: </w:t>
+      </w:r>
+      <w:r>
+        <w:rPr>
+          <w:rFonts w:ascii="Montserrat" w:cs="Montserrat" w:eastAsia="Montserrat" w:hAnsi="Montserrat"/>
+          <w:sz w:val="16"/>
+          <w:szCs w:val="16"/>
+        </w:rPr>
+        <w:t xml:space="preserve">grupo de datos que el sistema entrega junto, en una sola tanda, en lugar de uno por uno.</w:t>
+      </w:r>
+    </w:p>
+  </w:footnote>
+  <w:footnote w:id="4">
+    <w:p>
+      <w:pPr>
+        <w:spacing w:after="40" w:line="240"/>
+      </w:pPr>
+      <w:r>
+        <w:rPr>
+          <w:rStyle w:val="FootnoteReference"/>
+        </w:rPr>
+        <w:footnoteRef/>
+      </w:r>
+      <w:r>
+        <w:rPr>
+          <w:rFonts w:ascii="Montserrat" w:cs="Montserrat" w:eastAsia="Montserrat" w:hAnsi="Montserrat"/>
+          <w:b/>
+          <w:bCs/>
+          <w:sz w:val="16"/>
+          <w:szCs w:val="16"/>
+        </w:rPr>
+        <w:t xml:space="preserve">Baudios: </w:t>
+      </w:r>
+      <w:r>
+        <w:rPr>
+          <w:rFonts w:ascii="Montserrat" w:cs="Montserrat" w:eastAsia="Montserrat" w:hAnsi="Montserrat"/>
+          <w:sz w:val="16"/>
+          <w:szCs w:val="16"/>
+        </w:rPr>
+        <w:t xml:space="preserve">velocidad del puerto serial, en símbolos por segundo. No hay que configurarla: la plataforma lo hace sola.</w:t>
+      </w:r>
+    </w:p>
+  </w:footnote>
+  <w:footnote w:id="5">
+    <w:p>
+      <w:pPr>
+        <w:spacing w:after="40" w:line="240"/>
+      </w:pPr>
+      <w:r>
+        <w:rPr>
+          <w:rStyle w:val="FootnoteReference"/>
+        </w:rPr>
+        <w:footnoteRef/>
+      </w:r>
+      <w:r>
+        <w:rPr>
+          <w:rFonts w:ascii="Montserrat" w:cs="Montserrat" w:eastAsia="Montserrat" w:hAnsi="Montserrat"/>
+          <w:b/>
+          <w:bCs/>
+          <w:sz w:val="16"/>
+          <w:szCs w:val="16"/>
+        </w:rPr>
+        <w:t xml:space="preserve">Scheduler: </w:t>
+      </w:r>
+      <w:r>
+        <w:rPr>
+          <w:rFonts w:ascii="Montserrat" w:cs="Montserrat" w:eastAsia="Montserrat" w:hAnsi="Montserrat"/>
+          <w:sz w:val="16"/>
+          <w:szCs w:val="16"/>
+        </w:rPr>
+        <w:t xml:space="preserve">el componente de MakeCode que reparte el tiempo del procesador entre las tareas del programa; su sobrecosto fija el límite de velocidad real.</w:t>
+      </w:r>
+    </w:p>
+  </w:footnote>
+  <w:footnote w:id="6">
+    <w:p>
+      <w:pPr>
+        <w:spacing w:after="40" w:line="240"/>
+      </w:pPr>
+      <w:r>
+        <w:rPr>
+          <w:rStyle w:val="FootnoteReference"/>
+        </w:rPr>
+        <w:footnoteRef/>
+      </w:r>
+      <w:r>
+        <w:rPr>
+          <w:rFonts w:ascii="Montserrat" w:cs="Montserrat" w:eastAsia="Montserrat" w:hAnsi="Montserrat"/>
+          <w:b/>
+          <w:bCs/>
+          <w:sz w:val="16"/>
+          <w:szCs w:val="16"/>
+        </w:rPr>
+        <w:t xml:space="preserve">Hz (hertz): </w:t>
+      </w:r>
+      <w:r>
+        <w:rPr>
+          <w:rFonts w:ascii="Montserrat" w:cs="Montserrat" w:eastAsia="Montserrat" w:hAnsi="Montserrat"/>
+          <w:sz w:val="16"/>
+          <w:szCs w:val="16"/>
+        </w:rPr>
+        <w:t xml:space="preserve">mediciones por segundo. 10 Hz equivale a un dato cada 100 ms.</w:t>
+      </w:r>
+    </w:p>
+  </w:footnote>
+  <w:footnote w:id="7">
+    <w:p>
+      <w:pPr>
+        <w:spacing w:after="40" w:line="240"/>
+      </w:pPr>
+      <w:r>
+        <w:rPr>
+          <w:rStyle w:val="FootnoteReference"/>
+        </w:rPr>
+        <w:footnoteRef/>
+      </w:r>
+      <w:r>
+        <w:rPr>
+          <w:rFonts w:ascii="Montserrat" w:cs="Montserrat" w:eastAsia="Montserrat" w:hAnsi="Montserrat"/>
+          <w:b/>
+          <w:bCs/>
+          <w:sz w:val="16"/>
+          <w:szCs w:val="16"/>
+        </w:rPr>
+        <w:t xml:space="preserve">WebUSB: </w:t>
+      </w:r>
+      <w:r>
+        <w:rPr>
+          <w:rFonts w:ascii="Montserrat" w:cs="Montserrat" w:eastAsia="Montserrat" w:hAnsi="Montserrat"/>
+          <w:sz w:val="16"/>
+          <w:szCs w:val="16"/>
+        </w:rPr>
+        <w:t xml:space="preserve">permite que MakeCode grabe el programa directamente en la placa, sin copiar archivos a mano.</w:t>
+      </w:r>
+    </w:p>
+  </w:footnote>
+  <w:footnote w:id="8">
+    <w:p>
+      <w:pPr>
+        <w:spacing w:after="40" w:line="240"/>
+      </w:pPr>
+      <w:r>
+        <w:rPr>
+          <w:rStyle w:val="FootnoteReference"/>
+        </w:rPr>
+        <w:footnoteRef/>
+      </w:r>
+      <w:r>
+        <w:rPr>
+          <w:rFonts w:ascii="Montserrat" w:cs="Montserrat" w:eastAsia="Montserrat" w:hAnsi="Montserrat"/>
+          <w:b/>
+          <w:bCs/>
+          <w:sz w:val="16"/>
+          <w:szCs w:val="16"/>
+        </w:rPr>
+        <w:t xml:space="preserve">Archivo .hex: </w:t>
+      </w:r>
+      <w:r>
+        <w:rPr>
+          <w:rFonts w:ascii="Montserrat" w:cs="Montserrat" w:eastAsia="Montserrat" w:hAnsi="Montserrat"/>
+          <w:sz w:val="16"/>
+          <w:szCs w:val="16"/>
+        </w:rPr>
+        <w:t xml:space="preserve">la imagen compilada del programa, lista para grabarse en la memoria de la micro:bit.</w:t>
+      </w:r>
+    </w:p>
+  </w:footnote>
+  <w:footnote w:id="9">
+    <w:p>
+      <w:pPr>
+        <w:spacing w:after="40" w:line="240"/>
+      </w:pPr>
+      <w:r>
+        <w:rPr>
+          <w:rStyle w:val="FootnoteReference"/>
+        </w:rPr>
+        <w:footnoteRef/>
+      </w:r>
+      <w:r>
+        <w:rPr>
+          <w:rFonts w:ascii="Montserrat" w:cs="Montserrat" w:eastAsia="Montserrat" w:hAnsi="Montserrat"/>
+          <w:b/>
+          <w:bCs/>
+          <w:sz w:val="16"/>
+          <w:szCs w:val="16"/>
+        </w:rPr>
+        <w:t xml:space="preserve">UART: </w:t>
+      </w:r>
+      <w:r>
+        <w:rPr>
+          <w:rFonts w:ascii="Montserrat" w:cs="Montserrat" w:eastAsia="Montserrat" w:hAnsi="Montserrat"/>
+          <w:sz w:val="16"/>
+          <w:szCs w:val="16"/>
+        </w:rPr>
+        <w:t xml:space="preserve">protocolo clásico de puerto serie. El servicio “UART sobre BLE” simula ese canal por radio: para la plataforma es como un cable invisible.</w:t>
+      </w:r>
+    </w:p>
+  </w:footnote>
+  <w:footnote w:id="10">
+    <w:p>
+      <w:pPr>
+        <w:spacing w:after="40" w:line="240"/>
+      </w:pPr>
+      <w:r>
+        <w:rPr>
+          <w:rStyle w:val="FootnoteReference"/>
+        </w:rPr>
+        <w:footnoteRef/>
+      </w:r>
+      <w:r>
+        <w:rPr>
+          <w:rFonts w:ascii="Montserrat" w:cs="Montserrat" w:eastAsia="Montserrat" w:hAnsi="Montserrat"/>
+          <w:b/>
+          <w:bCs/>
+          <w:sz w:val="16"/>
+          <w:szCs w:val="16"/>
+        </w:rPr>
+        <w:t xml:space="preserve">Emparejamiento (pairing): </w:t>
+      </w:r>
+      <w:r>
+        <w:rPr>
+          <w:rFonts w:ascii="Montserrat" w:cs="Montserrat" w:eastAsia="Montserrat" w:hAnsi="Montserrat"/>
+          <w:sz w:val="16"/>
+          <w:szCs w:val="16"/>
+        </w:rPr>
+        <w:t xml:space="preserve">la “presentación” formal entre dos equipos Bluetooth, a veces con PIN. JustWorks la omite: cualquiera puede conectarse, lo ideal en el aula.</w:t>
+      </w:r>
+    </w:p>
+  </w:footnote>
+  <w:footnote w:id="11">
+    <w:p>
+      <w:pPr>
+        <w:spacing w:after="40" w:line="240"/>
+      </w:pPr>
+      <w:r>
+        <w:rPr>
+          <w:rStyle w:val="FootnoteReference"/>
+        </w:rPr>
+        <w:footnoteRef/>
+      </w:r>
+      <w:r>
+        <w:rPr>
+          <w:rFonts w:ascii="Montserrat" w:cs="Montserrat" w:eastAsia="Montserrat" w:hAnsi="Montserrat"/>
+          <w:b/>
+          <w:bCs/>
+          <w:sz w:val="16"/>
+          <w:szCs w:val="16"/>
+        </w:rPr>
+        <w:t xml:space="preserve">pxt.json: </w:t>
+      </w:r>
+      <w:r>
+        <w:rPr>
+          <w:rFonts w:ascii="Montserrat" w:cs="Montserrat" w:eastAsia="Montserrat" w:hAnsi="Montserrat"/>
+          <w:sz w:val="16"/>
+          <w:szCs w:val="16"/>
+        </w:rPr>
+        <w:t xml:space="preserve">archivo de configuración del proyecto MakeCode; se edita desde el explorador de archivos del editor.</w:t>
+      </w:r>
+    </w:p>
+  </w:footnote>
+  <w:footnote w:id="12">
+    <w:p>
+      <w:pPr>
+        <w:spacing w:after="40" w:line="240"/>
+      </w:pPr>
+      <w:r>
+        <w:rPr>
+          <w:rStyle w:val="FootnoteReference"/>
+        </w:rPr>
+        <w:footnoteRef/>
+      </w:r>
+      <w:r>
+        <w:rPr>
+          <w:rFonts w:ascii="Montserrat" w:cs="Montserrat" w:eastAsia="Montserrat" w:hAnsi="Montserrat"/>
+          <w:b/>
+          <w:bCs/>
+          <w:sz w:val="16"/>
+          <w:szCs w:val="16"/>
+        </w:rPr>
+        <w:t xml:space="preserve">CSV: </w:t>
+      </w:r>
+      <w:r>
+        <w:rPr>
+          <w:rFonts w:ascii="Montserrat" w:cs="Montserrat" w:eastAsia="Montserrat" w:hAnsi="Montserrat"/>
+          <w:sz w:val="16"/>
+          <w:szCs w:val="16"/>
+        </w:rPr>
+        <w:t xml:space="preserve">texto plano con una fila por línea y columnas separadas por comas; lo abren Excel, LibreOffice, GeoGebra y Python directamente.</w:t>
       </w:r>
     </w:p>
   </w:footnote>

</xml_diff>

<commit_message>
Guía 1: aclarar que Web Serial/Bluetooth sí funcionan en Mac (la limitación es solo iPhone/iPad)
Co-Authored-By: Claude Fable 5 <noreply@anthropic.com>
Claude-Session: https://claude.ai/code/session_01QWAyZdE9BkJvizLVTZzmVb
</commit_message>
<xml_diff>
--- a/manuales/Manual-1-Captura-1-variable-timestamp.docx
+++ b/manuales/Manual-1-Captura-1-variable-timestamp.docx
@@ -392,7 +392,7 @@
           <w:sz w:val="20"/>
           <w:szCs w:val="20"/>
         </w:rPr>
-        <w:t xml:space="preserve"> en computadora o Android. Ni Web Serial ni Web Bluetooth</w:t>
+        <w:t xml:space="preserve"> en computadora (Windows, Mac o Linux) o Android. La única excepción son iPhone y iPad: Apple no permite Web Serial ni Web Bluetooth</w:t>
       </w:r>
       <w:r>
         <w:rPr>
@@ -406,7 +406,7 @@
           <w:sz w:val="20"/>
           <w:szCs w:val="20"/>
         </w:rPr>
-        <w:t xml:space="preserve"> funcionan en iOS/iPadOS.</w:t>
+        <w:t xml:space="preserve"> en iOS/iPadOS — en Mac ambas funcionan sin problema.</w:t>
       </w:r>
     </w:p>
     <w:p>
@@ -6793,7 +6793,7 @@
           <w:sz w:val="20"/>
           <w:szCs w:val="20"/>
         </w:rPr>
-        <w:t xml:space="preserve">Apple no permite Web Bluetooth ni Web Serial en iOS. Usá Chrome o Edge en computadora o Android; en iPad podés cargar datos por CSV.</w:t>
+        <w:t xml:space="preserve">Apple no permite Web Bluetooth ni Web Serial en iOS/iPadOS (solo ahí: en Mac funcionan). Usá Chrome o Edge en computadora — incluida una Mac — o Android; en iPad podés cargar datos por CSV.</w:t>
       </w:r>
     </w:p>
     <w:p>
@@ -8331,7 +8331,7 @@
                 <w:sz w:val="18"/>
                 <w:szCs w:val="18"/>
               </w:rPr>
-              <w:t xml:space="preserve">Capacidades del navegador (Chrome/Edge) que permiten a una página web hablar con dispositivos Bluetooth o seriales, previa autorización del usuario. Apple no las permite en iOS.</w:t>
+              <w:t xml:space="preserve">Capacidades del navegador (Chrome/Edge) que permiten a una página web hablar con dispositivos Bluetooth o seriales, previa autorización del usuario. Funcionan en Windows, Mac, Linux y Android; Apple solo las bloquea en iPhone/iPad (iOS/iPadOS).</w:t>
             </w:r>
           </w:p>
         </w:tc>

</xml_diff>